<commit_message>
did recap of how js works and global execution context works
</commit_message>
<xml_diff>
--- a/JAVASCRIPT EXTRA NOTES.docx
+++ b/JAVASCRIPT EXTRA NOTES.docx
@@ -420,6 +420,13 @@
         </w:rPr>
         <w:t xml:space="preserve"> Do Bade Hisse (Components)</w:t>
       </w:r>
+      <w:r>
+        <w:rPr>
+          <w:b/>
+          <w:bCs/>
+        </w:rPr>
+        <w:t xml:space="preserve"> </w:t>
+      </w:r>
     </w:p>
     <w:p>
       <w:r>
@@ -662,7 +669,15 @@
       </w:r>
       <w:proofErr w:type="spellEnd"/>
       <w:r>
-        <w:t xml:space="preserve"> var a = 10;, </w:t>
+        <w:t xml:space="preserve"> var a = </w:t>
+      </w:r>
+      <w:proofErr w:type="gramStart"/>
+      <w:r>
+        <w:t>10;,</w:t>
+      </w:r>
+      <w:proofErr w:type="gramEnd"/>
+      <w:r>
+        <w:t xml:space="preserve"> </w:t>
       </w:r>
       <w:proofErr w:type="spellStart"/>
       <w:r>
@@ -1899,6 +1914,2211 @@
         </w:pict>
       </w:r>
     </w:p>
+    <w:p>
+      <w:pPr>
+        <w:rPr>
+          <w:b/>
+          <w:bCs/>
+          <w:sz w:val="36"/>
+          <w:szCs w:val="36"/>
+          <w:u w:val="single"/>
+        </w:rPr>
+      </w:pPr>
+      <w:r>
+        <w:rPr>
+          <w:b/>
+          <w:bCs/>
+          <w:sz w:val="36"/>
+          <w:szCs w:val="36"/>
+          <w:u w:val="single"/>
+        </w:rPr>
+        <w:t>JAVASCRIPT EXTRA NOTES (</w:t>
+      </w:r>
+      <w:r>
+        <w:rPr>
+          <w:b/>
+          <w:bCs/>
+          <w:sz w:val="36"/>
+          <w:szCs w:val="36"/>
+          <w:u w:val="single"/>
+        </w:rPr>
+        <w:t>2</w:t>
+      </w:r>
+      <w:r>
+        <w:rPr>
+          <w:b/>
+          <w:bCs/>
+          <w:sz w:val="36"/>
+          <w:szCs w:val="36"/>
+          <w:u w:val="single"/>
+        </w:rPr>
+        <w:t>)</w:t>
+      </w:r>
+    </w:p>
+    <w:p>
+      <w:pPr>
+        <w:rPr>
+          <w:b/>
+          <w:bCs/>
+        </w:rPr>
+      </w:pPr>
+      <w:r>
+        <w:rPr>
+          <w:b/>
+          <w:bCs/>
+        </w:rPr>
+        <w:t>1. Execution Context ka Creation (Two Phases)</w:t>
+      </w:r>
+    </w:p>
+    <w:p>
+      <w:r>
+        <w:t xml:space="preserve">             </w:t>
+      </w:r>
+      <w:r>
+        <w:drawing>
+          <wp:inline distT="0" distB="0" distL="0" distR="0" wp14:anchorId="68EF648F" wp14:editId="42F1BC15">
+            <wp:extent cx="4706007" cy="2886478"/>
+            <wp:effectExtent l="0" t="0" r="0" b="9525"/>
+            <wp:docPr id="1303857532" name="Picture 1"/>
+            <wp:cNvGraphicFramePr>
+              <a:graphicFrameLocks xmlns:a="http://schemas.openxmlformats.org/drawingml/2006/main" noChangeAspect="1"/>
+            </wp:cNvGraphicFramePr>
+            <a:graphic xmlns:a="http://schemas.openxmlformats.org/drawingml/2006/main">
+              <a:graphicData uri="http://schemas.openxmlformats.org/drawingml/2006/picture">
+                <pic:pic xmlns:pic="http://schemas.openxmlformats.org/drawingml/2006/picture">
+                  <pic:nvPicPr>
+                    <pic:cNvPr id="1303857532" name=""/>
+                    <pic:cNvPicPr/>
+                  </pic:nvPicPr>
+                  <pic:blipFill>
+                    <a:blip r:embed="rId5"/>
+                    <a:stretch>
+                      <a:fillRect/>
+                    </a:stretch>
+                  </pic:blipFill>
+                  <pic:spPr>
+                    <a:xfrm>
+                      <a:off x="0" y="0"/>
+                      <a:ext cx="4706007" cy="2886478"/>
+                    </a:xfrm>
+                    <a:prstGeom prst="rect">
+                      <a:avLst/>
+                    </a:prstGeom>
+                  </pic:spPr>
+                </pic:pic>
+              </a:graphicData>
+            </a:graphic>
+          </wp:inline>
+        </w:drawing>
+      </w:r>
+    </w:p>
+    <w:p>
+      <w:r>
+        <w:t xml:space="preserve">Jab </w:t>
+      </w:r>
+      <w:proofErr w:type="spellStart"/>
+      <w:r>
+        <w:t>bhi</w:t>
+      </w:r>
+      <w:proofErr w:type="spellEnd"/>
+      <w:r>
+        <w:t xml:space="preserve"> </w:t>
+      </w:r>
+      <w:proofErr w:type="spellStart"/>
+      <w:r>
+        <w:t>aap</w:t>
+      </w:r>
+      <w:proofErr w:type="spellEnd"/>
+      <w:r>
+        <w:t xml:space="preserve"> koi JS program run </w:t>
+      </w:r>
+      <w:proofErr w:type="spellStart"/>
+      <w:r>
+        <w:t>karte</w:t>
+      </w:r>
+      <w:proofErr w:type="spellEnd"/>
+      <w:r>
+        <w:t xml:space="preserve"> </w:t>
+      </w:r>
+      <w:proofErr w:type="spellStart"/>
+      <w:r>
+        <w:t>ho</w:t>
+      </w:r>
+      <w:proofErr w:type="spellEnd"/>
+      <w:r>
+        <w:t xml:space="preserve">, ek </w:t>
+      </w:r>
+      <w:r>
+        <w:rPr>
+          <w:b/>
+          <w:bCs/>
+        </w:rPr>
+        <w:t>Global Execution Context (GEC)</w:t>
+      </w:r>
+      <w:r>
+        <w:t xml:space="preserve"> </w:t>
+      </w:r>
+      <w:proofErr w:type="spellStart"/>
+      <w:r>
+        <w:t>banta</w:t>
+      </w:r>
+      <w:proofErr w:type="spellEnd"/>
+      <w:r>
+        <w:t xml:space="preserve"> </w:t>
+      </w:r>
+      <w:proofErr w:type="spellStart"/>
+      <w:r>
+        <w:t>hai</w:t>
+      </w:r>
+      <w:proofErr w:type="spellEnd"/>
+      <w:r>
+        <w:t xml:space="preserve">. Ye do phases </w:t>
+      </w:r>
+      <w:proofErr w:type="spellStart"/>
+      <w:r>
+        <w:t>mein</w:t>
+      </w:r>
+      <w:proofErr w:type="spellEnd"/>
+      <w:r>
+        <w:t xml:space="preserve"> </w:t>
+      </w:r>
+      <w:proofErr w:type="spellStart"/>
+      <w:r>
+        <w:t>banta</w:t>
+      </w:r>
+      <w:proofErr w:type="spellEnd"/>
+      <w:r>
+        <w:t xml:space="preserve"> </w:t>
+      </w:r>
+      <w:proofErr w:type="spellStart"/>
+      <w:r>
+        <w:t>hai</w:t>
+      </w:r>
+      <w:proofErr w:type="spellEnd"/>
+      <w:r>
+        <w:t>:</w:t>
+      </w:r>
+    </w:p>
+    <w:p>
+      <w:pPr>
+        <w:numPr>
+          <w:ilvl w:val="0"/>
+          <w:numId w:val="4"/>
+        </w:numPr>
+      </w:pPr>
+      <w:r>
+        <w:rPr>
+          <w:b/>
+          <w:bCs/>
+        </w:rPr>
+        <w:t>Phase 1: Memory Creation Phase</w:t>
+      </w:r>
+    </w:p>
+    <w:p>
+      <w:pPr>
+        <w:numPr>
+          <w:ilvl w:val="1"/>
+          <w:numId w:val="4"/>
+        </w:numPr>
+      </w:pPr>
+      <w:r>
+        <w:t xml:space="preserve">JS engine </w:t>
+      </w:r>
+      <w:proofErr w:type="spellStart"/>
+      <w:r>
+        <w:t>poore</w:t>
+      </w:r>
+      <w:proofErr w:type="spellEnd"/>
+      <w:r>
+        <w:t xml:space="preserve"> code ko scan </w:t>
+      </w:r>
+      <w:proofErr w:type="spellStart"/>
+      <w:r>
+        <w:t>karta</w:t>
+      </w:r>
+      <w:proofErr w:type="spellEnd"/>
+      <w:r>
+        <w:t xml:space="preserve"> </w:t>
+      </w:r>
+      <w:proofErr w:type="spellStart"/>
+      <w:r>
+        <w:t>hai</w:t>
+      </w:r>
+      <w:proofErr w:type="spellEnd"/>
+      <w:r>
+        <w:t xml:space="preserve"> aur </w:t>
+      </w:r>
+      <w:proofErr w:type="spellStart"/>
+      <w:r>
+        <w:t>saare</w:t>
+      </w:r>
+      <w:proofErr w:type="spellEnd"/>
+      <w:r>
+        <w:t xml:space="preserve"> variables aur functions </w:t>
+      </w:r>
+      <w:proofErr w:type="spellStart"/>
+      <w:r>
+        <w:t>ke</w:t>
+      </w:r>
+      <w:proofErr w:type="spellEnd"/>
+      <w:r>
+        <w:t xml:space="preserve"> </w:t>
+      </w:r>
+      <w:proofErr w:type="spellStart"/>
+      <w:r>
+        <w:t>liye</w:t>
+      </w:r>
+      <w:proofErr w:type="spellEnd"/>
+      <w:r>
+        <w:t xml:space="preserve"> memory allocate </w:t>
+      </w:r>
+      <w:proofErr w:type="spellStart"/>
+      <w:r>
+        <w:t>karta</w:t>
+      </w:r>
+      <w:proofErr w:type="spellEnd"/>
+      <w:r>
+        <w:t xml:space="preserve"> </w:t>
+      </w:r>
+      <w:proofErr w:type="spellStart"/>
+      <w:r>
+        <w:t>hai</w:t>
+      </w:r>
+      <w:proofErr w:type="spellEnd"/>
+      <w:r>
+        <w:t>.</w:t>
+      </w:r>
+    </w:p>
+    <w:p>
+      <w:pPr>
+        <w:numPr>
+          <w:ilvl w:val="1"/>
+          <w:numId w:val="4"/>
+        </w:numPr>
+      </w:pPr>
+      <w:r>
+        <w:rPr>
+          <w:b/>
+          <w:bCs/>
+        </w:rPr>
+        <w:t>Variables:</w:t>
+      </w:r>
+      <w:r>
+        <w:t xml:space="preserve"> </w:t>
+      </w:r>
+      <w:proofErr w:type="spellStart"/>
+      <w:r>
+        <w:t>Inmein</w:t>
+      </w:r>
+      <w:proofErr w:type="spellEnd"/>
+      <w:r>
+        <w:t xml:space="preserve"> </w:t>
+      </w:r>
+      <w:proofErr w:type="spellStart"/>
+      <w:r>
+        <w:t>shuruat</w:t>
+      </w:r>
+      <w:proofErr w:type="spellEnd"/>
+      <w:r>
+        <w:t xml:space="preserve"> </w:t>
+      </w:r>
+      <w:proofErr w:type="spellStart"/>
+      <w:r>
+        <w:t>mein</w:t>
+      </w:r>
+      <w:proofErr w:type="spellEnd"/>
+      <w:r>
+        <w:t xml:space="preserve"> ek special value store </w:t>
+      </w:r>
+      <w:proofErr w:type="spellStart"/>
+      <w:r>
+        <w:t>hoti</w:t>
+      </w:r>
+      <w:proofErr w:type="spellEnd"/>
+      <w:r>
+        <w:t xml:space="preserve"> </w:t>
+      </w:r>
+      <w:proofErr w:type="spellStart"/>
+      <w:r>
+        <w:t>hai</w:t>
+      </w:r>
+      <w:proofErr w:type="spellEnd"/>
+      <w:r>
+        <w:t xml:space="preserve"> </w:t>
+      </w:r>
+      <w:proofErr w:type="spellStart"/>
+      <w:r>
+        <w:t>jise</w:t>
+      </w:r>
+      <w:proofErr w:type="spellEnd"/>
+      <w:r>
+        <w:t xml:space="preserve"> </w:t>
+      </w:r>
+      <w:r>
+        <w:rPr>
+          <w:b/>
+          <w:bCs/>
+        </w:rPr>
+        <w:t>undefined</w:t>
+      </w:r>
+      <w:r>
+        <w:t xml:space="preserve"> </w:t>
+      </w:r>
+      <w:proofErr w:type="spellStart"/>
+      <w:r>
+        <w:t>kehte</w:t>
+      </w:r>
+      <w:proofErr w:type="spellEnd"/>
+      <w:r>
+        <w:t xml:space="preserve"> hain.</w:t>
+      </w:r>
+    </w:p>
+    <w:p>
+      <w:pPr>
+        <w:numPr>
+          <w:ilvl w:val="1"/>
+          <w:numId w:val="4"/>
+        </w:numPr>
+      </w:pPr>
+      <w:r>
+        <w:rPr>
+          <w:b/>
+          <w:bCs/>
+        </w:rPr>
+        <w:lastRenderedPageBreak/>
+        <w:t>Functions:</w:t>
+      </w:r>
+      <w:r>
+        <w:t xml:space="preserve"> Inka </w:t>
+      </w:r>
+      <w:proofErr w:type="spellStart"/>
+      <w:r>
+        <w:t>poora</w:t>
+      </w:r>
+      <w:proofErr w:type="spellEnd"/>
+      <w:r>
+        <w:t xml:space="preserve"> ka </w:t>
+      </w:r>
+      <w:proofErr w:type="spellStart"/>
+      <w:r>
+        <w:t>poora</w:t>
+      </w:r>
+      <w:proofErr w:type="spellEnd"/>
+      <w:r>
+        <w:t xml:space="preserve"> code memory </w:t>
+      </w:r>
+      <w:proofErr w:type="spellStart"/>
+      <w:r>
+        <w:t>mein</w:t>
+      </w:r>
+      <w:proofErr w:type="spellEnd"/>
+      <w:r>
+        <w:t xml:space="preserve"> copy </w:t>
+      </w:r>
+      <w:proofErr w:type="spellStart"/>
+      <w:r>
+        <w:t>ho</w:t>
+      </w:r>
+      <w:proofErr w:type="spellEnd"/>
+      <w:r>
+        <w:t xml:space="preserve"> </w:t>
+      </w:r>
+      <w:proofErr w:type="spellStart"/>
+      <w:r>
+        <w:t>jata</w:t>
+      </w:r>
+      <w:proofErr w:type="spellEnd"/>
+      <w:r>
+        <w:t xml:space="preserve"> </w:t>
+      </w:r>
+      <w:proofErr w:type="spellStart"/>
+      <w:r>
+        <w:t>hai</w:t>
+      </w:r>
+      <w:proofErr w:type="spellEnd"/>
+      <w:r>
+        <w:t>.</w:t>
+      </w:r>
+    </w:p>
+    <w:p>
+      <w:r>
+        <w:t xml:space="preserve">        </w:t>
+      </w:r>
+      <w:r>
+        <w:drawing>
+          <wp:inline distT="0" distB="0" distL="0" distR="0" wp14:anchorId="03D3B2C9" wp14:editId="6B7E7C31">
+            <wp:extent cx="4896533" cy="4296375"/>
+            <wp:effectExtent l="0" t="0" r="0" b="9525"/>
+            <wp:docPr id="617773002" name="Picture 1"/>
+            <wp:cNvGraphicFramePr>
+              <a:graphicFrameLocks xmlns:a="http://schemas.openxmlformats.org/drawingml/2006/main" noChangeAspect="1"/>
+            </wp:cNvGraphicFramePr>
+            <a:graphic xmlns:a="http://schemas.openxmlformats.org/drawingml/2006/main">
+              <a:graphicData uri="http://schemas.openxmlformats.org/drawingml/2006/picture">
+                <pic:pic xmlns:pic="http://schemas.openxmlformats.org/drawingml/2006/picture">
+                  <pic:nvPicPr>
+                    <pic:cNvPr id="617773002" name=""/>
+                    <pic:cNvPicPr/>
+                  </pic:nvPicPr>
+                  <pic:blipFill>
+                    <a:blip r:embed="rId6"/>
+                    <a:stretch>
+                      <a:fillRect/>
+                    </a:stretch>
+                  </pic:blipFill>
+                  <pic:spPr>
+                    <a:xfrm>
+                      <a:off x="0" y="0"/>
+                      <a:ext cx="4896533" cy="4296375"/>
+                    </a:xfrm>
+                    <a:prstGeom prst="rect">
+                      <a:avLst/>
+                    </a:prstGeom>
+                  </pic:spPr>
+                </pic:pic>
+              </a:graphicData>
+            </a:graphic>
+          </wp:inline>
+        </w:drawing>
+      </w:r>
+    </w:p>
+    <w:p>
+      <w:pPr>
+        <w:numPr>
+          <w:ilvl w:val="0"/>
+          <w:numId w:val="4"/>
+        </w:numPr>
+      </w:pPr>
+      <w:r>
+        <w:rPr>
+          <w:b/>
+          <w:bCs/>
+        </w:rPr>
+        <w:t>Phase 2: Code Execution Phase</w:t>
+      </w:r>
+    </w:p>
+    <w:p>
+      <w:pPr>
+        <w:numPr>
+          <w:ilvl w:val="1"/>
+          <w:numId w:val="4"/>
+        </w:numPr>
+      </w:pPr>
+      <w:r>
+        <w:t xml:space="preserve">Ab code line-by-line </w:t>
+      </w:r>
+      <w:proofErr w:type="spellStart"/>
+      <w:r>
+        <w:t>chalna</w:t>
+      </w:r>
+      <w:proofErr w:type="spellEnd"/>
+      <w:r>
+        <w:t xml:space="preserve"> </w:t>
+      </w:r>
+      <w:proofErr w:type="spellStart"/>
+      <w:r>
+        <w:t>shuru</w:t>
+      </w:r>
+      <w:proofErr w:type="spellEnd"/>
+      <w:r>
+        <w:t xml:space="preserve"> </w:t>
+      </w:r>
+      <w:proofErr w:type="spellStart"/>
+      <w:r>
+        <w:t>hota</w:t>
+      </w:r>
+      <w:proofErr w:type="spellEnd"/>
+      <w:r>
+        <w:t xml:space="preserve"> </w:t>
+      </w:r>
+      <w:proofErr w:type="spellStart"/>
+      <w:r>
+        <w:t>hai</w:t>
+      </w:r>
+      <w:proofErr w:type="spellEnd"/>
+      <w:r>
+        <w:t>.</w:t>
+      </w:r>
+    </w:p>
+    <w:p>
+      <w:pPr>
+        <w:numPr>
+          <w:ilvl w:val="1"/>
+          <w:numId w:val="4"/>
+        </w:numPr>
+      </w:pPr>
+      <w:r>
+        <w:t xml:space="preserve">Variables ki </w:t>
+      </w:r>
+      <w:proofErr w:type="spellStart"/>
+      <w:r>
+        <w:t>asli</w:t>
+      </w:r>
+      <w:proofErr w:type="spellEnd"/>
+      <w:r>
+        <w:t xml:space="preserve"> values (</w:t>
+      </w:r>
+      <w:proofErr w:type="spellStart"/>
+      <w:r>
+        <w:t>jaise</w:t>
+      </w:r>
+      <w:proofErr w:type="spellEnd"/>
+      <w:r>
+        <w:t xml:space="preserve"> n = 2) ab undefined ko replace </w:t>
+      </w:r>
+      <w:proofErr w:type="spellStart"/>
+      <w:r>
+        <w:t>kar</w:t>
+      </w:r>
+      <w:proofErr w:type="spellEnd"/>
+      <w:r>
+        <w:t xml:space="preserve"> </w:t>
+      </w:r>
+      <w:proofErr w:type="spellStart"/>
+      <w:r>
+        <w:t>deti</w:t>
+      </w:r>
+      <w:proofErr w:type="spellEnd"/>
+      <w:r>
+        <w:t xml:space="preserve"> hain.</w:t>
+      </w:r>
+    </w:p>
+    <w:p>
+      <w:pPr>
+        <w:rPr>
+          <w:b/>
+          <w:bCs/>
+        </w:rPr>
+      </w:pPr>
+      <w:r>
+        <w:pict w14:anchorId="5EA3DB20">
+          <v:rect id="_x0000_i1055" style="width:0;height:1.5pt" o:hralign="center" o:hrstd="t" o:hr="t" fillcolor="#a0a0a0" stroked="f"/>
+        </w:pict>
+      </w:r>
+      <w:r>
+        <w:rPr>
+          <w:b/>
+          <w:bCs/>
+        </w:rPr>
+        <w:t>2. Function Invocation (Mini Program)</w:t>
+      </w:r>
+    </w:p>
+    <w:p>
+      <w:r>
+        <w:t xml:space="preserve">Video </w:t>
+      </w:r>
+      <w:proofErr w:type="spellStart"/>
+      <w:r>
+        <w:t>mein</w:t>
+      </w:r>
+      <w:proofErr w:type="spellEnd"/>
+      <w:r>
+        <w:t xml:space="preserve"> ek important </w:t>
+      </w:r>
+      <w:proofErr w:type="spellStart"/>
+      <w:r>
+        <w:t>baat</w:t>
+      </w:r>
+      <w:proofErr w:type="spellEnd"/>
+      <w:r>
+        <w:t xml:space="preserve"> </w:t>
+      </w:r>
+      <w:proofErr w:type="spellStart"/>
+      <w:r>
+        <w:t>batayi</w:t>
+      </w:r>
+      <w:proofErr w:type="spellEnd"/>
+      <w:r>
+        <w:t xml:space="preserve"> </w:t>
+      </w:r>
+      <w:proofErr w:type="spellStart"/>
+      <w:r>
+        <w:t>gayi</w:t>
+      </w:r>
+      <w:proofErr w:type="spellEnd"/>
+      <w:r>
+        <w:t xml:space="preserve"> </w:t>
+      </w:r>
+      <w:proofErr w:type="spellStart"/>
+      <w:r>
+        <w:t>hai</w:t>
+      </w:r>
+      <w:proofErr w:type="spellEnd"/>
+      <w:r>
+        <w:t xml:space="preserve">: </w:t>
+      </w:r>
+      <w:r>
+        <w:rPr>
+          <w:b/>
+          <w:bCs/>
+        </w:rPr>
+        <w:t xml:space="preserve">Jab </w:t>
+      </w:r>
+      <w:proofErr w:type="spellStart"/>
+      <w:r>
+        <w:rPr>
+          <w:b/>
+          <w:bCs/>
+        </w:rPr>
+        <w:t>bhi</w:t>
+      </w:r>
+      <w:proofErr w:type="spellEnd"/>
+      <w:r>
+        <w:rPr>
+          <w:b/>
+          <w:bCs/>
+        </w:rPr>
+        <w:t xml:space="preserve"> koi function call (invoke) </w:t>
+      </w:r>
+      <w:proofErr w:type="spellStart"/>
+      <w:r>
+        <w:rPr>
+          <w:b/>
+          <w:bCs/>
+        </w:rPr>
+        <w:t>hota</w:t>
+      </w:r>
+      <w:proofErr w:type="spellEnd"/>
+      <w:r>
+        <w:rPr>
+          <w:b/>
+          <w:bCs/>
+        </w:rPr>
+        <w:t xml:space="preserve"> </w:t>
+      </w:r>
+      <w:proofErr w:type="spellStart"/>
+      <w:r>
+        <w:rPr>
+          <w:b/>
+          <w:bCs/>
+        </w:rPr>
+        <w:t>hai</w:t>
+      </w:r>
+      <w:proofErr w:type="spellEnd"/>
+      <w:r>
+        <w:rPr>
+          <w:b/>
+          <w:bCs/>
+        </w:rPr>
+        <w:t xml:space="preserve">, ek </w:t>
+      </w:r>
+      <w:proofErr w:type="spellStart"/>
+      <w:r>
+        <w:rPr>
+          <w:b/>
+          <w:bCs/>
+        </w:rPr>
+        <w:t>naya</w:t>
+      </w:r>
+      <w:proofErr w:type="spellEnd"/>
+      <w:r>
+        <w:rPr>
+          <w:b/>
+          <w:bCs/>
+        </w:rPr>
+        <w:t xml:space="preserve"> Execution Context </w:t>
+      </w:r>
+      <w:proofErr w:type="spellStart"/>
+      <w:r>
+        <w:rPr>
+          <w:b/>
+          <w:bCs/>
+        </w:rPr>
+        <w:t>banta</w:t>
+      </w:r>
+      <w:proofErr w:type="spellEnd"/>
+      <w:r>
+        <w:rPr>
+          <w:b/>
+          <w:bCs/>
+        </w:rPr>
+        <w:t xml:space="preserve"> </w:t>
+      </w:r>
+      <w:proofErr w:type="spellStart"/>
+      <w:r>
+        <w:rPr>
+          <w:b/>
+          <w:bCs/>
+        </w:rPr>
+        <w:t>hai</w:t>
+      </w:r>
+      <w:proofErr w:type="spellEnd"/>
+      <w:r>
+        <w:rPr>
+          <w:b/>
+          <w:bCs/>
+        </w:rPr>
+        <w:t>.</w:t>
+      </w:r>
+    </w:p>
+    <w:p>
+      <w:pPr>
+        <w:numPr>
+          <w:ilvl w:val="0"/>
+          <w:numId w:val="5"/>
+        </w:numPr>
+      </w:pPr>
+      <w:r>
+        <w:t xml:space="preserve">Ye </w:t>
+      </w:r>
+      <w:proofErr w:type="spellStart"/>
+      <w:r>
+        <w:t>naya</w:t>
+      </w:r>
+      <w:proofErr w:type="spellEnd"/>
+      <w:r>
+        <w:t xml:space="preserve"> context GEC </w:t>
+      </w:r>
+      <w:proofErr w:type="spellStart"/>
+      <w:r>
+        <w:t>ke</w:t>
+      </w:r>
+      <w:proofErr w:type="spellEnd"/>
+      <w:r>
+        <w:t xml:space="preserve"> </w:t>
+      </w:r>
+      <w:proofErr w:type="spellStart"/>
+      <w:r>
+        <w:t>andar</w:t>
+      </w:r>
+      <w:proofErr w:type="spellEnd"/>
+      <w:r>
+        <w:t xml:space="preserve"> ek "mini program" ki </w:t>
+      </w:r>
+      <w:proofErr w:type="spellStart"/>
+      <w:r>
+        <w:t>tarah</w:t>
+      </w:r>
+      <w:proofErr w:type="spellEnd"/>
+      <w:r>
+        <w:t xml:space="preserve"> </w:t>
+      </w:r>
+      <w:proofErr w:type="spellStart"/>
+      <w:r>
+        <w:t>hota</w:t>
+      </w:r>
+      <w:proofErr w:type="spellEnd"/>
+      <w:r>
+        <w:t xml:space="preserve"> </w:t>
+      </w:r>
+      <w:proofErr w:type="spellStart"/>
+      <w:r>
+        <w:t>hai</w:t>
+      </w:r>
+      <w:proofErr w:type="spellEnd"/>
+      <w:r>
+        <w:t>.</w:t>
+      </w:r>
+    </w:p>
+    <w:p>
+      <w:pPr>
+        <w:numPr>
+          <w:ilvl w:val="0"/>
+          <w:numId w:val="5"/>
+        </w:numPr>
+      </w:pPr>
+      <w:r>
+        <w:t xml:space="preserve">Iske </w:t>
+      </w:r>
+      <w:proofErr w:type="spellStart"/>
+      <w:r>
+        <w:t>bhi</w:t>
+      </w:r>
+      <w:proofErr w:type="spellEnd"/>
+      <w:r>
+        <w:t xml:space="preserve"> </w:t>
+      </w:r>
+      <w:proofErr w:type="spellStart"/>
+      <w:r>
+        <w:t>wahi</w:t>
+      </w:r>
+      <w:proofErr w:type="spellEnd"/>
+      <w:r>
+        <w:t xml:space="preserve"> do phases </w:t>
+      </w:r>
+      <w:proofErr w:type="spellStart"/>
+      <w:r>
+        <w:t>hote</w:t>
+      </w:r>
+      <w:proofErr w:type="spellEnd"/>
+      <w:r>
+        <w:t xml:space="preserve"> hain: Memory creation aur Code execution.</w:t>
+      </w:r>
+    </w:p>
+    <w:p>
+      <w:pPr>
+        <w:numPr>
+          <w:ilvl w:val="0"/>
+          <w:numId w:val="5"/>
+        </w:numPr>
+      </w:pPr>
+      <w:r>
+        <w:t xml:space="preserve">Jab function </w:t>
+      </w:r>
+      <w:proofErr w:type="spellStart"/>
+      <w:r>
+        <w:t>ke</w:t>
+      </w:r>
+      <w:proofErr w:type="spellEnd"/>
+      <w:r>
+        <w:t xml:space="preserve"> </w:t>
+      </w:r>
+      <w:proofErr w:type="spellStart"/>
+      <w:r>
+        <w:t>andar</w:t>
+      </w:r>
+      <w:proofErr w:type="spellEnd"/>
+      <w:r>
+        <w:t xml:space="preserve"> ka </w:t>
+      </w:r>
+      <w:proofErr w:type="spellStart"/>
+      <w:r>
+        <w:t>kaam</w:t>
+      </w:r>
+      <w:proofErr w:type="spellEnd"/>
+      <w:r>
+        <w:t xml:space="preserve"> khatam </w:t>
+      </w:r>
+      <w:proofErr w:type="spellStart"/>
+      <w:r>
+        <w:t>ho</w:t>
+      </w:r>
+      <w:proofErr w:type="spellEnd"/>
+      <w:r>
+        <w:t xml:space="preserve"> </w:t>
+      </w:r>
+      <w:proofErr w:type="spellStart"/>
+      <w:r>
+        <w:t>jata</w:t>
+      </w:r>
+      <w:proofErr w:type="spellEnd"/>
+      <w:r>
+        <w:t xml:space="preserve"> </w:t>
+      </w:r>
+      <w:proofErr w:type="spellStart"/>
+      <w:r>
+        <w:t>hai</w:t>
+      </w:r>
+      <w:proofErr w:type="spellEnd"/>
+      <w:r>
+        <w:t xml:space="preserve"> aur wo return statement </w:t>
+      </w:r>
+      <w:proofErr w:type="spellStart"/>
+      <w:r>
+        <w:t>tak</w:t>
+      </w:r>
+      <w:proofErr w:type="spellEnd"/>
+      <w:r>
+        <w:t xml:space="preserve"> </w:t>
+      </w:r>
+      <w:proofErr w:type="spellStart"/>
+      <w:r>
+        <w:t>pahunchta</w:t>
+      </w:r>
+      <w:proofErr w:type="spellEnd"/>
+      <w:r>
+        <w:t xml:space="preserve"> </w:t>
+      </w:r>
+      <w:proofErr w:type="spellStart"/>
+      <w:r>
+        <w:t>hai</w:t>
+      </w:r>
+      <w:proofErr w:type="spellEnd"/>
+      <w:r>
+        <w:t xml:space="preserve">, </w:t>
+      </w:r>
+      <w:proofErr w:type="spellStart"/>
+      <w:r>
+        <w:t>toh</w:t>
+      </w:r>
+      <w:proofErr w:type="spellEnd"/>
+      <w:r>
+        <w:t xml:space="preserve"> wo </w:t>
+      </w:r>
+      <w:proofErr w:type="spellStart"/>
+      <w:r>
+        <w:t>naya</w:t>
+      </w:r>
+      <w:proofErr w:type="spellEnd"/>
+      <w:r>
+        <w:t xml:space="preserve"> context </w:t>
+      </w:r>
+      <w:r>
+        <w:rPr>
+          <w:b/>
+          <w:bCs/>
+        </w:rPr>
+        <w:t>delete</w:t>
+      </w:r>
+      <w:r>
+        <w:t xml:space="preserve"> </w:t>
+      </w:r>
+      <w:proofErr w:type="spellStart"/>
+      <w:r>
+        <w:t>ho</w:t>
+      </w:r>
+      <w:proofErr w:type="spellEnd"/>
+      <w:r>
+        <w:t xml:space="preserve"> </w:t>
+      </w:r>
+      <w:proofErr w:type="spellStart"/>
+      <w:r>
+        <w:t>jata</w:t>
+      </w:r>
+      <w:proofErr w:type="spellEnd"/>
+      <w:r>
+        <w:t xml:space="preserve"> </w:t>
+      </w:r>
+      <w:proofErr w:type="spellStart"/>
+      <w:r>
+        <w:t>hai</w:t>
+      </w:r>
+      <w:proofErr w:type="spellEnd"/>
+      <w:r>
+        <w:t xml:space="preserve"> aur control </w:t>
+      </w:r>
+      <w:proofErr w:type="spellStart"/>
+      <w:r>
+        <w:t>wapas</w:t>
+      </w:r>
+      <w:proofErr w:type="spellEnd"/>
+      <w:r>
+        <w:t xml:space="preserve"> GEC </w:t>
+      </w:r>
+      <w:proofErr w:type="spellStart"/>
+      <w:r>
+        <w:t>ke</w:t>
+      </w:r>
+      <w:proofErr w:type="spellEnd"/>
+      <w:r>
+        <w:t xml:space="preserve"> </w:t>
+      </w:r>
+      <w:proofErr w:type="spellStart"/>
+      <w:r>
+        <w:t>paas</w:t>
+      </w:r>
+      <w:proofErr w:type="spellEnd"/>
+      <w:r>
+        <w:t xml:space="preserve"> </w:t>
+      </w:r>
+      <w:proofErr w:type="spellStart"/>
+      <w:r>
+        <w:t>chala</w:t>
+      </w:r>
+      <w:proofErr w:type="spellEnd"/>
+      <w:r>
+        <w:t xml:space="preserve"> </w:t>
+      </w:r>
+      <w:proofErr w:type="spellStart"/>
+      <w:r>
+        <w:t>jata</w:t>
+      </w:r>
+      <w:proofErr w:type="spellEnd"/>
+      <w:r>
+        <w:t xml:space="preserve"> </w:t>
+      </w:r>
+      <w:proofErr w:type="spellStart"/>
+      <w:r>
+        <w:t>hai</w:t>
+      </w:r>
+      <w:proofErr w:type="spellEnd"/>
+      <w:r>
+        <w:t>.</w:t>
+      </w:r>
+    </w:p>
+    <w:p>
+      <w:pPr>
+        <w:rPr>
+          <w:noProof/>
+        </w:rPr>
+      </w:pPr>
+      <w:r>
+        <w:lastRenderedPageBreak/>
+        <w:t xml:space="preserve">                    </w:t>
+      </w:r>
+      <w:r>
+        <w:drawing>
+          <wp:inline distT="0" distB="0" distL="0" distR="0" wp14:anchorId="029802C6" wp14:editId="1CAF294B">
+            <wp:extent cx="4334480" cy="3734321"/>
+            <wp:effectExtent l="0" t="0" r="9525" b="0"/>
+            <wp:docPr id="1338497909" name="Picture 1"/>
+            <wp:cNvGraphicFramePr>
+              <a:graphicFrameLocks xmlns:a="http://schemas.openxmlformats.org/drawingml/2006/main" noChangeAspect="1"/>
+            </wp:cNvGraphicFramePr>
+            <a:graphic xmlns:a="http://schemas.openxmlformats.org/drawingml/2006/main">
+              <a:graphicData uri="http://schemas.openxmlformats.org/drawingml/2006/picture">
+                <pic:pic xmlns:pic="http://schemas.openxmlformats.org/drawingml/2006/picture">
+                  <pic:nvPicPr>
+                    <pic:cNvPr id="1338497909" name=""/>
+                    <pic:cNvPicPr/>
+                  </pic:nvPicPr>
+                  <pic:blipFill>
+                    <a:blip r:embed="rId7"/>
+                    <a:stretch>
+                      <a:fillRect/>
+                    </a:stretch>
+                  </pic:blipFill>
+                  <pic:spPr>
+                    <a:xfrm>
+                      <a:off x="0" y="0"/>
+                      <a:ext cx="4334480" cy="3734321"/>
+                    </a:xfrm>
+                    <a:prstGeom prst="rect">
+                      <a:avLst/>
+                    </a:prstGeom>
+                  </pic:spPr>
+                </pic:pic>
+              </a:graphicData>
+            </a:graphic>
+          </wp:inline>
+        </w:drawing>
+      </w:r>
+      <w:r>
+        <w:rPr>
+          <w:noProof/>
+        </w:rPr>
+        <w:t xml:space="preserve"> </w:t>
+      </w:r>
+      <w:r>
+        <w:rPr>
+          <w:noProof/>
+        </w:rPr>
+        <w:t xml:space="preserve">      </w:t>
+      </w:r>
+    </w:p>
+    <w:p>
+      <w:pPr>
+        <w:rPr>
+          <w:noProof/>
+        </w:rPr>
+      </w:pPr>
+      <w:r>
+        <w:t xml:space="preserve">       </w:t>
+      </w:r>
+      <w:r>
+        <w:drawing>
+          <wp:inline distT="0" distB="0" distL="0" distR="0" wp14:anchorId="68EE55B8" wp14:editId="1A5B7373">
+            <wp:extent cx="5229955" cy="3315163"/>
+            <wp:effectExtent l="0" t="0" r="8890" b="0"/>
+            <wp:docPr id="996697770" name="Picture 1"/>
+            <wp:cNvGraphicFramePr>
+              <a:graphicFrameLocks xmlns:a="http://schemas.openxmlformats.org/drawingml/2006/main" noChangeAspect="1"/>
+            </wp:cNvGraphicFramePr>
+            <a:graphic xmlns:a="http://schemas.openxmlformats.org/drawingml/2006/main">
+              <a:graphicData uri="http://schemas.openxmlformats.org/drawingml/2006/picture">
+                <pic:pic xmlns:pic="http://schemas.openxmlformats.org/drawingml/2006/picture">
+                  <pic:nvPicPr>
+                    <pic:cNvPr id="996697770" name=""/>
+                    <pic:cNvPicPr/>
+                  </pic:nvPicPr>
+                  <pic:blipFill>
+                    <a:blip r:embed="rId8"/>
+                    <a:stretch>
+                      <a:fillRect/>
+                    </a:stretch>
+                  </pic:blipFill>
+                  <pic:spPr>
+                    <a:xfrm>
+                      <a:off x="0" y="0"/>
+                      <a:ext cx="5229955" cy="3315163"/>
+                    </a:xfrm>
+                    <a:prstGeom prst="rect">
+                      <a:avLst/>
+                    </a:prstGeom>
+                  </pic:spPr>
+                </pic:pic>
+              </a:graphicData>
+            </a:graphic>
+          </wp:inline>
+        </w:drawing>
+      </w:r>
+      <w:r>
+        <w:rPr>
+          <w:noProof/>
+        </w:rPr>
+        <w:t xml:space="preserve"> </w:t>
+      </w:r>
+    </w:p>
+    <w:p>
+      <w:pPr>
+        <w:rPr>
+          <w:noProof/>
+        </w:rPr>
+      </w:pPr>
+      <w:r>
+        <w:lastRenderedPageBreak/>
+        <w:t xml:space="preserve">              </w:t>
+      </w:r>
+      <w:r>
+        <w:drawing>
+          <wp:inline distT="0" distB="0" distL="0" distR="0" wp14:anchorId="4F045B6F" wp14:editId="75348FCE">
+            <wp:extent cx="4744112" cy="3010320"/>
+            <wp:effectExtent l="0" t="0" r="0" b="0"/>
+            <wp:docPr id="2067596693" name="Picture 1"/>
+            <wp:cNvGraphicFramePr>
+              <a:graphicFrameLocks xmlns:a="http://schemas.openxmlformats.org/drawingml/2006/main" noChangeAspect="1"/>
+            </wp:cNvGraphicFramePr>
+            <a:graphic xmlns:a="http://schemas.openxmlformats.org/drawingml/2006/main">
+              <a:graphicData uri="http://schemas.openxmlformats.org/drawingml/2006/picture">
+                <pic:pic xmlns:pic="http://schemas.openxmlformats.org/drawingml/2006/picture">
+                  <pic:nvPicPr>
+                    <pic:cNvPr id="2067596693" name=""/>
+                    <pic:cNvPicPr/>
+                  </pic:nvPicPr>
+                  <pic:blipFill>
+                    <a:blip r:embed="rId9"/>
+                    <a:stretch>
+                      <a:fillRect/>
+                    </a:stretch>
+                  </pic:blipFill>
+                  <pic:spPr>
+                    <a:xfrm>
+                      <a:off x="0" y="0"/>
+                      <a:ext cx="4744112" cy="3010320"/>
+                    </a:xfrm>
+                    <a:prstGeom prst="rect">
+                      <a:avLst/>
+                    </a:prstGeom>
+                  </pic:spPr>
+                </pic:pic>
+              </a:graphicData>
+            </a:graphic>
+          </wp:inline>
+        </w:drawing>
+      </w:r>
+      <w:r>
+        <w:t xml:space="preserve">   </w:t>
+      </w:r>
+      <w:r>
+        <w:pict w14:anchorId="3B7569BD">
+          <v:rect id="_x0000_i1056" style="width:0;height:1.5pt" o:hralign="center" o:hrstd="t" o:hr="t" fillcolor="#a0a0a0" stroked="f"/>
+        </w:pict>
+      </w:r>
+      <w:r>
+        <w:rPr>
+          <w:b/>
+          <w:bCs/>
+        </w:rPr>
+        <w:t>3. The Call Stack (The Manager)</w:t>
+      </w:r>
+    </w:p>
+    <w:p>
+      <w:proofErr w:type="spellStart"/>
+      <w:r>
+        <w:t>Itne</w:t>
+      </w:r>
+      <w:proofErr w:type="spellEnd"/>
+      <w:r>
+        <w:t xml:space="preserve"> </w:t>
+      </w:r>
+      <w:proofErr w:type="spellStart"/>
+      <w:r>
+        <w:t>saare</w:t>
+      </w:r>
+      <w:proofErr w:type="spellEnd"/>
+      <w:r>
+        <w:t xml:space="preserve"> execution contexts (ek </w:t>
+      </w:r>
+      <w:proofErr w:type="spellStart"/>
+      <w:r>
+        <w:t>ke</w:t>
+      </w:r>
+      <w:proofErr w:type="spellEnd"/>
+      <w:r>
+        <w:t xml:space="preserve"> </w:t>
+      </w:r>
+      <w:proofErr w:type="spellStart"/>
+      <w:r>
+        <w:t>andar</w:t>
+      </w:r>
+      <w:proofErr w:type="spellEnd"/>
+      <w:r>
+        <w:t xml:space="preserve"> ek) ko manage </w:t>
+      </w:r>
+      <w:proofErr w:type="spellStart"/>
+      <w:r>
+        <w:t>karna</w:t>
+      </w:r>
+      <w:proofErr w:type="spellEnd"/>
+      <w:r>
+        <w:t xml:space="preserve"> </w:t>
+      </w:r>
+      <w:proofErr w:type="spellStart"/>
+      <w:r>
+        <w:t>mushkil</w:t>
+      </w:r>
+      <w:proofErr w:type="spellEnd"/>
+      <w:r>
+        <w:t xml:space="preserve"> </w:t>
+      </w:r>
+      <w:proofErr w:type="spellStart"/>
+      <w:r>
+        <w:t>kaam</w:t>
+      </w:r>
+      <w:proofErr w:type="spellEnd"/>
+      <w:r>
+        <w:t xml:space="preserve"> </w:t>
+      </w:r>
+      <w:proofErr w:type="spellStart"/>
+      <w:r>
+        <w:t>hai</w:t>
+      </w:r>
+      <w:proofErr w:type="spellEnd"/>
+      <w:r>
+        <w:t xml:space="preserve">, </w:t>
+      </w:r>
+      <w:proofErr w:type="spellStart"/>
+      <w:r>
+        <w:t>isliye</w:t>
+      </w:r>
+      <w:proofErr w:type="spellEnd"/>
+      <w:r>
+        <w:t xml:space="preserve"> JS engine </w:t>
+      </w:r>
+      <w:r>
+        <w:rPr>
+          <w:b/>
+          <w:bCs/>
+        </w:rPr>
+        <w:t>Call Stack</w:t>
+      </w:r>
+      <w:r>
+        <w:t xml:space="preserve"> ka </w:t>
+      </w:r>
+      <w:proofErr w:type="gramStart"/>
+      <w:r>
+        <w:t>use</w:t>
+      </w:r>
+      <w:proofErr w:type="gramEnd"/>
+      <w:r>
+        <w:t xml:space="preserve"> </w:t>
+      </w:r>
+      <w:proofErr w:type="spellStart"/>
+      <w:r>
+        <w:t>karta</w:t>
+      </w:r>
+      <w:proofErr w:type="spellEnd"/>
+      <w:r>
+        <w:t xml:space="preserve"> </w:t>
+      </w:r>
+      <w:proofErr w:type="spellStart"/>
+      <w:r>
+        <w:t>hai</w:t>
+      </w:r>
+      <w:proofErr w:type="spellEnd"/>
+      <w:r>
+        <w:t>.</w:t>
+      </w:r>
+    </w:p>
+    <w:p>
+      <w:pPr>
+        <w:numPr>
+          <w:ilvl w:val="0"/>
+          <w:numId w:val="6"/>
+        </w:numPr>
+      </w:pPr>
+      <w:r>
+        <w:rPr>
+          <w:b/>
+          <w:bCs/>
+        </w:rPr>
+        <w:t>Bottom of the Stack:</w:t>
+      </w:r>
+      <w:r>
+        <w:t xml:space="preserve"> Sabse niche </w:t>
+      </w:r>
+      <w:proofErr w:type="spellStart"/>
+      <w:r>
+        <w:t>hamesha</w:t>
+      </w:r>
+      <w:proofErr w:type="spellEnd"/>
+      <w:r>
+        <w:t xml:space="preserve"> </w:t>
+      </w:r>
+      <w:r>
+        <w:rPr>
+          <w:b/>
+          <w:bCs/>
+        </w:rPr>
+        <w:t>Global Execution Context</w:t>
+      </w:r>
+      <w:r>
+        <w:t xml:space="preserve"> </w:t>
+      </w:r>
+      <w:proofErr w:type="spellStart"/>
+      <w:r>
+        <w:t>hota</w:t>
+      </w:r>
+      <w:proofErr w:type="spellEnd"/>
+      <w:r>
+        <w:t xml:space="preserve"> </w:t>
+      </w:r>
+      <w:proofErr w:type="spellStart"/>
+      <w:r>
+        <w:t>hai</w:t>
+      </w:r>
+      <w:proofErr w:type="spellEnd"/>
+      <w:r>
+        <w:t>.</w:t>
+      </w:r>
+    </w:p>
+    <w:p>
+      <w:pPr>
+        <w:numPr>
+          <w:ilvl w:val="0"/>
+          <w:numId w:val="6"/>
+        </w:numPr>
+      </w:pPr>
+      <w:r>
+        <w:rPr>
+          <w:b/>
+          <w:bCs/>
+        </w:rPr>
+        <w:t>Push:</w:t>
+      </w:r>
+      <w:r>
+        <w:t xml:space="preserve"> Jab </w:t>
+      </w:r>
+      <w:proofErr w:type="spellStart"/>
+      <w:r>
+        <w:t>bhi</w:t>
+      </w:r>
+      <w:proofErr w:type="spellEnd"/>
+      <w:r>
+        <w:t xml:space="preserve"> </w:t>
+      </w:r>
+      <w:proofErr w:type="spellStart"/>
+      <w:r>
+        <w:t>naya</w:t>
+      </w:r>
+      <w:proofErr w:type="spellEnd"/>
+      <w:r>
+        <w:t xml:space="preserve"> function call </w:t>
+      </w:r>
+      <w:proofErr w:type="spellStart"/>
+      <w:r>
+        <w:t>hota</w:t>
+      </w:r>
+      <w:proofErr w:type="spellEnd"/>
+      <w:r>
+        <w:t xml:space="preserve"> </w:t>
+      </w:r>
+      <w:proofErr w:type="spellStart"/>
+      <w:r>
+        <w:t>hai</w:t>
+      </w:r>
+      <w:proofErr w:type="spellEnd"/>
+      <w:r>
+        <w:t xml:space="preserve">, </w:t>
+      </w:r>
+      <w:proofErr w:type="spellStart"/>
+      <w:r>
+        <w:t>uska</w:t>
+      </w:r>
+      <w:proofErr w:type="spellEnd"/>
+      <w:r>
+        <w:t xml:space="preserve"> execution context stack </w:t>
+      </w:r>
+      <w:proofErr w:type="spellStart"/>
+      <w:r>
+        <w:t>ke</w:t>
+      </w:r>
+      <w:proofErr w:type="spellEnd"/>
+      <w:r>
+        <w:t xml:space="preserve"> </w:t>
+      </w:r>
+      <w:proofErr w:type="spellStart"/>
+      <w:r>
+        <w:t>upar</w:t>
+      </w:r>
+      <w:proofErr w:type="spellEnd"/>
+      <w:r>
+        <w:t xml:space="preserve"> "push" </w:t>
+      </w:r>
+      <w:proofErr w:type="spellStart"/>
+      <w:r>
+        <w:t>ho</w:t>
+      </w:r>
+      <w:proofErr w:type="spellEnd"/>
+      <w:r>
+        <w:t xml:space="preserve"> </w:t>
+      </w:r>
+      <w:proofErr w:type="spellStart"/>
+      <w:r>
+        <w:t>jata</w:t>
+      </w:r>
+      <w:proofErr w:type="spellEnd"/>
+      <w:r>
+        <w:t xml:space="preserve"> </w:t>
+      </w:r>
+      <w:proofErr w:type="spellStart"/>
+      <w:r>
+        <w:t>hai</w:t>
+      </w:r>
+      <w:proofErr w:type="spellEnd"/>
+      <w:r>
+        <w:t>.</w:t>
+      </w:r>
+    </w:p>
+    <w:p>
+      <w:pPr>
+        <w:numPr>
+          <w:ilvl w:val="0"/>
+          <w:numId w:val="6"/>
+        </w:numPr>
+      </w:pPr>
+      <w:r>
+        <w:rPr>
+          <w:b/>
+          <w:bCs/>
+        </w:rPr>
+        <w:t>Pop:</w:t>
+      </w:r>
+      <w:r>
+        <w:t xml:space="preserve"> Jaise hi function execute </w:t>
+      </w:r>
+      <w:proofErr w:type="spellStart"/>
+      <w:r>
+        <w:t>ho</w:t>
+      </w:r>
+      <w:proofErr w:type="spellEnd"/>
+      <w:r>
+        <w:t xml:space="preserve"> </w:t>
+      </w:r>
+      <w:proofErr w:type="spellStart"/>
+      <w:r>
+        <w:t>jata</w:t>
+      </w:r>
+      <w:proofErr w:type="spellEnd"/>
+      <w:r>
+        <w:t xml:space="preserve"> </w:t>
+      </w:r>
+      <w:proofErr w:type="spellStart"/>
+      <w:r>
+        <w:t>hai</w:t>
+      </w:r>
+      <w:proofErr w:type="spellEnd"/>
+      <w:r>
+        <w:t xml:space="preserve">, </w:t>
+      </w:r>
+      <w:proofErr w:type="spellStart"/>
+      <w:r>
+        <w:t>uska</w:t>
+      </w:r>
+      <w:proofErr w:type="spellEnd"/>
+      <w:r>
+        <w:t xml:space="preserve"> context stack se "pop" (bahar </w:t>
+      </w:r>
+      <w:proofErr w:type="spellStart"/>
+      <w:r>
+        <w:t>nikal</w:t>
+      </w:r>
+      <w:proofErr w:type="spellEnd"/>
+      <w:r>
+        <w:t xml:space="preserve">) </w:t>
+      </w:r>
+      <w:proofErr w:type="spellStart"/>
+      <w:r>
+        <w:t>jata</w:t>
+      </w:r>
+      <w:proofErr w:type="spellEnd"/>
+      <w:r>
+        <w:t xml:space="preserve"> </w:t>
+      </w:r>
+      <w:proofErr w:type="spellStart"/>
+      <w:r>
+        <w:t>hai</w:t>
+      </w:r>
+      <w:proofErr w:type="spellEnd"/>
+      <w:r>
+        <w:t>.</w:t>
+      </w:r>
+    </w:p>
+    <w:p>
+      <w:pPr>
+        <w:numPr>
+          <w:ilvl w:val="0"/>
+          <w:numId w:val="6"/>
+        </w:numPr>
+      </w:pPr>
+      <w:r>
+        <w:rPr>
+          <w:b/>
+          <w:bCs/>
+        </w:rPr>
+        <w:t>Order of Execution:</w:t>
+      </w:r>
+      <w:r>
+        <w:t xml:space="preserve"> Call Stack ka main </w:t>
+      </w:r>
+      <w:proofErr w:type="spellStart"/>
+      <w:r>
+        <w:t>kaam</w:t>
+      </w:r>
+      <w:proofErr w:type="spellEnd"/>
+      <w:r>
+        <w:t xml:space="preserve"> </w:t>
+      </w:r>
+      <w:proofErr w:type="spellStart"/>
+      <w:r>
+        <w:t>hai</w:t>
+      </w:r>
+      <w:proofErr w:type="spellEnd"/>
+      <w:r>
+        <w:t xml:space="preserve"> execution contexts ka order maintain </w:t>
+      </w:r>
+      <w:proofErr w:type="spellStart"/>
+      <w:r>
+        <w:t>karna</w:t>
+      </w:r>
+      <w:proofErr w:type="spellEnd"/>
+      <w:r>
+        <w:t>.</w:t>
+      </w:r>
+    </w:p>
+    <w:p>
+      <w:r>
+        <w:t xml:space="preserve">  </w:t>
+      </w:r>
+      <w:r>
+        <w:drawing>
+          <wp:inline distT="0" distB="0" distL="0" distR="0" wp14:anchorId="34A8F670" wp14:editId="6F95DAFA">
+            <wp:extent cx="1311074" cy="2351314"/>
+            <wp:effectExtent l="0" t="0" r="3810" b="0"/>
+            <wp:docPr id="1183786756" name="Picture 1"/>
+            <wp:cNvGraphicFramePr>
+              <a:graphicFrameLocks xmlns:a="http://schemas.openxmlformats.org/drawingml/2006/main" noChangeAspect="1"/>
+            </wp:cNvGraphicFramePr>
+            <a:graphic xmlns:a="http://schemas.openxmlformats.org/drawingml/2006/main">
+              <a:graphicData uri="http://schemas.openxmlformats.org/drawingml/2006/picture">
+                <pic:pic xmlns:pic="http://schemas.openxmlformats.org/drawingml/2006/picture">
+                  <pic:nvPicPr>
+                    <pic:cNvPr id="1183786756" name=""/>
+                    <pic:cNvPicPr/>
+                  </pic:nvPicPr>
+                  <pic:blipFill>
+                    <a:blip r:embed="rId10"/>
+                    <a:stretch>
+                      <a:fillRect/>
+                    </a:stretch>
+                  </pic:blipFill>
+                  <pic:spPr>
+                    <a:xfrm>
+                      <a:off x="0" y="0"/>
+                      <a:ext cx="1337014" cy="2397835"/>
+                    </a:xfrm>
+                    <a:prstGeom prst="rect">
+                      <a:avLst/>
+                    </a:prstGeom>
+                  </pic:spPr>
+                </pic:pic>
+              </a:graphicData>
+            </a:graphic>
+          </wp:inline>
+        </w:drawing>
+      </w:r>
+      <w:r>
+        <w:t xml:space="preserve"> </w:t>
+      </w:r>
+      <w:r>
+        <w:drawing>
+          <wp:inline distT="0" distB="0" distL="0" distR="0" wp14:anchorId="692699DA" wp14:editId="3B5377B7">
+            <wp:extent cx="1357527" cy="2351314"/>
+            <wp:effectExtent l="0" t="0" r="0" b="0"/>
+            <wp:docPr id="207828712" name="Picture 1"/>
+            <wp:cNvGraphicFramePr>
+              <a:graphicFrameLocks xmlns:a="http://schemas.openxmlformats.org/drawingml/2006/main" noChangeAspect="1"/>
+            </wp:cNvGraphicFramePr>
+            <a:graphic xmlns:a="http://schemas.openxmlformats.org/drawingml/2006/main">
+              <a:graphicData uri="http://schemas.openxmlformats.org/drawingml/2006/picture">
+                <pic:pic xmlns:pic="http://schemas.openxmlformats.org/drawingml/2006/picture">
+                  <pic:nvPicPr>
+                    <pic:cNvPr id="207828712" name=""/>
+                    <pic:cNvPicPr/>
+                  </pic:nvPicPr>
+                  <pic:blipFill>
+                    <a:blip r:embed="rId11"/>
+                    <a:stretch>
+                      <a:fillRect/>
+                    </a:stretch>
+                  </pic:blipFill>
+                  <pic:spPr>
+                    <a:xfrm>
+                      <a:off x="0" y="0"/>
+                      <a:ext cx="1375575" cy="2382574"/>
+                    </a:xfrm>
+                    <a:prstGeom prst="rect">
+                      <a:avLst/>
+                    </a:prstGeom>
+                  </pic:spPr>
+                </pic:pic>
+              </a:graphicData>
+            </a:graphic>
+          </wp:inline>
+        </w:drawing>
+      </w:r>
+      <w:r>
+        <w:t xml:space="preserve"> </w:t>
+      </w:r>
+      <w:r>
+        <w:drawing>
+          <wp:inline distT="0" distB="0" distL="0" distR="0" wp14:anchorId="1F15AFD1" wp14:editId="3B8A461E">
+            <wp:extent cx="1404350" cy="2383971"/>
+            <wp:effectExtent l="0" t="0" r="5715" b="0"/>
+            <wp:docPr id="1479347278" name="Picture 1"/>
+            <wp:cNvGraphicFramePr>
+              <a:graphicFrameLocks xmlns:a="http://schemas.openxmlformats.org/drawingml/2006/main" noChangeAspect="1"/>
+            </wp:cNvGraphicFramePr>
+            <a:graphic xmlns:a="http://schemas.openxmlformats.org/drawingml/2006/main">
+              <a:graphicData uri="http://schemas.openxmlformats.org/drawingml/2006/picture">
+                <pic:pic xmlns:pic="http://schemas.openxmlformats.org/drawingml/2006/picture">
+                  <pic:nvPicPr>
+                    <pic:cNvPr id="1479347278" name=""/>
+                    <pic:cNvPicPr/>
+                  </pic:nvPicPr>
+                  <pic:blipFill>
+                    <a:blip r:embed="rId12"/>
+                    <a:stretch>
+                      <a:fillRect/>
+                    </a:stretch>
+                  </pic:blipFill>
+                  <pic:spPr>
+                    <a:xfrm>
+                      <a:off x="0" y="0"/>
+                      <a:ext cx="1443743" cy="2450843"/>
+                    </a:xfrm>
+                    <a:prstGeom prst="rect">
+                      <a:avLst/>
+                    </a:prstGeom>
+                  </pic:spPr>
+                </pic:pic>
+              </a:graphicData>
+            </a:graphic>
+          </wp:inline>
+        </w:drawing>
+      </w:r>
+      <w:r>
+        <w:t xml:space="preserve"> </w:t>
+      </w:r>
+      <w:r>
+        <w:drawing>
+          <wp:inline distT="0" distB="0" distL="0" distR="0" wp14:anchorId="40F18793" wp14:editId="4944595F">
+            <wp:extent cx="1371600" cy="2417618"/>
+            <wp:effectExtent l="0" t="0" r="0" b="1905"/>
+            <wp:docPr id="1523411752" name="Picture 1"/>
+            <wp:cNvGraphicFramePr>
+              <a:graphicFrameLocks xmlns:a="http://schemas.openxmlformats.org/drawingml/2006/main" noChangeAspect="1"/>
+            </wp:cNvGraphicFramePr>
+            <a:graphic xmlns:a="http://schemas.openxmlformats.org/drawingml/2006/main">
+              <a:graphicData uri="http://schemas.openxmlformats.org/drawingml/2006/picture">
+                <pic:pic xmlns:pic="http://schemas.openxmlformats.org/drawingml/2006/picture">
+                  <pic:nvPicPr>
+                    <pic:cNvPr id="1523411752" name=""/>
+                    <pic:cNvPicPr/>
+                  </pic:nvPicPr>
+                  <pic:blipFill>
+                    <a:blip r:embed="rId13"/>
+                    <a:stretch>
+                      <a:fillRect/>
+                    </a:stretch>
+                  </pic:blipFill>
+                  <pic:spPr>
+                    <a:xfrm>
+                      <a:off x="0" y="0"/>
+                      <a:ext cx="1389105" cy="2448472"/>
+                    </a:xfrm>
+                    <a:prstGeom prst="rect">
+                      <a:avLst/>
+                    </a:prstGeom>
+                  </pic:spPr>
+                </pic:pic>
+              </a:graphicData>
+            </a:graphic>
+          </wp:inline>
+        </w:drawing>
+      </w:r>
+      <w:r>
+        <w:t xml:space="preserve"> </w:t>
+      </w:r>
+      <w:r>
+        <w:pict w14:anchorId="4A710BC0">
+          <v:rect id="_x0000_i1057" style="width:0;height:1.5pt" o:hralign="center" o:hrstd="t" o:hr="t" fillcolor="#a0a0a0" stroked="f"/>
+        </w:pict>
+      </w:r>
+    </w:p>
+    <w:p>
+      <w:pPr>
+        <w:rPr>
+          <w:b/>
+          <w:bCs/>
+        </w:rPr>
+      </w:pPr>
+      <w:r>
+        <w:rPr>
+          <w:b/>
+          <w:bCs/>
+        </w:rPr>
+        <w:lastRenderedPageBreak/>
+        <w:t xml:space="preserve">4. Call Stack </w:t>
+      </w:r>
+      <w:proofErr w:type="spellStart"/>
+      <w:r>
+        <w:rPr>
+          <w:b/>
+          <w:bCs/>
+        </w:rPr>
+        <w:t>ke</w:t>
+      </w:r>
+      <w:proofErr w:type="spellEnd"/>
+      <w:r>
+        <w:rPr>
+          <w:b/>
+          <w:bCs/>
+        </w:rPr>
+        <w:t xml:space="preserve"> </w:t>
+      </w:r>
+      <w:proofErr w:type="spellStart"/>
+      <w:r>
+        <w:rPr>
+          <w:b/>
+          <w:bCs/>
+        </w:rPr>
+        <w:t>Alag-Alag</w:t>
+      </w:r>
+      <w:proofErr w:type="spellEnd"/>
+      <w:r>
+        <w:rPr>
+          <w:b/>
+          <w:bCs/>
+        </w:rPr>
+        <w:t xml:space="preserve"> Naam</w:t>
+      </w:r>
+    </w:p>
+    <w:p>
+      <w:r>
+        <w:t xml:space="preserve">Confuse mat </w:t>
+      </w:r>
+      <w:proofErr w:type="spellStart"/>
+      <w:r>
+        <w:t>hona</w:t>
+      </w:r>
+      <w:proofErr w:type="spellEnd"/>
+      <w:r>
+        <w:t xml:space="preserve">, Call Stack ko in </w:t>
+      </w:r>
+      <w:proofErr w:type="spellStart"/>
+      <w:r>
+        <w:t>naamon</w:t>
+      </w:r>
+      <w:proofErr w:type="spellEnd"/>
+      <w:r>
+        <w:t xml:space="preserve"> se </w:t>
+      </w:r>
+      <w:proofErr w:type="spellStart"/>
+      <w:r>
+        <w:t>bhi</w:t>
+      </w:r>
+      <w:proofErr w:type="spellEnd"/>
+      <w:r>
+        <w:t xml:space="preserve"> </w:t>
+      </w:r>
+      <w:proofErr w:type="spellStart"/>
+      <w:r>
+        <w:t>jana</w:t>
+      </w:r>
+      <w:proofErr w:type="spellEnd"/>
+      <w:r>
+        <w:t xml:space="preserve"> </w:t>
+      </w:r>
+      <w:proofErr w:type="spellStart"/>
+      <w:r>
+        <w:t>jata</w:t>
+      </w:r>
+      <w:proofErr w:type="spellEnd"/>
+      <w:r>
+        <w:t xml:space="preserve"> </w:t>
+      </w:r>
+      <w:proofErr w:type="spellStart"/>
+      <w:r>
+        <w:t>hai</w:t>
+      </w:r>
+      <w:proofErr w:type="spellEnd"/>
+      <w:r>
+        <w:t>:</w:t>
+      </w:r>
+    </w:p>
+    <w:p>
+      <w:pPr>
+        <w:numPr>
+          <w:ilvl w:val="0"/>
+          <w:numId w:val="7"/>
+        </w:numPr>
+      </w:pPr>
+      <w:r>
+        <w:t>Execution Context Stack</w:t>
+      </w:r>
+    </w:p>
+    <w:p>
+      <w:pPr>
+        <w:numPr>
+          <w:ilvl w:val="0"/>
+          <w:numId w:val="7"/>
+        </w:numPr>
+      </w:pPr>
+      <w:r>
+        <w:t>Program Stack</w:t>
+      </w:r>
+    </w:p>
+    <w:p>
+      <w:pPr>
+        <w:numPr>
+          <w:ilvl w:val="0"/>
+          <w:numId w:val="7"/>
+        </w:numPr>
+      </w:pPr>
+      <w:r>
+        <w:t>Control Stack</w:t>
+      </w:r>
+    </w:p>
+    <w:p>
+      <w:pPr>
+        <w:numPr>
+          <w:ilvl w:val="0"/>
+          <w:numId w:val="7"/>
+        </w:numPr>
+      </w:pPr>
+      <w:r>
+        <w:t>Runtime Stack</w:t>
+      </w:r>
+    </w:p>
+    <w:p>
+      <w:pPr>
+        <w:numPr>
+          <w:ilvl w:val="0"/>
+          <w:numId w:val="7"/>
+        </w:numPr>
+      </w:pPr>
+      <w:r>
+        <w:t>Machine Stack</w:t>
+      </w:r>
+    </w:p>
+    <w:p>
+      <w:pPr>
+        <w:rPr>
+          <w:b/>
+          <w:bCs/>
+        </w:rPr>
+      </w:pPr>
+      <w:r>
+        <w:pict w14:anchorId="42A04555">
+          <v:rect id="_x0000_i1058" style="width:0;height:1.5pt" o:hralign="center" o:hrstd="t" o:hr="t" fillcolor="#a0a0a0" stroked="f"/>
+        </w:pict>
+      </w:r>
+      <w:r>
+        <w:rPr>
+          <w:b/>
+          <w:bCs/>
+        </w:rPr>
+        <w:t>Summary Point-wise:</w:t>
+      </w:r>
+    </w:p>
+    <w:p>
+      <w:pPr>
+        <w:numPr>
+          <w:ilvl w:val="0"/>
+          <w:numId w:val="8"/>
+        </w:numPr>
+      </w:pPr>
+      <w:r>
+        <w:rPr>
+          <w:b/>
+          <w:bCs/>
+        </w:rPr>
+        <w:t xml:space="preserve">GEC </w:t>
+      </w:r>
+      <w:proofErr w:type="spellStart"/>
+      <w:r>
+        <w:rPr>
+          <w:b/>
+          <w:bCs/>
+        </w:rPr>
+        <w:t>banta</w:t>
+      </w:r>
+      <w:proofErr w:type="spellEnd"/>
+      <w:r>
+        <w:rPr>
+          <w:b/>
+          <w:bCs/>
+        </w:rPr>
+        <w:t xml:space="preserve"> </w:t>
+      </w:r>
+      <w:proofErr w:type="spellStart"/>
+      <w:r>
+        <w:rPr>
+          <w:b/>
+          <w:bCs/>
+        </w:rPr>
+        <w:t>hai</w:t>
+      </w:r>
+      <w:proofErr w:type="spellEnd"/>
+      <w:r>
+        <w:t xml:space="preserve"> jab program start </w:t>
+      </w:r>
+      <w:proofErr w:type="spellStart"/>
+      <w:r>
+        <w:t>hota</w:t>
+      </w:r>
+      <w:proofErr w:type="spellEnd"/>
+      <w:r>
+        <w:t xml:space="preserve"> </w:t>
+      </w:r>
+      <w:proofErr w:type="spellStart"/>
+      <w:r>
+        <w:t>hai</w:t>
+      </w:r>
+      <w:proofErr w:type="spellEnd"/>
+      <w:r>
+        <w:t>.</w:t>
+      </w:r>
+    </w:p>
+    <w:p>
+      <w:pPr>
+        <w:numPr>
+          <w:ilvl w:val="0"/>
+          <w:numId w:val="8"/>
+        </w:numPr>
+      </w:pPr>
+      <w:r>
+        <w:rPr>
+          <w:b/>
+          <w:bCs/>
+        </w:rPr>
+        <w:t xml:space="preserve">Memory allocate </w:t>
+      </w:r>
+      <w:proofErr w:type="spellStart"/>
+      <w:r>
+        <w:rPr>
+          <w:b/>
+          <w:bCs/>
+        </w:rPr>
+        <w:t>hoti</w:t>
+      </w:r>
+      <w:proofErr w:type="spellEnd"/>
+      <w:r>
+        <w:rPr>
+          <w:b/>
+          <w:bCs/>
+        </w:rPr>
+        <w:t xml:space="preserve"> </w:t>
+      </w:r>
+      <w:proofErr w:type="spellStart"/>
+      <w:r>
+        <w:rPr>
+          <w:b/>
+          <w:bCs/>
+        </w:rPr>
+        <w:t>hai</w:t>
+      </w:r>
+      <w:proofErr w:type="spellEnd"/>
+      <w:r>
+        <w:t xml:space="preserve"> (Variables = undefined, Functions = </w:t>
+      </w:r>
+      <w:proofErr w:type="spellStart"/>
+      <w:r>
+        <w:t>poora</w:t>
+      </w:r>
+      <w:proofErr w:type="spellEnd"/>
+      <w:r>
+        <w:t xml:space="preserve"> code).</w:t>
+      </w:r>
+    </w:p>
+    <w:p>
+      <w:pPr>
+        <w:numPr>
+          <w:ilvl w:val="0"/>
+          <w:numId w:val="8"/>
+        </w:numPr>
+      </w:pPr>
+      <w:r>
+        <w:rPr>
+          <w:b/>
+          <w:bCs/>
+        </w:rPr>
+        <w:t xml:space="preserve">Code execute </w:t>
+      </w:r>
+      <w:proofErr w:type="spellStart"/>
+      <w:r>
+        <w:rPr>
+          <w:b/>
+          <w:bCs/>
+        </w:rPr>
+        <w:t>hota</w:t>
+      </w:r>
+      <w:proofErr w:type="spellEnd"/>
+      <w:r>
+        <w:rPr>
+          <w:b/>
+          <w:bCs/>
+        </w:rPr>
+        <w:t xml:space="preserve"> </w:t>
+      </w:r>
+      <w:proofErr w:type="spellStart"/>
+      <w:r>
+        <w:rPr>
+          <w:b/>
+          <w:bCs/>
+        </w:rPr>
+        <w:t>hai</w:t>
+      </w:r>
+      <w:proofErr w:type="spellEnd"/>
+      <w:r>
+        <w:t xml:space="preserve"> line-by-line.</w:t>
+      </w:r>
+    </w:p>
+    <w:p>
+      <w:pPr>
+        <w:numPr>
+          <w:ilvl w:val="0"/>
+          <w:numId w:val="8"/>
+        </w:numPr>
+      </w:pPr>
+      <w:r>
+        <w:rPr>
+          <w:b/>
+          <w:bCs/>
+        </w:rPr>
+        <w:t xml:space="preserve">Naya Context </w:t>
+      </w:r>
+      <w:proofErr w:type="spellStart"/>
+      <w:r>
+        <w:rPr>
+          <w:b/>
+          <w:bCs/>
+        </w:rPr>
+        <w:t>banta</w:t>
+      </w:r>
+      <w:proofErr w:type="spellEnd"/>
+      <w:r>
+        <w:rPr>
+          <w:b/>
+          <w:bCs/>
+        </w:rPr>
+        <w:t xml:space="preserve"> </w:t>
+      </w:r>
+      <w:proofErr w:type="spellStart"/>
+      <w:r>
+        <w:rPr>
+          <w:b/>
+          <w:bCs/>
+        </w:rPr>
+        <w:t>hai</w:t>
+      </w:r>
+      <w:proofErr w:type="spellEnd"/>
+      <w:r>
+        <w:t xml:space="preserve"> </w:t>
+      </w:r>
+      <w:proofErr w:type="spellStart"/>
+      <w:r>
+        <w:t>har</w:t>
+      </w:r>
+      <w:proofErr w:type="spellEnd"/>
+      <w:r>
+        <w:t xml:space="preserve"> function call par.</w:t>
+      </w:r>
+    </w:p>
+    <w:p>
+      <w:pPr>
+        <w:numPr>
+          <w:ilvl w:val="0"/>
+          <w:numId w:val="8"/>
+        </w:numPr>
+      </w:pPr>
+      <w:r>
+        <w:rPr>
+          <w:b/>
+          <w:bCs/>
+        </w:rPr>
+        <w:t xml:space="preserve">Context delete </w:t>
+      </w:r>
+      <w:proofErr w:type="spellStart"/>
+      <w:r>
+        <w:rPr>
+          <w:b/>
+          <w:bCs/>
+        </w:rPr>
+        <w:t>hota</w:t>
+      </w:r>
+      <w:proofErr w:type="spellEnd"/>
+      <w:r>
+        <w:rPr>
+          <w:b/>
+          <w:bCs/>
+        </w:rPr>
+        <w:t xml:space="preserve"> </w:t>
+      </w:r>
+      <w:proofErr w:type="spellStart"/>
+      <w:r>
+        <w:rPr>
+          <w:b/>
+          <w:bCs/>
+        </w:rPr>
+        <w:t>hai</w:t>
+      </w:r>
+      <w:proofErr w:type="spellEnd"/>
+      <w:r>
+        <w:t xml:space="preserve"> function finish hone par.</w:t>
+      </w:r>
+    </w:p>
+    <w:p>
+      <w:pPr>
+        <w:numPr>
+          <w:ilvl w:val="0"/>
+          <w:numId w:val="8"/>
+        </w:numPr>
+      </w:pPr>
+      <w:r>
+        <w:rPr>
+          <w:b/>
+          <w:bCs/>
+        </w:rPr>
+        <w:t>Call Stack</w:t>
+      </w:r>
+      <w:r>
+        <w:t xml:space="preserve"> in </w:t>
+      </w:r>
+      <w:proofErr w:type="spellStart"/>
+      <w:r>
+        <w:t>sabka</w:t>
+      </w:r>
+      <w:proofErr w:type="spellEnd"/>
+      <w:r>
+        <w:t xml:space="preserve"> order manage </w:t>
+      </w:r>
+      <w:proofErr w:type="spellStart"/>
+      <w:r>
+        <w:t>karta</w:t>
+      </w:r>
+      <w:proofErr w:type="spellEnd"/>
+      <w:r>
+        <w:t xml:space="preserve"> </w:t>
+      </w:r>
+      <w:proofErr w:type="spellStart"/>
+      <w:r>
+        <w:t>hai</w:t>
+      </w:r>
+      <w:proofErr w:type="spellEnd"/>
+      <w:r>
+        <w:t>.</w:t>
+      </w:r>
+    </w:p>
+    <w:p>
+      <w:r>
+        <w:pict w14:anchorId="5B572858">
+          <v:rect id="_x0000_i1059" style="width:0;height:1.5pt" o:hralign="center" o:hrstd="t" o:hr="t" fillcolor="#a0a0a0" stroked="f"/>
+        </w:pict>
+      </w:r>
+    </w:p>
+    <w:p/>
     <w:sectPr>
       <w:pgSz w:w="11906" w:h="16838"/>
       <w:pgMar w:top="1440" w:right="1440" w:bottom="1440" w:left="1440" w:header="708" w:footer="708" w:gutter="0"/>
@@ -2174,9 +4394,718 @@
     </w:lvl>
   </w:abstractNum>
   <w:abstractNum w:abstractNumId="2" w15:restartNumberingAfterBreak="0">
+    <w:nsid w:val="0DB046AE"/>
+    <w:multiLevelType w:val="multilevel"/>
+    <w:tmpl w:val="82EADB62"/>
+    <w:lvl w:ilvl="0">
+      <w:start w:val="1"/>
+      <w:numFmt w:val="bullet"/>
+      <w:lvlText w:val=""/>
+      <w:lvlJc w:val="left"/>
+      <w:pPr>
+        <w:tabs>
+          <w:tab w:val="num" w:pos="720"/>
+        </w:tabs>
+        <w:ind w:left="720" w:hanging="360"/>
+      </w:pPr>
+      <w:rPr>
+        <w:rFonts w:ascii="Symbol" w:hAnsi="Symbol" w:hint="default"/>
+        <w:sz w:val="20"/>
+      </w:rPr>
+    </w:lvl>
+    <w:lvl w:ilvl="1" w:tentative="1">
+      <w:start w:val="1"/>
+      <w:numFmt w:val="bullet"/>
+      <w:lvlText w:val="o"/>
+      <w:lvlJc w:val="left"/>
+      <w:pPr>
+        <w:tabs>
+          <w:tab w:val="num" w:pos="1440"/>
+        </w:tabs>
+        <w:ind w:left="1440" w:hanging="360"/>
+      </w:pPr>
+      <w:rPr>
+        <w:rFonts w:ascii="Courier New" w:hAnsi="Courier New" w:hint="default"/>
+        <w:sz w:val="20"/>
+      </w:rPr>
+    </w:lvl>
+    <w:lvl w:ilvl="2" w:tentative="1">
+      <w:start w:val="1"/>
+      <w:numFmt w:val="bullet"/>
+      <w:lvlText w:val=""/>
+      <w:lvlJc w:val="left"/>
+      <w:pPr>
+        <w:tabs>
+          <w:tab w:val="num" w:pos="2160"/>
+        </w:tabs>
+        <w:ind w:left="2160" w:hanging="360"/>
+      </w:pPr>
+      <w:rPr>
+        <w:rFonts w:ascii="Wingdings" w:hAnsi="Wingdings" w:hint="default"/>
+        <w:sz w:val="20"/>
+      </w:rPr>
+    </w:lvl>
+    <w:lvl w:ilvl="3" w:tentative="1">
+      <w:start w:val="1"/>
+      <w:numFmt w:val="bullet"/>
+      <w:lvlText w:val=""/>
+      <w:lvlJc w:val="left"/>
+      <w:pPr>
+        <w:tabs>
+          <w:tab w:val="num" w:pos="2880"/>
+        </w:tabs>
+        <w:ind w:left="2880" w:hanging="360"/>
+      </w:pPr>
+      <w:rPr>
+        <w:rFonts w:ascii="Wingdings" w:hAnsi="Wingdings" w:hint="default"/>
+        <w:sz w:val="20"/>
+      </w:rPr>
+    </w:lvl>
+    <w:lvl w:ilvl="4" w:tentative="1">
+      <w:start w:val="1"/>
+      <w:numFmt w:val="bullet"/>
+      <w:lvlText w:val=""/>
+      <w:lvlJc w:val="left"/>
+      <w:pPr>
+        <w:tabs>
+          <w:tab w:val="num" w:pos="3600"/>
+        </w:tabs>
+        <w:ind w:left="3600" w:hanging="360"/>
+      </w:pPr>
+      <w:rPr>
+        <w:rFonts w:ascii="Wingdings" w:hAnsi="Wingdings" w:hint="default"/>
+        <w:sz w:val="20"/>
+      </w:rPr>
+    </w:lvl>
+    <w:lvl w:ilvl="5" w:tentative="1">
+      <w:start w:val="1"/>
+      <w:numFmt w:val="bullet"/>
+      <w:lvlText w:val=""/>
+      <w:lvlJc w:val="left"/>
+      <w:pPr>
+        <w:tabs>
+          <w:tab w:val="num" w:pos="4320"/>
+        </w:tabs>
+        <w:ind w:left="4320" w:hanging="360"/>
+      </w:pPr>
+      <w:rPr>
+        <w:rFonts w:ascii="Wingdings" w:hAnsi="Wingdings" w:hint="default"/>
+        <w:sz w:val="20"/>
+      </w:rPr>
+    </w:lvl>
+    <w:lvl w:ilvl="6" w:tentative="1">
+      <w:start w:val="1"/>
+      <w:numFmt w:val="bullet"/>
+      <w:lvlText w:val=""/>
+      <w:lvlJc w:val="left"/>
+      <w:pPr>
+        <w:tabs>
+          <w:tab w:val="num" w:pos="5040"/>
+        </w:tabs>
+        <w:ind w:left="5040" w:hanging="360"/>
+      </w:pPr>
+      <w:rPr>
+        <w:rFonts w:ascii="Wingdings" w:hAnsi="Wingdings" w:hint="default"/>
+        <w:sz w:val="20"/>
+      </w:rPr>
+    </w:lvl>
+    <w:lvl w:ilvl="7" w:tentative="1">
+      <w:start w:val="1"/>
+      <w:numFmt w:val="bullet"/>
+      <w:lvlText w:val=""/>
+      <w:lvlJc w:val="left"/>
+      <w:pPr>
+        <w:tabs>
+          <w:tab w:val="num" w:pos="5760"/>
+        </w:tabs>
+        <w:ind w:left="5760" w:hanging="360"/>
+      </w:pPr>
+      <w:rPr>
+        <w:rFonts w:ascii="Wingdings" w:hAnsi="Wingdings" w:hint="default"/>
+        <w:sz w:val="20"/>
+      </w:rPr>
+    </w:lvl>
+    <w:lvl w:ilvl="8" w:tentative="1">
+      <w:start w:val="1"/>
+      <w:numFmt w:val="bullet"/>
+      <w:lvlText w:val=""/>
+      <w:lvlJc w:val="left"/>
+      <w:pPr>
+        <w:tabs>
+          <w:tab w:val="num" w:pos="6480"/>
+        </w:tabs>
+        <w:ind w:left="6480" w:hanging="360"/>
+      </w:pPr>
+      <w:rPr>
+        <w:rFonts w:ascii="Wingdings" w:hAnsi="Wingdings" w:hint="default"/>
+        <w:sz w:val="20"/>
+      </w:rPr>
+    </w:lvl>
+  </w:abstractNum>
+  <w:abstractNum w:abstractNumId="3" w15:restartNumberingAfterBreak="0">
+    <w:nsid w:val="1F471834"/>
+    <w:multiLevelType w:val="multilevel"/>
+    <w:tmpl w:val="905ECB6E"/>
+    <w:lvl w:ilvl="0">
+      <w:start w:val="1"/>
+      <w:numFmt w:val="bullet"/>
+      <w:lvlText w:val=""/>
+      <w:lvlJc w:val="left"/>
+      <w:pPr>
+        <w:tabs>
+          <w:tab w:val="num" w:pos="720"/>
+        </w:tabs>
+        <w:ind w:left="720" w:hanging="360"/>
+      </w:pPr>
+      <w:rPr>
+        <w:rFonts w:ascii="Symbol" w:hAnsi="Symbol" w:hint="default"/>
+        <w:sz w:val="20"/>
+      </w:rPr>
+    </w:lvl>
+    <w:lvl w:ilvl="1" w:tentative="1">
+      <w:start w:val="1"/>
+      <w:numFmt w:val="bullet"/>
+      <w:lvlText w:val="o"/>
+      <w:lvlJc w:val="left"/>
+      <w:pPr>
+        <w:tabs>
+          <w:tab w:val="num" w:pos="1440"/>
+        </w:tabs>
+        <w:ind w:left="1440" w:hanging="360"/>
+      </w:pPr>
+      <w:rPr>
+        <w:rFonts w:ascii="Courier New" w:hAnsi="Courier New" w:hint="default"/>
+        <w:sz w:val="20"/>
+      </w:rPr>
+    </w:lvl>
+    <w:lvl w:ilvl="2" w:tentative="1">
+      <w:start w:val="1"/>
+      <w:numFmt w:val="bullet"/>
+      <w:lvlText w:val=""/>
+      <w:lvlJc w:val="left"/>
+      <w:pPr>
+        <w:tabs>
+          <w:tab w:val="num" w:pos="2160"/>
+        </w:tabs>
+        <w:ind w:left="2160" w:hanging="360"/>
+      </w:pPr>
+      <w:rPr>
+        <w:rFonts w:ascii="Wingdings" w:hAnsi="Wingdings" w:hint="default"/>
+        <w:sz w:val="20"/>
+      </w:rPr>
+    </w:lvl>
+    <w:lvl w:ilvl="3" w:tentative="1">
+      <w:start w:val="1"/>
+      <w:numFmt w:val="bullet"/>
+      <w:lvlText w:val=""/>
+      <w:lvlJc w:val="left"/>
+      <w:pPr>
+        <w:tabs>
+          <w:tab w:val="num" w:pos="2880"/>
+        </w:tabs>
+        <w:ind w:left="2880" w:hanging="360"/>
+      </w:pPr>
+      <w:rPr>
+        <w:rFonts w:ascii="Wingdings" w:hAnsi="Wingdings" w:hint="default"/>
+        <w:sz w:val="20"/>
+      </w:rPr>
+    </w:lvl>
+    <w:lvl w:ilvl="4" w:tentative="1">
+      <w:start w:val="1"/>
+      <w:numFmt w:val="bullet"/>
+      <w:lvlText w:val=""/>
+      <w:lvlJc w:val="left"/>
+      <w:pPr>
+        <w:tabs>
+          <w:tab w:val="num" w:pos="3600"/>
+        </w:tabs>
+        <w:ind w:left="3600" w:hanging="360"/>
+      </w:pPr>
+      <w:rPr>
+        <w:rFonts w:ascii="Wingdings" w:hAnsi="Wingdings" w:hint="default"/>
+        <w:sz w:val="20"/>
+      </w:rPr>
+    </w:lvl>
+    <w:lvl w:ilvl="5" w:tentative="1">
+      <w:start w:val="1"/>
+      <w:numFmt w:val="bullet"/>
+      <w:lvlText w:val=""/>
+      <w:lvlJc w:val="left"/>
+      <w:pPr>
+        <w:tabs>
+          <w:tab w:val="num" w:pos="4320"/>
+        </w:tabs>
+        <w:ind w:left="4320" w:hanging="360"/>
+      </w:pPr>
+      <w:rPr>
+        <w:rFonts w:ascii="Wingdings" w:hAnsi="Wingdings" w:hint="default"/>
+        <w:sz w:val="20"/>
+      </w:rPr>
+    </w:lvl>
+    <w:lvl w:ilvl="6" w:tentative="1">
+      <w:start w:val="1"/>
+      <w:numFmt w:val="bullet"/>
+      <w:lvlText w:val=""/>
+      <w:lvlJc w:val="left"/>
+      <w:pPr>
+        <w:tabs>
+          <w:tab w:val="num" w:pos="5040"/>
+        </w:tabs>
+        <w:ind w:left="5040" w:hanging="360"/>
+      </w:pPr>
+      <w:rPr>
+        <w:rFonts w:ascii="Wingdings" w:hAnsi="Wingdings" w:hint="default"/>
+        <w:sz w:val="20"/>
+      </w:rPr>
+    </w:lvl>
+    <w:lvl w:ilvl="7" w:tentative="1">
+      <w:start w:val="1"/>
+      <w:numFmt w:val="bullet"/>
+      <w:lvlText w:val=""/>
+      <w:lvlJc w:val="left"/>
+      <w:pPr>
+        <w:tabs>
+          <w:tab w:val="num" w:pos="5760"/>
+        </w:tabs>
+        <w:ind w:left="5760" w:hanging="360"/>
+      </w:pPr>
+      <w:rPr>
+        <w:rFonts w:ascii="Wingdings" w:hAnsi="Wingdings" w:hint="default"/>
+        <w:sz w:val="20"/>
+      </w:rPr>
+    </w:lvl>
+    <w:lvl w:ilvl="8" w:tentative="1">
+      <w:start w:val="1"/>
+      <w:numFmt w:val="bullet"/>
+      <w:lvlText w:val=""/>
+      <w:lvlJc w:val="left"/>
+      <w:pPr>
+        <w:tabs>
+          <w:tab w:val="num" w:pos="6480"/>
+        </w:tabs>
+        <w:ind w:left="6480" w:hanging="360"/>
+      </w:pPr>
+      <w:rPr>
+        <w:rFonts w:ascii="Wingdings" w:hAnsi="Wingdings" w:hint="default"/>
+        <w:sz w:val="20"/>
+      </w:rPr>
+    </w:lvl>
+  </w:abstractNum>
+  <w:abstractNum w:abstractNumId="4" w15:restartNumberingAfterBreak="0">
+    <w:nsid w:val="20231BB2"/>
+    <w:multiLevelType w:val="multilevel"/>
+    <w:tmpl w:val="71F09672"/>
+    <w:lvl w:ilvl="0">
+      <w:start w:val="1"/>
+      <w:numFmt w:val="decimal"/>
+      <w:lvlText w:val="%1."/>
+      <w:lvlJc w:val="left"/>
+      <w:pPr>
+        <w:tabs>
+          <w:tab w:val="num" w:pos="720"/>
+        </w:tabs>
+        <w:ind w:left="720" w:hanging="360"/>
+      </w:pPr>
+    </w:lvl>
+    <w:lvl w:ilvl="1" w:tentative="1">
+      <w:start w:val="1"/>
+      <w:numFmt w:val="decimal"/>
+      <w:lvlText w:val="%2."/>
+      <w:lvlJc w:val="left"/>
+      <w:pPr>
+        <w:tabs>
+          <w:tab w:val="num" w:pos="1440"/>
+        </w:tabs>
+        <w:ind w:left="1440" w:hanging="360"/>
+      </w:pPr>
+    </w:lvl>
+    <w:lvl w:ilvl="2" w:tentative="1">
+      <w:start w:val="1"/>
+      <w:numFmt w:val="decimal"/>
+      <w:lvlText w:val="%3."/>
+      <w:lvlJc w:val="left"/>
+      <w:pPr>
+        <w:tabs>
+          <w:tab w:val="num" w:pos="2160"/>
+        </w:tabs>
+        <w:ind w:left="2160" w:hanging="360"/>
+      </w:pPr>
+    </w:lvl>
+    <w:lvl w:ilvl="3" w:tentative="1">
+      <w:start w:val="1"/>
+      <w:numFmt w:val="decimal"/>
+      <w:lvlText w:val="%4."/>
+      <w:lvlJc w:val="left"/>
+      <w:pPr>
+        <w:tabs>
+          <w:tab w:val="num" w:pos="2880"/>
+        </w:tabs>
+        <w:ind w:left="2880" w:hanging="360"/>
+      </w:pPr>
+    </w:lvl>
+    <w:lvl w:ilvl="4" w:tentative="1">
+      <w:start w:val="1"/>
+      <w:numFmt w:val="decimal"/>
+      <w:lvlText w:val="%5."/>
+      <w:lvlJc w:val="left"/>
+      <w:pPr>
+        <w:tabs>
+          <w:tab w:val="num" w:pos="3600"/>
+        </w:tabs>
+        <w:ind w:left="3600" w:hanging="360"/>
+      </w:pPr>
+    </w:lvl>
+    <w:lvl w:ilvl="5" w:tentative="1">
+      <w:start w:val="1"/>
+      <w:numFmt w:val="decimal"/>
+      <w:lvlText w:val="%6."/>
+      <w:lvlJc w:val="left"/>
+      <w:pPr>
+        <w:tabs>
+          <w:tab w:val="num" w:pos="4320"/>
+        </w:tabs>
+        <w:ind w:left="4320" w:hanging="360"/>
+      </w:pPr>
+    </w:lvl>
+    <w:lvl w:ilvl="6" w:tentative="1">
+      <w:start w:val="1"/>
+      <w:numFmt w:val="decimal"/>
+      <w:lvlText w:val="%7."/>
+      <w:lvlJc w:val="left"/>
+      <w:pPr>
+        <w:tabs>
+          <w:tab w:val="num" w:pos="5040"/>
+        </w:tabs>
+        <w:ind w:left="5040" w:hanging="360"/>
+      </w:pPr>
+    </w:lvl>
+    <w:lvl w:ilvl="7" w:tentative="1">
+      <w:start w:val="1"/>
+      <w:numFmt w:val="decimal"/>
+      <w:lvlText w:val="%8."/>
+      <w:lvlJc w:val="left"/>
+      <w:pPr>
+        <w:tabs>
+          <w:tab w:val="num" w:pos="5760"/>
+        </w:tabs>
+        <w:ind w:left="5760" w:hanging="360"/>
+      </w:pPr>
+    </w:lvl>
+    <w:lvl w:ilvl="8" w:tentative="1">
+      <w:start w:val="1"/>
+      <w:numFmt w:val="decimal"/>
+      <w:lvlText w:val="%9."/>
+      <w:lvlJc w:val="left"/>
+      <w:pPr>
+        <w:tabs>
+          <w:tab w:val="num" w:pos="6480"/>
+        </w:tabs>
+        <w:ind w:left="6480" w:hanging="360"/>
+      </w:pPr>
+    </w:lvl>
+  </w:abstractNum>
+  <w:abstractNum w:abstractNumId="5" w15:restartNumberingAfterBreak="0">
     <w:nsid w:val="27175C64"/>
     <w:multiLevelType w:val="multilevel"/>
     <w:tmpl w:val="7D9ADED0"/>
+    <w:lvl w:ilvl="0">
+      <w:start w:val="1"/>
+      <w:numFmt w:val="bullet"/>
+      <w:lvlText w:val=""/>
+      <w:lvlJc w:val="left"/>
+      <w:pPr>
+        <w:tabs>
+          <w:tab w:val="num" w:pos="720"/>
+        </w:tabs>
+        <w:ind w:left="720" w:hanging="360"/>
+      </w:pPr>
+      <w:rPr>
+        <w:rFonts w:ascii="Symbol" w:hAnsi="Symbol" w:hint="default"/>
+        <w:sz w:val="20"/>
+      </w:rPr>
+    </w:lvl>
+    <w:lvl w:ilvl="1" w:tentative="1">
+      <w:start w:val="1"/>
+      <w:numFmt w:val="bullet"/>
+      <w:lvlText w:val="o"/>
+      <w:lvlJc w:val="left"/>
+      <w:pPr>
+        <w:tabs>
+          <w:tab w:val="num" w:pos="1440"/>
+        </w:tabs>
+        <w:ind w:left="1440" w:hanging="360"/>
+      </w:pPr>
+      <w:rPr>
+        <w:rFonts w:ascii="Courier New" w:hAnsi="Courier New" w:hint="default"/>
+        <w:sz w:val="20"/>
+      </w:rPr>
+    </w:lvl>
+    <w:lvl w:ilvl="2" w:tentative="1">
+      <w:start w:val="1"/>
+      <w:numFmt w:val="bullet"/>
+      <w:lvlText w:val=""/>
+      <w:lvlJc w:val="left"/>
+      <w:pPr>
+        <w:tabs>
+          <w:tab w:val="num" w:pos="2160"/>
+        </w:tabs>
+        <w:ind w:left="2160" w:hanging="360"/>
+      </w:pPr>
+      <w:rPr>
+        <w:rFonts w:ascii="Wingdings" w:hAnsi="Wingdings" w:hint="default"/>
+        <w:sz w:val="20"/>
+      </w:rPr>
+    </w:lvl>
+    <w:lvl w:ilvl="3" w:tentative="1">
+      <w:start w:val="1"/>
+      <w:numFmt w:val="bullet"/>
+      <w:lvlText w:val=""/>
+      <w:lvlJc w:val="left"/>
+      <w:pPr>
+        <w:tabs>
+          <w:tab w:val="num" w:pos="2880"/>
+        </w:tabs>
+        <w:ind w:left="2880" w:hanging="360"/>
+      </w:pPr>
+      <w:rPr>
+        <w:rFonts w:ascii="Wingdings" w:hAnsi="Wingdings" w:hint="default"/>
+        <w:sz w:val="20"/>
+      </w:rPr>
+    </w:lvl>
+    <w:lvl w:ilvl="4" w:tentative="1">
+      <w:start w:val="1"/>
+      <w:numFmt w:val="bullet"/>
+      <w:lvlText w:val=""/>
+      <w:lvlJc w:val="left"/>
+      <w:pPr>
+        <w:tabs>
+          <w:tab w:val="num" w:pos="3600"/>
+        </w:tabs>
+        <w:ind w:left="3600" w:hanging="360"/>
+      </w:pPr>
+      <w:rPr>
+        <w:rFonts w:ascii="Wingdings" w:hAnsi="Wingdings" w:hint="default"/>
+        <w:sz w:val="20"/>
+      </w:rPr>
+    </w:lvl>
+    <w:lvl w:ilvl="5" w:tentative="1">
+      <w:start w:val="1"/>
+      <w:numFmt w:val="bullet"/>
+      <w:lvlText w:val=""/>
+      <w:lvlJc w:val="left"/>
+      <w:pPr>
+        <w:tabs>
+          <w:tab w:val="num" w:pos="4320"/>
+        </w:tabs>
+        <w:ind w:left="4320" w:hanging="360"/>
+      </w:pPr>
+      <w:rPr>
+        <w:rFonts w:ascii="Wingdings" w:hAnsi="Wingdings" w:hint="default"/>
+        <w:sz w:val="20"/>
+      </w:rPr>
+    </w:lvl>
+    <w:lvl w:ilvl="6" w:tentative="1">
+      <w:start w:val="1"/>
+      <w:numFmt w:val="bullet"/>
+      <w:lvlText w:val=""/>
+      <w:lvlJc w:val="left"/>
+      <w:pPr>
+        <w:tabs>
+          <w:tab w:val="num" w:pos="5040"/>
+        </w:tabs>
+        <w:ind w:left="5040" w:hanging="360"/>
+      </w:pPr>
+      <w:rPr>
+        <w:rFonts w:ascii="Wingdings" w:hAnsi="Wingdings" w:hint="default"/>
+        <w:sz w:val="20"/>
+      </w:rPr>
+    </w:lvl>
+    <w:lvl w:ilvl="7" w:tentative="1">
+      <w:start w:val="1"/>
+      <w:numFmt w:val="bullet"/>
+      <w:lvlText w:val=""/>
+      <w:lvlJc w:val="left"/>
+      <w:pPr>
+        <w:tabs>
+          <w:tab w:val="num" w:pos="5760"/>
+        </w:tabs>
+        <w:ind w:left="5760" w:hanging="360"/>
+      </w:pPr>
+      <w:rPr>
+        <w:rFonts w:ascii="Wingdings" w:hAnsi="Wingdings" w:hint="default"/>
+        <w:sz w:val="20"/>
+      </w:rPr>
+    </w:lvl>
+    <w:lvl w:ilvl="8" w:tentative="1">
+      <w:start w:val="1"/>
+      <w:numFmt w:val="bullet"/>
+      <w:lvlText w:val=""/>
+      <w:lvlJc w:val="left"/>
+      <w:pPr>
+        <w:tabs>
+          <w:tab w:val="num" w:pos="6480"/>
+        </w:tabs>
+        <w:ind w:left="6480" w:hanging="360"/>
+      </w:pPr>
+      <w:rPr>
+        <w:rFonts w:ascii="Wingdings" w:hAnsi="Wingdings" w:hint="default"/>
+        <w:sz w:val="20"/>
+      </w:rPr>
+    </w:lvl>
+  </w:abstractNum>
+  <w:abstractNum w:abstractNumId="6" w15:restartNumberingAfterBreak="0">
+    <w:nsid w:val="4FE5476C"/>
+    <w:multiLevelType w:val="multilevel"/>
+    <w:tmpl w:val="5D82B42E"/>
+    <w:lvl w:ilvl="0">
+      <w:start w:val="1"/>
+      <w:numFmt w:val="bullet"/>
+      <w:lvlText w:val=""/>
+      <w:lvlJc w:val="left"/>
+      <w:pPr>
+        <w:tabs>
+          <w:tab w:val="num" w:pos="720"/>
+        </w:tabs>
+        <w:ind w:left="720" w:hanging="360"/>
+      </w:pPr>
+      <w:rPr>
+        <w:rFonts w:ascii="Symbol" w:hAnsi="Symbol" w:hint="default"/>
+        <w:sz w:val="20"/>
+      </w:rPr>
+    </w:lvl>
+    <w:lvl w:ilvl="1">
+      <w:start w:val="1"/>
+      <w:numFmt w:val="bullet"/>
+      <w:lvlText w:val="o"/>
+      <w:lvlJc w:val="left"/>
+      <w:pPr>
+        <w:tabs>
+          <w:tab w:val="num" w:pos="1440"/>
+        </w:tabs>
+        <w:ind w:left="1440" w:hanging="360"/>
+      </w:pPr>
+      <w:rPr>
+        <w:rFonts w:ascii="Courier New" w:hAnsi="Courier New" w:hint="default"/>
+        <w:sz w:val="20"/>
+      </w:rPr>
+    </w:lvl>
+    <w:lvl w:ilvl="2" w:tentative="1">
+      <w:start w:val="1"/>
+      <w:numFmt w:val="bullet"/>
+      <w:lvlText w:val=""/>
+      <w:lvlJc w:val="left"/>
+      <w:pPr>
+        <w:tabs>
+          <w:tab w:val="num" w:pos="2160"/>
+        </w:tabs>
+        <w:ind w:left="2160" w:hanging="360"/>
+      </w:pPr>
+      <w:rPr>
+        <w:rFonts w:ascii="Wingdings" w:hAnsi="Wingdings" w:hint="default"/>
+        <w:sz w:val="20"/>
+      </w:rPr>
+    </w:lvl>
+    <w:lvl w:ilvl="3" w:tentative="1">
+      <w:start w:val="1"/>
+      <w:numFmt w:val="bullet"/>
+      <w:lvlText w:val=""/>
+      <w:lvlJc w:val="left"/>
+      <w:pPr>
+        <w:tabs>
+          <w:tab w:val="num" w:pos="2880"/>
+        </w:tabs>
+        <w:ind w:left="2880" w:hanging="360"/>
+      </w:pPr>
+      <w:rPr>
+        <w:rFonts w:ascii="Wingdings" w:hAnsi="Wingdings" w:hint="default"/>
+        <w:sz w:val="20"/>
+      </w:rPr>
+    </w:lvl>
+    <w:lvl w:ilvl="4" w:tentative="1">
+      <w:start w:val="1"/>
+      <w:numFmt w:val="bullet"/>
+      <w:lvlText w:val=""/>
+      <w:lvlJc w:val="left"/>
+      <w:pPr>
+        <w:tabs>
+          <w:tab w:val="num" w:pos="3600"/>
+        </w:tabs>
+        <w:ind w:left="3600" w:hanging="360"/>
+      </w:pPr>
+      <w:rPr>
+        <w:rFonts w:ascii="Wingdings" w:hAnsi="Wingdings" w:hint="default"/>
+        <w:sz w:val="20"/>
+      </w:rPr>
+    </w:lvl>
+    <w:lvl w:ilvl="5" w:tentative="1">
+      <w:start w:val="1"/>
+      <w:numFmt w:val="bullet"/>
+      <w:lvlText w:val=""/>
+      <w:lvlJc w:val="left"/>
+      <w:pPr>
+        <w:tabs>
+          <w:tab w:val="num" w:pos="4320"/>
+        </w:tabs>
+        <w:ind w:left="4320" w:hanging="360"/>
+      </w:pPr>
+      <w:rPr>
+        <w:rFonts w:ascii="Wingdings" w:hAnsi="Wingdings" w:hint="default"/>
+        <w:sz w:val="20"/>
+      </w:rPr>
+    </w:lvl>
+    <w:lvl w:ilvl="6" w:tentative="1">
+      <w:start w:val="1"/>
+      <w:numFmt w:val="bullet"/>
+      <w:lvlText w:val=""/>
+      <w:lvlJc w:val="left"/>
+      <w:pPr>
+        <w:tabs>
+          <w:tab w:val="num" w:pos="5040"/>
+        </w:tabs>
+        <w:ind w:left="5040" w:hanging="360"/>
+      </w:pPr>
+      <w:rPr>
+        <w:rFonts w:ascii="Wingdings" w:hAnsi="Wingdings" w:hint="default"/>
+        <w:sz w:val="20"/>
+      </w:rPr>
+    </w:lvl>
+    <w:lvl w:ilvl="7" w:tentative="1">
+      <w:start w:val="1"/>
+      <w:numFmt w:val="bullet"/>
+      <w:lvlText w:val=""/>
+      <w:lvlJc w:val="left"/>
+      <w:pPr>
+        <w:tabs>
+          <w:tab w:val="num" w:pos="5760"/>
+        </w:tabs>
+        <w:ind w:left="5760" w:hanging="360"/>
+      </w:pPr>
+      <w:rPr>
+        <w:rFonts w:ascii="Wingdings" w:hAnsi="Wingdings" w:hint="default"/>
+        <w:sz w:val="20"/>
+      </w:rPr>
+    </w:lvl>
+    <w:lvl w:ilvl="8" w:tentative="1">
+      <w:start w:val="1"/>
+      <w:numFmt w:val="bullet"/>
+      <w:lvlText w:val=""/>
+      <w:lvlJc w:val="left"/>
+      <w:pPr>
+        <w:tabs>
+          <w:tab w:val="num" w:pos="6480"/>
+        </w:tabs>
+        <w:ind w:left="6480" w:hanging="360"/>
+      </w:pPr>
+      <w:rPr>
+        <w:rFonts w:ascii="Wingdings" w:hAnsi="Wingdings" w:hint="default"/>
+        <w:sz w:val="20"/>
+      </w:rPr>
+    </w:lvl>
+  </w:abstractNum>
+  <w:abstractNum w:abstractNumId="7" w15:restartNumberingAfterBreak="0">
+    <w:nsid w:val="5B5D3DF1"/>
+    <w:multiLevelType w:val="multilevel"/>
+    <w:tmpl w:val="FD58E324"/>
     <w:lvl w:ilvl="0">
       <w:start w:val="1"/>
       <w:numFmt w:val="bullet"/>
@@ -2329,7 +5258,22 @@
     <w:abstractNumId w:val="1"/>
   </w:num>
   <w:num w:numId="3" w16cid:durableId="651494618">
+    <w:abstractNumId w:val="5"/>
+  </w:num>
+  <w:num w:numId="4" w16cid:durableId="1592734076">
+    <w:abstractNumId w:val="6"/>
+  </w:num>
+  <w:num w:numId="5" w16cid:durableId="1561165587">
     <w:abstractNumId w:val="2"/>
+  </w:num>
+  <w:num w:numId="6" w16cid:durableId="828057689">
+    <w:abstractNumId w:val="7"/>
+  </w:num>
+  <w:num w:numId="7" w16cid:durableId="2083020913">
+    <w:abstractNumId w:val="3"/>
+  </w:num>
+  <w:num w:numId="8" w16cid:durableId="531922331">
+    <w:abstractNumId w:val="4"/>
   </w:num>
 </w:numbering>
 </file>

</xml_diff>

<commit_message>
understood hoisting clearly and how & why exactly it happens
</commit_message>
<xml_diff>
--- a/JAVASCRIPT EXTRA NOTES.docx
+++ b/JAVASCRIPT EXTRA NOTES.docx
@@ -4118,6 +4118,2359 @@
         </w:pict>
       </w:r>
     </w:p>
+    <w:p>
+      <w:pPr>
+        <w:rPr>
+          <w:b/>
+          <w:bCs/>
+          <w:sz w:val="36"/>
+          <w:szCs w:val="36"/>
+          <w:u w:val="single"/>
+        </w:rPr>
+      </w:pPr>
+      <w:r>
+        <w:rPr>
+          <w:b/>
+          <w:bCs/>
+          <w:sz w:val="36"/>
+          <w:szCs w:val="36"/>
+          <w:u w:val="single"/>
+        </w:rPr>
+        <w:t>JAVASCRIPT EXTRA NOTES (</w:t>
+      </w:r>
+      <w:r>
+        <w:rPr>
+          <w:b/>
+          <w:bCs/>
+          <w:sz w:val="36"/>
+          <w:szCs w:val="36"/>
+          <w:u w:val="single"/>
+        </w:rPr>
+        <w:t>3</w:t>
+      </w:r>
+      <w:r>
+        <w:rPr>
+          <w:b/>
+          <w:bCs/>
+          <w:sz w:val="36"/>
+          <w:szCs w:val="36"/>
+          <w:u w:val="single"/>
+        </w:rPr>
+        <w:t>)</w:t>
+      </w:r>
+    </w:p>
+    <w:p>
+      <w:pPr>
+        <w:rPr>
+          <w:b/>
+          <w:bCs/>
+        </w:rPr>
+      </w:pPr>
+      <w:r>
+        <w:rPr>
+          <w:b/>
+          <w:bCs/>
+        </w:rPr>
+        <w:t>1. Hoisting Kya Hai?</w:t>
+      </w:r>
+    </w:p>
+    <w:p>
+      <w:r>
+        <w:t xml:space="preserve">Hoisting JavaScript ka ek </w:t>
+      </w:r>
+      <w:proofErr w:type="spellStart"/>
+      <w:r>
+        <w:t>aisa</w:t>
+      </w:r>
+      <w:proofErr w:type="spellEnd"/>
+      <w:r>
+        <w:t xml:space="preserve"> phenomenon </w:t>
+      </w:r>
+      <w:proofErr w:type="spellStart"/>
+      <w:r>
+        <w:t>hai</w:t>
+      </w:r>
+      <w:proofErr w:type="spellEnd"/>
+      <w:r>
+        <w:t xml:space="preserve"> </w:t>
+      </w:r>
+      <w:proofErr w:type="spellStart"/>
+      <w:r>
+        <w:t>jisme</w:t>
+      </w:r>
+      <w:proofErr w:type="spellEnd"/>
+      <w:r>
+        <w:t xml:space="preserve"> </w:t>
+      </w:r>
+      <w:proofErr w:type="spellStart"/>
+      <w:r>
+        <w:t>aap</w:t>
+      </w:r>
+      <w:proofErr w:type="spellEnd"/>
+      <w:r>
+        <w:t xml:space="preserve"> variables aur functions ko </w:t>
+      </w:r>
+      <w:proofErr w:type="spellStart"/>
+      <w:r>
+        <w:t>unke</w:t>
+      </w:r>
+      <w:proofErr w:type="spellEnd"/>
+      <w:r>
+        <w:t xml:space="preserve"> initialization (value dene) se </w:t>
+      </w:r>
+      <w:proofErr w:type="spellStart"/>
+      <w:r>
+        <w:t>pehle</w:t>
+      </w:r>
+      <w:proofErr w:type="spellEnd"/>
+      <w:r>
+        <w:t xml:space="preserve"> hi access </w:t>
+      </w:r>
+      <w:proofErr w:type="spellStart"/>
+      <w:r>
+        <w:t>kar</w:t>
+      </w:r>
+      <w:proofErr w:type="spellEnd"/>
+      <w:r>
+        <w:t xml:space="preserve"> </w:t>
+      </w:r>
+      <w:proofErr w:type="spellStart"/>
+      <w:r>
+        <w:t>sakte</w:t>
+      </w:r>
+      <w:proofErr w:type="spellEnd"/>
+      <w:r>
+        <w:t xml:space="preserve"> </w:t>
+      </w:r>
+      <w:proofErr w:type="spellStart"/>
+      <w:r>
+        <w:t>ho</w:t>
+      </w:r>
+      <w:proofErr w:type="spellEnd"/>
+      <w:r>
+        <w:t xml:space="preserve"> </w:t>
+      </w:r>
+      <w:proofErr w:type="spellStart"/>
+      <w:r>
+        <w:t>bina</w:t>
+      </w:r>
+      <w:proofErr w:type="spellEnd"/>
+      <w:r>
+        <w:t xml:space="preserve"> </w:t>
+      </w:r>
+      <w:proofErr w:type="spellStart"/>
+      <w:r>
+        <w:t>kisi</w:t>
+      </w:r>
+      <w:proofErr w:type="spellEnd"/>
+      <w:r>
+        <w:t xml:space="preserve"> error </w:t>
+      </w:r>
+      <w:proofErr w:type="spellStart"/>
+      <w:r>
+        <w:t>ke</w:t>
+      </w:r>
+      <w:proofErr w:type="spellEnd"/>
+      <w:r>
+        <w:t>.</w:t>
+      </w:r>
+    </w:p>
+    <w:p>
+      <w:proofErr w:type="spellStart"/>
+      <w:r>
+        <w:t>Sadhara</w:t>
+      </w:r>
+      <w:proofErr w:type="spellEnd"/>
+      <w:r>
+        <w:t xml:space="preserve"> </w:t>
+      </w:r>
+      <w:proofErr w:type="spellStart"/>
+      <w:r>
+        <w:t>bhasa</w:t>
+      </w:r>
+      <w:proofErr w:type="spellEnd"/>
+      <w:r>
+        <w:t xml:space="preserve"> </w:t>
+      </w:r>
+      <w:proofErr w:type="spellStart"/>
+      <w:r>
+        <w:t>mein</w:t>
+      </w:r>
+      <w:proofErr w:type="spellEnd"/>
+      <w:r>
+        <w:t xml:space="preserve">: Agar </w:t>
+      </w:r>
+      <w:proofErr w:type="spellStart"/>
+      <w:r>
+        <w:t>aapne</w:t>
+      </w:r>
+      <w:proofErr w:type="spellEnd"/>
+      <w:r>
+        <w:t xml:space="preserve"> code ki </w:t>
+      </w:r>
+      <w:proofErr w:type="spellStart"/>
+      <w:r>
+        <w:t>pehli</w:t>
+      </w:r>
+      <w:proofErr w:type="spellEnd"/>
+      <w:r>
+        <w:t xml:space="preserve"> line </w:t>
+      </w:r>
+      <w:proofErr w:type="spellStart"/>
+      <w:r>
+        <w:t>mein</w:t>
+      </w:r>
+      <w:proofErr w:type="spellEnd"/>
+      <w:r>
+        <w:t xml:space="preserve"> console.log(x) </w:t>
+      </w:r>
+      <w:proofErr w:type="spellStart"/>
+      <w:r>
+        <w:t>likha</w:t>
+      </w:r>
+      <w:proofErr w:type="spellEnd"/>
+      <w:r>
+        <w:t xml:space="preserve"> </w:t>
+      </w:r>
+      <w:proofErr w:type="spellStart"/>
+      <w:r>
+        <w:t>hai</w:t>
+      </w:r>
+      <w:proofErr w:type="spellEnd"/>
+      <w:r>
+        <w:t xml:space="preserve"> aur 10vi line </w:t>
+      </w:r>
+      <w:proofErr w:type="spellStart"/>
+      <w:r>
+        <w:t>mein</w:t>
+      </w:r>
+      <w:proofErr w:type="spellEnd"/>
+      <w:r>
+        <w:t xml:space="preserve"> var x = 7 </w:t>
+      </w:r>
+      <w:proofErr w:type="spellStart"/>
+      <w:r>
+        <w:t>likha</w:t>
+      </w:r>
+      <w:proofErr w:type="spellEnd"/>
+      <w:r>
+        <w:t xml:space="preserve"> </w:t>
+      </w:r>
+      <w:proofErr w:type="spellStart"/>
+      <w:r>
+        <w:t>hai</w:t>
+      </w:r>
+      <w:proofErr w:type="spellEnd"/>
+      <w:r>
+        <w:t xml:space="preserve">, </w:t>
+      </w:r>
+      <w:proofErr w:type="spellStart"/>
+      <w:r>
+        <w:t>toh</w:t>
+      </w:r>
+      <w:proofErr w:type="spellEnd"/>
+      <w:r>
+        <w:t xml:space="preserve"> JS error </w:t>
+      </w:r>
+      <w:proofErr w:type="spellStart"/>
+      <w:r>
+        <w:t>nahi</w:t>
+      </w:r>
+      <w:proofErr w:type="spellEnd"/>
+      <w:r>
+        <w:t xml:space="preserve"> </w:t>
+      </w:r>
+      <w:proofErr w:type="spellStart"/>
+      <w:r>
+        <w:t>dega</w:t>
+      </w:r>
+      <w:proofErr w:type="spellEnd"/>
+      <w:r>
+        <w:t xml:space="preserve">, </w:t>
+      </w:r>
+      <w:proofErr w:type="spellStart"/>
+      <w:r>
+        <w:t>balki</w:t>
+      </w:r>
+      <w:proofErr w:type="spellEnd"/>
+      <w:r>
+        <w:t xml:space="preserve"> </w:t>
+      </w:r>
+      <w:r>
+        <w:rPr>
+          <w:b/>
+          <w:bCs/>
+        </w:rPr>
+        <w:t>undefined</w:t>
+      </w:r>
+      <w:r>
+        <w:t xml:space="preserve"> print </w:t>
+      </w:r>
+      <w:proofErr w:type="spellStart"/>
+      <w:r>
+        <w:t>karega</w:t>
+      </w:r>
+      <w:proofErr w:type="spellEnd"/>
+      <w:r>
+        <w:drawing>
+          <wp:inline distT="0" distB="0" distL="0" distR="0" wp14:anchorId="40537087" wp14:editId="64F203F4">
+            <wp:extent cx="5731510" cy="1394460"/>
+            <wp:effectExtent l="0" t="0" r="2540" b="0"/>
+            <wp:docPr id="2109477635" name="Picture 1"/>
+            <wp:cNvGraphicFramePr>
+              <a:graphicFrameLocks xmlns:a="http://schemas.openxmlformats.org/drawingml/2006/main" noChangeAspect="1"/>
+            </wp:cNvGraphicFramePr>
+            <a:graphic xmlns:a="http://schemas.openxmlformats.org/drawingml/2006/main">
+              <a:graphicData uri="http://schemas.openxmlformats.org/drawingml/2006/picture">
+                <pic:pic xmlns:pic="http://schemas.openxmlformats.org/drawingml/2006/picture">
+                  <pic:nvPicPr>
+                    <pic:cNvPr id="2109477635" name=""/>
+                    <pic:cNvPicPr/>
+                  </pic:nvPicPr>
+                  <pic:blipFill>
+                    <a:blip r:embed="rId14"/>
+                    <a:stretch>
+                      <a:fillRect/>
+                    </a:stretch>
+                  </pic:blipFill>
+                  <pic:spPr>
+                    <a:xfrm>
+                      <a:off x="0" y="0"/>
+                      <a:ext cx="5731510" cy="1394460"/>
+                    </a:xfrm>
+                    <a:prstGeom prst="rect">
+                      <a:avLst/>
+                    </a:prstGeom>
+                  </pic:spPr>
+                </pic:pic>
+              </a:graphicData>
+            </a:graphic>
+          </wp:inline>
+        </w:drawing>
+      </w:r>
+      <w:r>
+        <w:t>.</w:t>
+      </w:r>
+      <w:r>
+        <w:pict w14:anchorId="6250B3EC">
+          <v:rect id="_x0000_i1061" style="width:0;height:1.5pt" o:hralign="center" o:hrstd="t" o:hr="t" fillcolor="#a0a0a0" stroked="f"/>
+        </w:pict>
+      </w:r>
+    </w:p>
+    <w:p>
+      <w:r>
+        <w:lastRenderedPageBreak/>
+        <w:drawing>
+          <wp:inline distT="0" distB="0" distL="0" distR="0" wp14:anchorId="7394A582" wp14:editId="1BA82A22">
+            <wp:extent cx="5731510" cy="1384935"/>
+            <wp:effectExtent l="0" t="0" r="2540" b="5715"/>
+            <wp:docPr id="743567102" name="Picture 1"/>
+            <wp:cNvGraphicFramePr>
+              <a:graphicFrameLocks xmlns:a="http://schemas.openxmlformats.org/drawingml/2006/main" noChangeAspect="1"/>
+            </wp:cNvGraphicFramePr>
+            <a:graphic xmlns:a="http://schemas.openxmlformats.org/drawingml/2006/main">
+              <a:graphicData uri="http://schemas.openxmlformats.org/drawingml/2006/picture">
+                <pic:pic xmlns:pic="http://schemas.openxmlformats.org/drawingml/2006/picture">
+                  <pic:nvPicPr>
+                    <pic:cNvPr id="743567102" name=""/>
+                    <pic:cNvPicPr/>
+                  </pic:nvPicPr>
+                  <pic:blipFill>
+                    <a:blip r:embed="rId15"/>
+                    <a:stretch>
+                      <a:fillRect/>
+                    </a:stretch>
+                  </pic:blipFill>
+                  <pic:spPr>
+                    <a:xfrm>
+                      <a:off x="0" y="0"/>
+                      <a:ext cx="5731510" cy="1384935"/>
+                    </a:xfrm>
+                    <a:prstGeom prst="rect">
+                      <a:avLst/>
+                    </a:prstGeom>
+                  </pic:spPr>
+                </pic:pic>
+              </a:graphicData>
+            </a:graphic>
+          </wp:inline>
+        </w:drawing>
+      </w:r>
+    </w:p>
+    <w:p>
+      <w:r>
+        <w:rPr>
+          <w:b/>
+          <w:bCs/>
+        </w:rPr>
+        <w:t>2. Variable Hoisting (The undefined Case)</w:t>
+      </w:r>
+    </w:p>
+    <w:p>
+      <w:r>
+        <w:t xml:space="preserve">Jab </w:t>
+      </w:r>
+      <w:proofErr w:type="spellStart"/>
+      <w:r>
+        <w:t>aap</w:t>
+      </w:r>
+      <w:proofErr w:type="spellEnd"/>
+      <w:r>
+        <w:t xml:space="preserve"> </w:t>
+      </w:r>
+      <w:proofErr w:type="spellStart"/>
+      <w:r>
+        <w:t>kisi</w:t>
+      </w:r>
+      <w:proofErr w:type="spellEnd"/>
+      <w:r>
+        <w:t xml:space="preserve"> variable (jo var se </w:t>
+      </w:r>
+      <w:proofErr w:type="spellStart"/>
+      <w:r>
+        <w:t>bana</w:t>
+      </w:r>
+      <w:proofErr w:type="spellEnd"/>
+      <w:r>
+        <w:t xml:space="preserve"> </w:t>
+      </w:r>
+      <w:proofErr w:type="spellStart"/>
+      <w:r>
+        <w:t>ho</w:t>
+      </w:r>
+      <w:proofErr w:type="spellEnd"/>
+      <w:r>
+        <w:t xml:space="preserve">) ko declare hone se </w:t>
+      </w:r>
+      <w:proofErr w:type="spellStart"/>
+      <w:r>
+        <w:t>pehle</w:t>
+      </w:r>
+      <w:proofErr w:type="spellEnd"/>
+      <w:r>
+        <w:t xml:space="preserve"> access </w:t>
+      </w:r>
+      <w:proofErr w:type="spellStart"/>
+      <w:r>
+        <w:t>karte</w:t>
+      </w:r>
+      <w:proofErr w:type="spellEnd"/>
+      <w:r>
+        <w:t xml:space="preserve"> </w:t>
+      </w:r>
+      <w:proofErr w:type="spellStart"/>
+      <w:r>
+        <w:t>ho</w:t>
+      </w:r>
+      <w:proofErr w:type="spellEnd"/>
+      <w:r>
+        <w:t>:</w:t>
+      </w:r>
+    </w:p>
+    <w:p>
+      <w:pPr>
+        <w:numPr>
+          <w:ilvl w:val="0"/>
+          <w:numId w:val="9"/>
+        </w:numPr>
+      </w:pPr>
+      <w:r>
+        <w:t xml:space="preserve">JavaScript engine Memory Creation phase </w:t>
+      </w:r>
+      <w:proofErr w:type="spellStart"/>
+      <w:r>
+        <w:t>mein</w:t>
+      </w:r>
+      <w:proofErr w:type="spellEnd"/>
+      <w:r>
+        <w:t xml:space="preserve"> use </w:t>
+      </w:r>
+      <w:r>
+        <w:rPr>
+          <w:b/>
+          <w:bCs/>
+        </w:rPr>
+        <w:t>undefined</w:t>
+      </w:r>
+      <w:r>
+        <w:t xml:space="preserve"> value de </w:t>
+      </w:r>
+      <w:proofErr w:type="spellStart"/>
+      <w:r>
+        <w:t>deta</w:t>
+      </w:r>
+      <w:proofErr w:type="spellEnd"/>
+      <w:r>
+        <w:t xml:space="preserve"> </w:t>
+      </w:r>
+      <w:proofErr w:type="spellStart"/>
+      <w:r>
+        <w:t>hai</w:t>
+      </w:r>
+      <w:proofErr w:type="spellEnd"/>
+      <w:r>
+        <w:t>.</w:t>
+      </w:r>
+    </w:p>
+    <w:p>
+      <w:pPr>
+        <w:numPr>
+          <w:ilvl w:val="0"/>
+          <w:numId w:val="9"/>
+        </w:numPr>
+      </w:pPr>
+      <w:r>
+        <w:t xml:space="preserve">Isiliye, jab </w:t>
+      </w:r>
+      <w:proofErr w:type="spellStart"/>
+      <w:r>
+        <w:t>aap</w:t>
+      </w:r>
+      <w:proofErr w:type="spellEnd"/>
+      <w:r>
+        <w:t xml:space="preserve"> use print </w:t>
+      </w:r>
+      <w:proofErr w:type="spellStart"/>
+      <w:r>
+        <w:t>karte</w:t>
+      </w:r>
+      <w:proofErr w:type="spellEnd"/>
+      <w:r>
+        <w:t xml:space="preserve"> </w:t>
+      </w:r>
+      <w:proofErr w:type="spellStart"/>
+      <w:r>
+        <w:t>ho</w:t>
+      </w:r>
+      <w:proofErr w:type="spellEnd"/>
+      <w:r>
+        <w:t xml:space="preserve">, </w:t>
+      </w:r>
+      <w:proofErr w:type="spellStart"/>
+      <w:r>
+        <w:t>toh</w:t>
+      </w:r>
+      <w:proofErr w:type="spellEnd"/>
+      <w:r>
+        <w:t xml:space="preserve"> error ki </w:t>
+      </w:r>
+      <w:proofErr w:type="spellStart"/>
+      <w:r>
+        <w:t>jagah</w:t>
+      </w:r>
+      <w:proofErr w:type="spellEnd"/>
+      <w:r>
+        <w:t xml:space="preserve"> undefined </w:t>
+      </w:r>
+      <w:proofErr w:type="spellStart"/>
+      <w:r>
+        <w:t>dikhta</w:t>
+      </w:r>
+      <w:proofErr w:type="spellEnd"/>
+      <w:r>
+        <w:t xml:space="preserve"> </w:t>
+      </w:r>
+      <w:proofErr w:type="spellStart"/>
+      <w:r>
+        <w:t>hai</w:t>
+      </w:r>
+      <w:proofErr w:type="spellEnd"/>
+      <w:r>
+        <w:t>.</w:t>
+      </w:r>
+    </w:p>
+    <w:p>
+      <w:pPr>
+        <w:rPr>
+          <w:b/>
+          <w:bCs/>
+        </w:rPr>
+      </w:pPr>
+      <w:r>
+        <w:t xml:space="preserve">                           </w:t>
+      </w:r>
+      <w:r>
+        <w:drawing>
+          <wp:inline distT="0" distB="0" distL="0" distR="0" wp14:anchorId="5F7E4A9C" wp14:editId="0B012E59">
+            <wp:extent cx="3781953" cy="4210638"/>
+            <wp:effectExtent l="0" t="0" r="9525" b="0"/>
+            <wp:docPr id="1006511682" name="Picture 1"/>
+            <wp:cNvGraphicFramePr>
+              <a:graphicFrameLocks xmlns:a="http://schemas.openxmlformats.org/drawingml/2006/main" noChangeAspect="1"/>
+            </wp:cNvGraphicFramePr>
+            <a:graphic xmlns:a="http://schemas.openxmlformats.org/drawingml/2006/main">
+              <a:graphicData uri="http://schemas.openxmlformats.org/drawingml/2006/picture">
+                <pic:pic xmlns:pic="http://schemas.openxmlformats.org/drawingml/2006/picture">
+                  <pic:nvPicPr>
+                    <pic:cNvPr id="1006511682" name=""/>
+                    <pic:cNvPicPr/>
+                  </pic:nvPicPr>
+                  <pic:blipFill>
+                    <a:blip r:embed="rId16"/>
+                    <a:stretch>
+                      <a:fillRect/>
+                    </a:stretch>
+                  </pic:blipFill>
+                  <pic:spPr>
+                    <a:xfrm>
+                      <a:off x="0" y="0"/>
+                      <a:ext cx="3781953" cy="4210638"/>
+                    </a:xfrm>
+                    <a:prstGeom prst="rect">
+                      <a:avLst/>
+                    </a:prstGeom>
+                  </pic:spPr>
+                </pic:pic>
+              </a:graphicData>
+            </a:graphic>
+          </wp:inline>
+        </w:drawing>
+      </w:r>
+      <w:r>
+        <w:pict w14:anchorId="28FB5377">
+          <v:rect id="_x0000_i1063" style="width:0;height:1.5pt" o:hralign="center" o:hrstd="t" o:hr="t" fillcolor="#a0a0a0" stroked="f"/>
+        </w:pict>
+      </w:r>
+      <w:r>
+        <w:rPr>
+          <w:b/>
+          <w:bCs/>
+        </w:rPr>
+        <w:t>3. Function Hoisting (The "Full Copy" Case)</w:t>
+      </w:r>
+    </w:p>
+    <w:p>
+      <w:r>
+        <w:t xml:space="preserve">Functions </w:t>
+      </w:r>
+      <w:proofErr w:type="spellStart"/>
+      <w:r>
+        <w:t>ke</w:t>
+      </w:r>
+      <w:proofErr w:type="spellEnd"/>
+      <w:r>
+        <w:t xml:space="preserve"> </w:t>
+      </w:r>
+      <w:proofErr w:type="spellStart"/>
+      <w:r>
+        <w:t>saath</w:t>
+      </w:r>
+      <w:proofErr w:type="spellEnd"/>
+      <w:r>
+        <w:t xml:space="preserve"> </w:t>
+      </w:r>
+      <w:proofErr w:type="spellStart"/>
+      <w:r>
+        <w:t>kahani</w:t>
+      </w:r>
+      <w:proofErr w:type="spellEnd"/>
+      <w:r>
+        <w:t xml:space="preserve"> </w:t>
+      </w:r>
+      <w:proofErr w:type="spellStart"/>
+      <w:r>
+        <w:t>thodi</w:t>
+      </w:r>
+      <w:proofErr w:type="spellEnd"/>
+      <w:r>
+        <w:t xml:space="preserve"> </w:t>
+      </w:r>
+      <w:proofErr w:type="spellStart"/>
+      <w:r>
+        <w:t>alag</w:t>
+      </w:r>
+      <w:proofErr w:type="spellEnd"/>
+      <w:r>
+        <w:t xml:space="preserve"> aur interesting </w:t>
+      </w:r>
+      <w:proofErr w:type="spellStart"/>
+      <w:r>
+        <w:t>hai</w:t>
+      </w:r>
+      <w:proofErr w:type="spellEnd"/>
+      <w:r>
+        <w:t>:</w:t>
+      </w:r>
+    </w:p>
+    <w:p>
+      <w:pPr>
+        <w:numPr>
+          <w:ilvl w:val="0"/>
+          <w:numId w:val="10"/>
+        </w:numPr>
+      </w:pPr>
+      <w:r>
+        <w:t xml:space="preserve">Jab </w:t>
+      </w:r>
+      <w:proofErr w:type="spellStart"/>
+      <w:r>
+        <w:t>aap</w:t>
+      </w:r>
+      <w:proofErr w:type="spellEnd"/>
+      <w:r>
+        <w:t xml:space="preserve"> koi </w:t>
+      </w:r>
+      <w:r>
+        <w:rPr>
+          <w:b/>
+          <w:bCs/>
+        </w:rPr>
+        <w:t>Proper Function Declaration</w:t>
+      </w:r>
+      <w:r>
+        <w:t xml:space="preserve"> (</w:t>
+      </w:r>
+      <w:proofErr w:type="spellStart"/>
+      <w:r>
+        <w:t>jaise</w:t>
+      </w:r>
+      <w:proofErr w:type="spellEnd"/>
+      <w:r>
+        <w:t xml:space="preserve"> function </w:t>
+      </w:r>
+      <w:proofErr w:type="spellStart"/>
+      <w:proofErr w:type="gramStart"/>
+      <w:r>
+        <w:t>getName</w:t>
+      </w:r>
+      <w:proofErr w:type="spellEnd"/>
+      <w:r>
+        <w:t>(</w:t>
+      </w:r>
+      <w:proofErr w:type="gramEnd"/>
+      <w:r>
+        <w:t xml:space="preserve">) </w:t>
+      </w:r>
+      <w:proofErr w:type="gramStart"/>
+      <w:r>
+        <w:t>{ ...</w:t>
+      </w:r>
+      <w:proofErr w:type="gramEnd"/>
+      <w:r>
+        <w:t xml:space="preserve"> }) </w:t>
+      </w:r>
+      <w:proofErr w:type="spellStart"/>
+      <w:r>
+        <w:t>banate</w:t>
+      </w:r>
+      <w:proofErr w:type="spellEnd"/>
+      <w:r>
+        <w:t xml:space="preserve"> </w:t>
+      </w:r>
+      <w:proofErr w:type="spellStart"/>
+      <w:r>
+        <w:t>ho</w:t>
+      </w:r>
+      <w:proofErr w:type="spellEnd"/>
+      <w:r>
+        <w:t xml:space="preserve">, </w:t>
+      </w:r>
+      <w:proofErr w:type="spellStart"/>
+      <w:r>
+        <w:t>toh</w:t>
+      </w:r>
+      <w:proofErr w:type="spellEnd"/>
+      <w:r>
+        <w:t xml:space="preserve"> Memory Creation phase </w:t>
+      </w:r>
+      <w:proofErr w:type="spellStart"/>
+      <w:r>
+        <w:t>mein</w:t>
+      </w:r>
+      <w:proofErr w:type="spellEnd"/>
+      <w:r>
+        <w:t xml:space="preserve"> JS engine </w:t>
+      </w:r>
+      <w:proofErr w:type="spellStart"/>
+      <w:r>
+        <w:t>poore</w:t>
+      </w:r>
+      <w:proofErr w:type="spellEnd"/>
+      <w:r>
+        <w:t xml:space="preserve"> </w:t>
+      </w:r>
+      <w:proofErr w:type="spellStart"/>
+      <w:r>
+        <w:t>ke</w:t>
+      </w:r>
+      <w:proofErr w:type="spellEnd"/>
+      <w:r>
+        <w:t xml:space="preserve"> </w:t>
+      </w:r>
+      <w:proofErr w:type="spellStart"/>
+      <w:r>
+        <w:t>poore</w:t>
+      </w:r>
+      <w:proofErr w:type="spellEnd"/>
+      <w:r>
+        <w:t xml:space="preserve"> function ka code memory </w:t>
+      </w:r>
+      <w:proofErr w:type="spellStart"/>
+      <w:r>
+        <w:t>mein</w:t>
+      </w:r>
+      <w:proofErr w:type="spellEnd"/>
+      <w:r>
+        <w:t xml:space="preserve"> copy </w:t>
+      </w:r>
+      <w:proofErr w:type="spellStart"/>
+      <w:r>
+        <w:t>kar</w:t>
+      </w:r>
+      <w:proofErr w:type="spellEnd"/>
+      <w:r>
+        <w:t xml:space="preserve"> </w:t>
+      </w:r>
+      <w:proofErr w:type="spellStart"/>
+      <w:r>
+        <w:t>leta</w:t>
+      </w:r>
+      <w:proofErr w:type="spellEnd"/>
+      <w:r>
+        <w:t xml:space="preserve"> </w:t>
+      </w:r>
+      <w:proofErr w:type="spellStart"/>
+      <w:r>
+        <w:t>hai</w:t>
+      </w:r>
+      <w:proofErr w:type="spellEnd"/>
+      <w:r>
+        <w:t>.</w:t>
+      </w:r>
+    </w:p>
+    <w:p>
+      <w:pPr>
+        <w:numPr>
+          <w:ilvl w:val="0"/>
+          <w:numId w:val="10"/>
+        </w:numPr>
+      </w:pPr>
+      <w:r>
+        <w:lastRenderedPageBreak/>
+        <w:t xml:space="preserve">Iska </w:t>
+      </w:r>
+      <w:proofErr w:type="spellStart"/>
+      <w:r>
+        <w:t>fayda</w:t>
+      </w:r>
+      <w:proofErr w:type="spellEnd"/>
+      <w:r>
+        <w:t xml:space="preserve"> ye </w:t>
+      </w:r>
+      <w:proofErr w:type="spellStart"/>
+      <w:r>
+        <w:t>hai</w:t>
+      </w:r>
+      <w:proofErr w:type="spellEnd"/>
+      <w:r>
+        <w:t xml:space="preserve"> ki </w:t>
+      </w:r>
+      <w:proofErr w:type="spellStart"/>
+      <w:r>
+        <w:t>aap</w:t>
+      </w:r>
+      <w:proofErr w:type="spellEnd"/>
+      <w:r>
+        <w:t xml:space="preserve"> function ko </w:t>
+      </w:r>
+      <w:proofErr w:type="spellStart"/>
+      <w:r>
+        <w:t>uski</w:t>
+      </w:r>
+      <w:proofErr w:type="spellEnd"/>
+      <w:r>
+        <w:t xml:space="preserve"> definition se </w:t>
+      </w:r>
+      <w:proofErr w:type="spellStart"/>
+      <w:r>
+        <w:t>pehle</w:t>
+      </w:r>
+      <w:proofErr w:type="spellEnd"/>
+      <w:r>
+        <w:t xml:space="preserve"> </w:t>
+      </w:r>
+      <w:proofErr w:type="spellStart"/>
+      <w:r>
+        <w:t>bhi</w:t>
+      </w:r>
+      <w:proofErr w:type="spellEnd"/>
+      <w:r>
+        <w:t xml:space="preserve"> call </w:t>
+      </w:r>
+      <w:proofErr w:type="spellStart"/>
+      <w:r>
+        <w:t>kar</w:t>
+      </w:r>
+      <w:proofErr w:type="spellEnd"/>
+      <w:r>
+        <w:t xml:space="preserve"> </w:t>
+      </w:r>
+      <w:proofErr w:type="spellStart"/>
+      <w:r>
+        <w:t>sakte</w:t>
+      </w:r>
+      <w:proofErr w:type="spellEnd"/>
+      <w:r>
+        <w:t xml:space="preserve"> </w:t>
+      </w:r>
+      <w:proofErr w:type="spellStart"/>
+      <w:r>
+        <w:t>ho</w:t>
+      </w:r>
+      <w:proofErr w:type="spellEnd"/>
+      <w:r>
+        <w:t xml:space="preserve">, aur wo perfectly </w:t>
+      </w:r>
+      <w:proofErr w:type="spellStart"/>
+      <w:r>
+        <w:t>kaam</w:t>
+      </w:r>
+      <w:proofErr w:type="spellEnd"/>
+      <w:r>
+        <w:t xml:space="preserve"> </w:t>
+      </w:r>
+      <w:proofErr w:type="spellStart"/>
+      <w:r>
+        <w:t>karega</w:t>
+      </w:r>
+      <w:proofErr w:type="spellEnd"/>
+      <w:r>
+        <w:t>.</w:t>
+      </w:r>
+    </w:p>
+    <w:p>
+      <w:pPr>
+        <w:rPr>
+          <w:b/>
+          <w:bCs/>
+        </w:rPr>
+      </w:pPr>
+      <w:r>
+        <w:t xml:space="preserve">                        </w:t>
+      </w:r>
+      <w:r>
+        <w:drawing>
+          <wp:inline distT="0" distB="0" distL="0" distR="0" wp14:anchorId="11CAB85A" wp14:editId="290EFFA2">
+            <wp:extent cx="3905795" cy="3924848"/>
+            <wp:effectExtent l="0" t="0" r="0" b="0"/>
+            <wp:docPr id="1466919589" name="Picture 1"/>
+            <wp:cNvGraphicFramePr>
+              <a:graphicFrameLocks xmlns:a="http://schemas.openxmlformats.org/drawingml/2006/main" noChangeAspect="1"/>
+            </wp:cNvGraphicFramePr>
+            <a:graphic xmlns:a="http://schemas.openxmlformats.org/drawingml/2006/main">
+              <a:graphicData uri="http://schemas.openxmlformats.org/drawingml/2006/picture">
+                <pic:pic xmlns:pic="http://schemas.openxmlformats.org/drawingml/2006/picture">
+                  <pic:nvPicPr>
+                    <pic:cNvPr id="1466919589" name=""/>
+                    <pic:cNvPicPr/>
+                  </pic:nvPicPr>
+                  <pic:blipFill>
+                    <a:blip r:embed="rId17"/>
+                    <a:stretch>
+                      <a:fillRect/>
+                    </a:stretch>
+                  </pic:blipFill>
+                  <pic:spPr>
+                    <a:xfrm>
+                      <a:off x="0" y="0"/>
+                      <a:ext cx="3905795" cy="3924848"/>
+                    </a:xfrm>
+                    <a:prstGeom prst="rect">
+                      <a:avLst/>
+                    </a:prstGeom>
+                  </pic:spPr>
+                </pic:pic>
+              </a:graphicData>
+            </a:graphic>
+          </wp:inline>
+        </w:drawing>
+      </w:r>
+      <w:r>
+        <w:pict w14:anchorId="247D7F41">
+          <v:rect id="_x0000_i1064" style="width:0;height:1.5pt" o:hralign="center" o:hrstd="t" o:hr="t" fillcolor="#a0a0a0" stroked="f"/>
+        </w:pict>
+      </w:r>
+      <w:r>
+        <w:rPr>
+          <w:b/>
+          <w:bCs/>
+        </w:rPr>
+        <w:t>4. Arrow Functions aur Function Expressions ka Twist</w:t>
+      </w:r>
+    </w:p>
+    <w:p>
+      <w:r>
+        <w:t xml:space="preserve">Ye point </w:t>
+      </w:r>
+      <w:proofErr w:type="spellStart"/>
+      <w:r>
+        <w:t>bohot</w:t>
+      </w:r>
+      <w:proofErr w:type="spellEnd"/>
+      <w:r>
+        <w:t xml:space="preserve"> </w:t>
+      </w:r>
+      <w:proofErr w:type="spellStart"/>
+      <w:r>
+        <w:t>zaroori</w:t>
+      </w:r>
+      <w:proofErr w:type="spellEnd"/>
+      <w:r>
+        <w:t xml:space="preserve"> </w:t>
+      </w:r>
+      <w:proofErr w:type="spellStart"/>
+      <w:r>
+        <w:t>hai</w:t>
+      </w:r>
+      <w:proofErr w:type="spellEnd"/>
+      <w:r>
+        <w:t xml:space="preserve"> </w:t>
+      </w:r>
+      <w:proofErr w:type="spellStart"/>
+      <w:r>
+        <w:t>kyunki</w:t>
+      </w:r>
+      <w:proofErr w:type="spellEnd"/>
+      <w:r>
+        <w:t xml:space="preserve"> interview </w:t>
+      </w:r>
+      <w:proofErr w:type="spellStart"/>
+      <w:r>
+        <w:t>mein</w:t>
+      </w:r>
+      <w:proofErr w:type="spellEnd"/>
+      <w:r>
+        <w:t xml:space="preserve"> </w:t>
+      </w:r>
+      <w:proofErr w:type="spellStart"/>
+      <w:r>
+        <w:t>yahi</w:t>
+      </w:r>
+      <w:proofErr w:type="spellEnd"/>
+      <w:r>
+        <w:t xml:space="preserve"> </w:t>
+      </w:r>
+      <w:proofErr w:type="spellStart"/>
+      <w:r>
+        <w:t>pucha</w:t>
+      </w:r>
+      <w:proofErr w:type="spellEnd"/>
+      <w:r>
+        <w:t xml:space="preserve"> </w:t>
+      </w:r>
+      <w:proofErr w:type="spellStart"/>
+      <w:r>
+        <w:t>jata</w:t>
+      </w:r>
+      <w:proofErr w:type="spellEnd"/>
+      <w:r>
+        <w:t xml:space="preserve"> </w:t>
+      </w:r>
+      <w:proofErr w:type="spellStart"/>
+      <w:r>
+        <w:t>hai</w:t>
+      </w:r>
+      <w:proofErr w:type="spellEnd"/>
+      <w:r>
+        <w:t>:</w:t>
+      </w:r>
+    </w:p>
+    <w:p>
+      <w:pPr>
+        <w:numPr>
+          <w:ilvl w:val="0"/>
+          <w:numId w:val="11"/>
+        </w:numPr>
+      </w:pPr>
+      <w:r>
+        <w:t xml:space="preserve">Agar </w:t>
+      </w:r>
+      <w:proofErr w:type="spellStart"/>
+      <w:r>
+        <w:t>aapne</w:t>
+      </w:r>
+      <w:proofErr w:type="spellEnd"/>
+      <w:r>
+        <w:t xml:space="preserve"> function ko </w:t>
+      </w:r>
+      <w:r>
+        <w:rPr>
+          <w:b/>
+          <w:bCs/>
+        </w:rPr>
+        <w:t>Arrow Function</w:t>
+      </w:r>
+      <w:r>
+        <w:t xml:space="preserve"> (var </w:t>
+      </w:r>
+      <w:proofErr w:type="spellStart"/>
+      <w:r>
+        <w:t>getName</w:t>
+      </w:r>
+      <w:proofErr w:type="spellEnd"/>
+      <w:r>
+        <w:t xml:space="preserve"> = () =&gt; </w:t>
+      </w:r>
+      <w:proofErr w:type="gramStart"/>
+      <w:r>
+        <w:t>{ ...</w:t>
+      </w:r>
+      <w:proofErr w:type="gramEnd"/>
+      <w:r>
+        <w:t xml:space="preserve"> }) </w:t>
+      </w:r>
+      <w:proofErr w:type="spellStart"/>
+      <w:r>
+        <w:t>ya</w:t>
+      </w:r>
+      <w:proofErr w:type="spellEnd"/>
+      <w:r>
+        <w:t xml:space="preserve"> </w:t>
+      </w:r>
+      <w:r>
+        <w:rPr>
+          <w:b/>
+          <w:bCs/>
+        </w:rPr>
+        <w:t>Function Expression</w:t>
+      </w:r>
+      <w:r>
+        <w:t xml:space="preserve"> (var </w:t>
+      </w:r>
+      <w:proofErr w:type="spellStart"/>
+      <w:r>
+        <w:t>getName</w:t>
+      </w:r>
+      <w:proofErr w:type="spellEnd"/>
+      <w:r>
+        <w:t xml:space="preserve"> = </w:t>
+      </w:r>
+      <w:proofErr w:type="gramStart"/>
+      <w:r>
+        <w:t>function(</w:t>
+      </w:r>
+      <w:proofErr w:type="gramEnd"/>
+      <w:r>
+        <w:t xml:space="preserve">) </w:t>
+      </w:r>
+      <w:proofErr w:type="gramStart"/>
+      <w:r>
+        <w:t>{ ...</w:t>
+      </w:r>
+      <w:proofErr w:type="gramEnd"/>
+      <w:r>
+        <w:t xml:space="preserve"> }) ki </w:t>
+      </w:r>
+      <w:proofErr w:type="spellStart"/>
+      <w:r>
+        <w:t>tarah</w:t>
+      </w:r>
+      <w:proofErr w:type="spellEnd"/>
+      <w:r>
+        <w:t xml:space="preserve"> </w:t>
+      </w:r>
+      <w:proofErr w:type="spellStart"/>
+      <w:r>
+        <w:t>likha</w:t>
+      </w:r>
+      <w:proofErr w:type="spellEnd"/>
+      <w:r>
+        <w:t xml:space="preserve"> </w:t>
+      </w:r>
+      <w:proofErr w:type="spellStart"/>
+      <w:r>
+        <w:t>hai</w:t>
+      </w:r>
+      <w:proofErr w:type="spellEnd"/>
+      <w:r>
+        <w:t xml:space="preserve">, </w:t>
+      </w:r>
+      <w:proofErr w:type="spellStart"/>
+      <w:r>
+        <w:t>toh</w:t>
+      </w:r>
+      <w:proofErr w:type="spellEnd"/>
+      <w:r>
+        <w:t xml:space="preserve"> wo </w:t>
+      </w:r>
+      <w:r>
+        <w:rPr>
+          <w:b/>
+          <w:bCs/>
+        </w:rPr>
+        <w:t>Variable</w:t>
+      </w:r>
+      <w:r>
+        <w:t xml:space="preserve"> ki </w:t>
+      </w:r>
+      <w:proofErr w:type="spellStart"/>
+      <w:r>
+        <w:t>tarah</w:t>
+      </w:r>
+      <w:proofErr w:type="spellEnd"/>
+      <w:r>
+        <w:t xml:space="preserve"> treat </w:t>
+      </w:r>
+      <w:proofErr w:type="spellStart"/>
+      <w:r>
+        <w:t>hoga</w:t>
+      </w:r>
+      <w:proofErr w:type="spellEnd"/>
+      <w:r>
+        <w:t>.</w:t>
+      </w:r>
+    </w:p>
+    <w:p>
+      <w:pPr>
+        <w:numPr>
+          <w:ilvl w:val="0"/>
+          <w:numId w:val="11"/>
+        </w:numPr>
+      </w:pPr>
+      <w:r>
+        <w:t xml:space="preserve">Memory phase </w:t>
+      </w:r>
+      <w:proofErr w:type="spellStart"/>
+      <w:r>
+        <w:t>mein</w:t>
+      </w:r>
+      <w:proofErr w:type="spellEnd"/>
+      <w:r>
+        <w:t xml:space="preserve"> </w:t>
+      </w:r>
+      <w:proofErr w:type="spellStart"/>
+      <w:r>
+        <w:t>ise</w:t>
+      </w:r>
+      <w:proofErr w:type="spellEnd"/>
+      <w:r>
+        <w:t xml:space="preserve"> </w:t>
+      </w:r>
+      <w:proofErr w:type="spellStart"/>
+      <w:r>
+        <w:t>bhi</w:t>
+      </w:r>
+      <w:proofErr w:type="spellEnd"/>
+      <w:r>
+        <w:t xml:space="preserve"> undefined </w:t>
+      </w:r>
+      <w:proofErr w:type="spellStart"/>
+      <w:r>
+        <w:t>milega</w:t>
+      </w:r>
+      <w:proofErr w:type="spellEnd"/>
+      <w:r>
+        <w:t>.</w:t>
+      </w:r>
+    </w:p>
+    <w:p>
+      <w:pPr>
+        <w:numPr>
+          <w:ilvl w:val="0"/>
+          <w:numId w:val="11"/>
+        </w:numPr>
+      </w:pPr>
+      <w:r>
+        <w:t xml:space="preserve">Isiliye agar </w:t>
+      </w:r>
+      <w:proofErr w:type="spellStart"/>
+      <w:r>
+        <w:t>aap</w:t>
+      </w:r>
+      <w:proofErr w:type="spellEnd"/>
+      <w:r>
+        <w:t xml:space="preserve"> </w:t>
+      </w:r>
+      <w:proofErr w:type="spellStart"/>
+      <w:r>
+        <w:t>ise</w:t>
+      </w:r>
+      <w:proofErr w:type="spellEnd"/>
+      <w:r>
+        <w:t xml:space="preserve"> call </w:t>
+      </w:r>
+      <w:proofErr w:type="spellStart"/>
+      <w:r>
+        <w:t>karne</w:t>
+      </w:r>
+      <w:proofErr w:type="spellEnd"/>
+      <w:r>
+        <w:t xml:space="preserve"> ki </w:t>
+      </w:r>
+      <w:proofErr w:type="spellStart"/>
+      <w:r>
+        <w:t>koshish</w:t>
+      </w:r>
+      <w:proofErr w:type="spellEnd"/>
+      <w:r>
+        <w:t xml:space="preserve"> </w:t>
+      </w:r>
+      <w:proofErr w:type="spellStart"/>
+      <w:r>
+        <w:t>karoge</w:t>
+      </w:r>
+      <w:proofErr w:type="spellEnd"/>
+      <w:r>
+        <w:t xml:space="preserve"> code </w:t>
+      </w:r>
+      <w:proofErr w:type="spellStart"/>
+      <w:r>
+        <w:t>ke</w:t>
+      </w:r>
+      <w:proofErr w:type="spellEnd"/>
+      <w:r>
+        <w:t xml:space="preserve"> </w:t>
+      </w:r>
+      <w:proofErr w:type="spellStart"/>
+      <w:r>
+        <w:t>shuru</w:t>
+      </w:r>
+      <w:proofErr w:type="spellEnd"/>
+      <w:r>
+        <w:t xml:space="preserve"> </w:t>
+      </w:r>
+      <w:proofErr w:type="spellStart"/>
+      <w:r>
+        <w:t>mein</w:t>
+      </w:r>
+      <w:proofErr w:type="spellEnd"/>
+      <w:r>
+        <w:t xml:space="preserve">, </w:t>
+      </w:r>
+      <w:proofErr w:type="spellStart"/>
+      <w:r>
+        <w:t>toh</w:t>
+      </w:r>
+      <w:proofErr w:type="spellEnd"/>
+      <w:r>
+        <w:t xml:space="preserve"> error </w:t>
+      </w:r>
+      <w:proofErr w:type="spellStart"/>
+      <w:r>
+        <w:t>aayega</w:t>
+      </w:r>
+      <w:proofErr w:type="spellEnd"/>
+      <w:r>
+        <w:t xml:space="preserve">: </w:t>
+      </w:r>
+      <w:r>
+        <w:rPr>
+          <w:i/>
+          <w:iCs/>
+        </w:rPr>
+        <w:t>"</w:t>
+      </w:r>
+      <w:proofErr w:type="spellStart"/>
+      <w:r>
+        <w:rPr>
+          <w:i/>
+          <w:iCs/>
+        </w:rPr>
+        <w:t>getName</w:t>
+      </w:r>
+      <w:proofErr w:type="spellEnd"/>
+      <w:r>
+        <w:rPr>
+          <w:i/>
+          <w:iCs/>
+        </w:rPr>
+        <w:t xml:space="preserve"> is not a function"</w:t>
+      </w:r>
+      <w:r>
+        <w:t xml:space="preserve">, </w:t>
+      </w:r>
+      <w:proofErr w:type="spellStart"/>
+      <w:r>
+        <w:t>kyunki</w:t>
+      </w:r>
+      <w:proofErr w:type="spellEnd"/>
+      <w:r>
+        <w:t xml:space="preserve"> us </w:t>
+      </w:r>
+      <w:proofErr w:type="spellStart"/>
+      <w:r>
+        <w:t>waqt</w:t>
+      </w:r>
+      <w:proofErr w:type="spellEnd"/>
+      <w:r>
+        <w:t xml:space="preserve"> </w:t>
+      </w:r>
+      <w:proofErr w:type="spellStart"/>
+      <w:r>
+        <w:t>uski</w:t>
+      </w:r>
+      <w:proofErr w:type="spellEnd"/>
+      <w:r>
+        <w:t xml:space="preserve"> value </w:t>
+      </w:r>
+      <w:proofErr w:type="spellStart"/>
+      <w:r>
+        <w:t>sirf</w:t>
+      </w:r>
+      <w:proofErr w:type="spellEnd"/>
+      <w:r>
+        <w:t xml:space="preserve"> undefined </w:t>
+      </w:r>
+      <w:proofErr w:type="spellStart"/>
+      <w:r>
+        <w:t>hai</w:t>
+      </w:r>
+      <w:proofErr w:type="spellEnd"/>
+      <w:r>
+        <w:t>.</w:t>
+      </w:r>
+    </w:p>
+    <w:p>
+      <w:pPr>
+        <w:rPr>
+          <w:b/>
+          <w:bCs/>
+        </w:rPr>
+      </w:pPr>
+      <w:r>
+        <w:lastRenderedPageBreak/>
+        <w:drawing>
+          <wp:inline distT="0" distB="0" distL="0" distR="0" wp14:anchorId="6587CB45" wp14:editId="26D06371">
+            <wp:extent cx="5731510" cy="4023360"/>
+            <wp:effectExtent l="0" t="0" r="2540" b="0"/>
+            <wp:docPr id="1138878482" name="Picture 1"/>
+            <wp:cNvGraphicFramePr>
+              <a:graphicFrameLocks xmlns:a="http://schemas.openxmlformats.org/drawingml/2006/main" noChangeAspect="1"/>
+            </wp:cNvGraphicFramePr>
+            <a:graphic xmlns:a="http://schemas.openxmlformats.org/drawingml/2006/main">
+              <a:graphicData uri="http://schemas.openxmlformats.org/drawingml/2006/picture">
+                <pic:pic xmlns:pic="http://schemas.openxmlformats.org/drawingml/2006/picture">
+                  <pic:nvPicPr>
+                    <pic:cNvPr id="1138878482" name=""/>
+                    <pic:cNvPicPr/>
+                  </pic:nvPicPr>
+                  <pic:blipFill>
+                    <a:blip r:embed="rId18"/>
+                    <a:stretch>
+                      <a:fillRect/>
+                    </a:stretch>
+                  </pic:blipFill>
+                  <pic:spPr>
+                    <a:xfrm>
+                      <a:off x="0" y="0"/>
+                      <a:ext cx="5731510" cy="4023360"/>
+                    </a:xfrm>
+                    <a:prstGeom prst="rect">
+                      <a:avLst/>
+                    </a:prstGeom>
+                  </pic:spPr>
+                </pic:pic>
+              </a:graphicData>
+            </a:graphic>
+          </wp:inline>
+        </w:drawing>
+      </w:r>
+      <w:r>
+        <w:pict w14:anchorId="59429A3F">
+          <v:rect id="_x0000_i1065" style="width:0;height:1.5pt" o:hralign="center" o:hrstd="t" o:hr="t" fillcolor="#a0a0a0" stroked="f"/>
+        </w:pict>
+      </w:r>
+      <w:r>
+        <w:rPr>
+          <w:b/>
+          <w:bCs/>
+        </w:rPr>
+        <w:t>5. Undefined vs Not Defined</w:t>
+      </w:r>
+    </w:p>
+    <w:p>
+      <w:r>
+        <w:t xml:space="preserve">Akshay ne in </w:t>
+      </w:r>
+      <w:proofErr w:type="spellStart"/>
+      <w:r>
+        <w:t>dono</w:t>
+      </w:r>
+      <w:proofErr w:type="spellEnd"/>
+      <w:r>
+        <w:t xml:space="preserve"> </w:t>
+      </w:r>
+      <w:proofErr w:type="spellStart"/>
+      <w:r>
+        <w:t>ke</w:t>
+      </w:r>
+      <w:proofErr w:type="spellEnd"/>
+      <w:r>
+        <w:t xml:space="preserve"> beech ka </w:t>
+      </w:r>
+      <w:proofErr w:type="spellStart"/>
+      <w:r>
+        <w:t>antar</w:t>
+      </w:r>
+      <w:proofErr w:type="spellEnd"/>
+      <w:r>
+        <w:t xml:space="preserve"> bahut </w:t>
+      </w:r>
+      <w:proofErr w:type="spellStart"/>
+      <w:r>
+        <w:t>saaf</w:t>
+      </w:r>
+      <w:proofErr w:type="spellEnd"/>
+      <w:r>
+        <w:t xml:space="preserve"> </w:t>
+      </w:r>
+      <w:proofErr w:type="spellStart"/>
+      <w:r>
+        <w:t>kiya</w:t>
+      </w:r>
+      <w:proofErr w:type="spellEnd"/>
+      <w:r>
+        <w:t xml:space="preserve"> </w:t>
+      </w:r>
+      <w:proofErr w:type="spellStart"/>
+      <w:r>
+        <w:t>hai</w:t>
+      </w:r>
+      <w:proofErr w:type="spellEnd"/>
+      <w:r>
+        <w:t>:</w:t>
+      </w:r>
+    </w:p>
+    <w:p>
+      <w:pPr>
+        <w:numPr>
+          <w:ilvl w:val="0"/>
+          <w:numId w:val="12"/>
+        </w:numPr>
+      </w:pPr>
+      <w:r>
+        <w:rPr>
+          <w:b/>
+          <w:bCs/>
+        </w:rPr>
+        <w:t>Undefined:</w:t>
+      </w:r>
+      <w:r>
+        <w:t xml:space="preserve"> Iska </w:t>
+      </w:r>
+      <w:proofErr w:type="spellStart"/>
+      <w:r>
+        <w:t>matlab</w:t>
+      </w:r>
+      <w:proofErr w:type="spellEnd"/>
+      <w:r>
+        <w:t xml:space="preserve"> </w:t>
+      </w:r>
+      <w:proofErr w:type="spellStart"/>
+      <w:r>
+        <w:t>hai</w:t>
+      </w:r>
+      <w:proofErr w:type="spellEnd"/>
+      <w:r>
+        <w:t xml:space="preserve"> ki variable ko memory mil </w:t>
+      </w:r>
+      <w:proofErr w:type="spellStart"/>
+      <w:r>
+        <w:t>chuki</w:t>
+      </w:r>
+      <w:proofErr w:type="spellEnd"/>
+      <w:r>
+        <w:t xml:space="preserve"> </w:t>
+      </w:r>
+      <w:proofErr w:type="spellStart"/>
+      <w:r>
+        <w:t>hai</w:t>
+      </w:r>
+      <w:proofErr w:type="spellEnd"/>
+      <w:r>
+        <w:t xml:space="preserve"> (space reserve </w:t>
+      </w:r>
+      <w:proofErr w:type="spellStart"/>
+      <w:r>
+        <w:t>ho</w:t>
+      </w:r>
+      <w:proofErr w:type="spellEnd"/>
+      <w:r>
+        <w:t xml:space="preserve"> </w:t>
+      </w:r>
+      <w:proofErr w:type="spellStart"/>
+      <w:r>
+        <w:t>gayi</w:t>
+      </w:r>
+      <w:proofErr w:type="spellEnd"/>
+      <w:r>
+        <w:t xml:space="preserve"> </w:t>
+      </w:r>
+      <w:proofErr w:type="spellStart"/>
+      <w:r>
+        <w:t>hai</w:t>
+      </w:r>
+      <w:proofErr w:type="spellEnd"/>
+      <w:r>
+        <w:t xml:space="preserve">), </w:t>
+      </w:r>
+      <w:proofErr w:type="spellStart"/>
+      <w:r>
+        <w:t>lekin</w:t>
+      </w:r>
+      <w:proofErr w:type="spellEnd"/>
+      <w:r>
+        <w:t xml:space="preserve"> </w:t>
+      </w:r>
+      <w:proofErr w:type="spellStart"/>
+      <w:r>
+        <w:t>abhi</w:t>
+      </w:r>
+      <w:proofErr w:type="spellEnd"/>
+      <w:r>
+        <w:t xml:space="preserve"> </w:t>
+      </w:r>
+      <w:proofErr w:type="spellStart"/>
+      <w:r>
+        <w:t>tak</w:t>
+      </w:r>
+      <w:proofErr w:type="spellEnd"/>
+      <w:r>
+        <w:t xml:space="preserve"> </w:t>
+      </w:r>
+      <w:proofErr w:type="spellStart"/>
+      <w:r>
+        <w:t>usme</w:t>
+      </w:r>
+      <w:proofErr w:type="spellEnd"/>
+      <w:r>
+        <w:t xml:space="preserve"> koi value </w:t>
+      </w:r>
+      <w:proofErr w:type="spellStart"/>
+      <w:r>
+        <w:t>nahi</w:t>
+      </w:r>
+      <w:proofErr w:type="spellEnd"/>
+      <w:r>
+        <w:t xml:space="preserve"> </w:t>
+      </w:r>
+      <w:proofErr w:type="spellStart"/>
+      <w:r>
+        <w:t>daali</w:t>
+      </w:r>
+      <w:proofErr w:type="spellEnd"/>
+      <w:r>
+        <w:t xml:space="preserve"> </w:t>
+      </w:r>
+      <w:proofErr w:type="spellStart"/>
+      <w:r>
+        <w:t>gayi</w:t>
+      </w:r>
+      <w:proofErr w:type="spellEnd"/>
+      <w:r>
+        <w:t xml:space="preserve">. Ye ek "Placeholder" ki </w:t>
+      </w:r>
+      <w:proofErr w:type="spellStart"/>
+      <w:r>
+        <w:t>tarah</w:t>
+      </w:r>
+      <w:proofErr w:type="spellEnd"/>
+      <w:r>
+        <w:t xml:space="preserve"> </w:t>
+      </w:r>
+      <w:proofErr w:type="spellStart"/>
+      <w:r>
+        <w:t>hai</w:t>
+      </w:r>
+      <w:proofErr w:type="spellEnd"/>
+      <w:r>
+        <w:t>.</w:t>
+      </w:r>
+    </w:p>
+    <w:p>
+      <w:pPr>
+        <w:numPr>
+          <w:ilvl w:val="0"/>
+          <w:numId w:val="12"/>
+        </w:numPr>
+      </w:pPr>
+      <w:r>
+        <w:rPr>
+          <w:b/>
+          <w:bCs/>
+        </w:rPr>
+        <w:t>Not Defined:</w:t>
+      </w:r>
+      <w:r>
+        <w:t xml:space="preserve"> Iska </w:t>
+      </w:r>
+      <w:proofErr w:type="spellStart"/>
+      <w:r>
+        <w:t>matlab</w:t>
+      </w:r>
+      <w:proofErr w:type="spellEnd"/>
+      <w:r>
+        <w:t xml:space="preserve"> </w:t>
+      </w:r>
+      <w:proofErr w:type="spellStart"/>
+      <w:r>
+        <w:t>hai</w:t>
+      </w:r>
+      <w:proofErr w:type="spellEnd"/>
+      <w:r>
+        <w:t xml:space="preserve"> ki variable </w:t>
+      </w:r>
+      <w:proofErr w:type="spellStart"/>
+      <w:r>
+        <w:t>poore</w:t>
+      </w:r>
+      <w:proofErr w:type="spellEnd"/>
+      <w:r>
+        <w:t xml:space="preserve"> program </w:t>
+      </w:r>
+      <w:proofErr w:type="spellStart"/>
+      <w:r>
+        <w:t>mein</w:t>
+      </w:r>
+      <w:proofErr w:type="spellEnd"/>
+      <w:r>
+        <w:t xml:space="preserve"> </w:t>
+      </w:r>
+      <w:proofErr w:type="spellStart"/>
+      <w:r>
+        <w:t>kahin</w:t>
+      </w:r>
+      <w:proofErr w:type="spellEnd"/>
+      <w:r>
+        <w:t xml:space="preserve"> </w:t>
+      </w:r>
+      <w:proofErr w:type="spellStart"/>
+      <w:r>
+        <w:t>hai</w:t>
+      </w:r>
+      <w:proofErr w:type="spellEnd"/>
+      <w:r>
+        <w:t xml:space="preserve"> hi </w:t>
+      </w:r>
+      <w:proofErr w:type="spellStart"/>
+      <w:r>
+        <w:t>nahi</w:t>
+      </w:r>
+      <w:proofErr w:type="spellEnd"/>
+      <w:r>
+        <w:t xml:space="preserve">, </w:t>
+      </w:r>
+      <w:proofErr w:type="spellStart"/>
+      <w:r>
+        <w:t>usne</w:t>
+      </w:r>
+      <w:proofErr w:type="spellEnd"/>
+      <w:r>
+        <w:t xml:space="preserve"> memory allocate hi </w:t>
+      </w:r>
+      <w:proofErr w:type="spellStart"/>
+      <w:r>
+        <w:t>nahi</w:t>
+      </w:r>
+      <w:proofErr w:type="spellEnd"/>
+      <w:r>
+        <w:t xml:space="preserve"> ki. Is case </w:t>
+      </w:r>
+      <w:proofErr w:type="spellStart"/>
+      <w:r>
+        <w:t>mein</w:t>
+      </w:r>
+      <w:proofErr w:type="spellEnd"/>
+      <w:r>
+        <w:t xml:space="preserve"> browser </w:t>
+      </w:r>
+      <w:proofErr w:type="spellStart"/>
+      <w:r>
+        <w:rPr>
+          <w:b/>
+          <w:bCs/>
+        </w:rPr>
+        <w:t>ReferenceError</w:t>
+      </w:r>
+      <w:proofErr w:type="spellEnd"/>
+      <w:r>
+        <w:t xml:space="preserve"> </w:t>
+      </w:r>
+      <w:proofErr w:type="spellStart"/>
+      <w:r>
+        <w:t>deta</w:t>
+      </w:r>
+      <w:proofErr w:type="spellEnd"/>
+      <w:r>
+        <w:t xml:space="preserve"> </w:t>
+      </w:r>
+      <w:proofErr w:type="spellStart"/>
+      <w:r>
+        <w:t>hai</w:t>
+      </w:r>
+      <w:proofErr w:type="spellEnd"/>
+      <w:r>
+        <w:t>.</w:t>
+      </w:r>
+    </w:p>
+    <w:p>
+      <w:pPr>
+        <w:rPr>
+          <w:b/>
+          <w:bCs/>
+        </w:rPr>
+      </w:pPr>
+      <w:r>
+        <w:pict w14:anchorId="6800FFD4">
+          <v:rect id="_x0000_i1066" style="width:0;height:1.5pt" o:hralign="center" o:hrstd="t" o:hr="t" fillcolor="#a0a0a0" stroked="f"/>
+        </w:pict>
+      </w:r>
+      <w:r>
+        <w:rPr>
+          <w:b/>
+          <w:bCs/>
+        </w:rPr>
+        <w:t>6. Real Demo: Call Stack in Action</w:t>
+      </w:r>
+    </w:p>
+    <w:p>
+      <w:r>
+        <w:t xml:space="preserve">Video </w:t>
+      </w:r>
+      <w:proofErr w:type="spellStart"/>
+      <w:r>
+        <w:t>ke</w:t>
+      </w:r>
+      <w:proofErr w:type="spellEnd"/>
+      <w:r>
+        <w:t xml:space="preserve"> </w:t>
+      </w:r>
+      <w:proofErr w:type="spellStart"/>
+      <w:r>
+        <w:t>aakhir</w:t>
+      </w:r>
+      <w:proofErr w:type="spellEnd"/>
+      <w:r>
+        <w:t xml:space="preserve"> </w:t>
+      </w:r>
+      <w:proofErr w:type="spellStart"/>
+      <w:r>
+        <w:t>mein</w:t>
+      </w:r>
+      <w:proofErr w:type="spellEnd"/>
+      <w:r>
+        <w:t xml:space="preserve"> Akshay ne browser </w:t>
+      </w:r>
+      <w:proofErr w:type="spellStart"/>
+      <w:r>
+        <w:t>ke</w:t>
+      </w:r>
+      <w:proofErr w:type="spellEnd"/>
+      <w:r>
+        <w:t xml:space="preserve"> "Sources" tab </w:t>
+      </w:r>
+      <w:proofErr w:type="spellStart"/>
+      <w:r>
+        <w:t>mein</w:t>
+      </w:r>
+      <w:proofErr w:type="spellEnd"/>
+      <w:r>
+        <w:t xml:space="preserve"> debugger </w:t>
+      </w:r>
+      <w:proofErr w:type="spellStart"/>
+      <w:r>
+        <w:t>laga</w:t>
+      </w:r>
+      <w:proofErr w:type="spellEnd"/>
+      <w:r>
+        <w:t xml:space="preserve"> </w:t>
+      </w:r>
+      <w:proofErr w:type="spellStart"/>
+      <w:r>
+        <w:t>kar</w:t>
+      </w:r>
+      <w:proofErr w:type="spellEnd"/>
+      <w:r>
+        <w:t xml:space="preserve"> </w:t>
+      </w:r>
+      <w:proofErr w:type="spellStart"/>
+      <w:r>
+        <w:t>dikhaya</w:t>
+      </w:r>
+      <w:proofErr w:type="spellEnd"/>
+      <w:r>
+        <w:t xml:space="preserve"> ki:</w:t>
+      </w:r>
+    </w:p>
+    <w:p>
+      <w:pPr>
+        <w:numPr>
+          <w:ilvl w:val="0"/>
+          <w:numId w:val="13"/>
+        </w:numPr>
+      </w:pPr>
+      <w:r>
+        <w:t xml:space="preserve">Kaise program </w:t>
+      </w:r>
+      <w:proofErr w:type="spellStart"/>
+      <w:r>
+        <w:t>shuru</w:t>
+      </w:r>
+      <w:proofErr w:type="spellEnd"/>
+      <w:r>
+        <w:t xml:space="preserve"> hone se </w:t>
+      </w:r>
+      <w:proofErr w:type="spellStart"/>
+      <w:r>
+        <w:t>pehle</w:t>
+      </w:r>
+      <w:proofErr w:type="spellEnd"/>
+      <w:r>
+        <w:t xml:space="preserve"> hi Global Execution Context </w:t>
+      </w:r>
+      <w:proofErr w:type="spellStart"/>
+      <w:r>
+        <w:t>banta</w:t>
+      </w:r>
+      <w:proofErr w:type="spellEnd"/>
+      <w:r>
+        <w:t xml:space="preserve"> </w:t>
+      </w:r>
+      <w:proofErr w:type="spellStart"/>
+      <w:r>
+        <w:t>hai</w:t>
+      </w:r>
+      <w:proofErr w:type="spellEnd"/>
+      <w:r>
+        <w:t>.</w:t>
+      </w:r>
+    </w:p>
+    <w:p>
+      <w:pPr>
+        <w:numPr>
+          <w:ilvl w:val="0"/>
+          <w:numId w:val="13"/>
+        </w:numPr>
+      </w:pPr>
+      <w:r>
+        <w:t xml:space="preserve">Kaise variables </w:t>
+      </w:r>
+      <w:proofErr w:type="spellStart"/>
+      <w:r>
+        <w:t>mein</w:t>
+      </w:r>
+      <w:proofErr w:type="spellEnd"/>
+      <w:r>
+        <w:t xml:space="preserve"> undefined </w:t>
+      </w:r>
+      <w:proofErr w:type="spellStart"/>
+      <w:r>
+        <w:t>pehle</w:t>
+      </w:r>
+      <w:proofErr w:type="spellEnd"/>
+      <w:r>
+        <w:t xml:space="preserve"> se </w:t>
+      </w:r>
+      <w:proofErr w:type="spellStart"/>
+      <w:r>
+        <w:t>bhara</w:t>
+      </w:r>
+      <w:proofErr w:type="spellEnd"/>
+      <w:r>
+        <w:t xml:space="preserve"> </w:t>
+      </w:r>
+      <w:proofErr w:type="spellStart"/>
+      <w:r>
+        <w:t>hota</w:t>
+      </w:r>
+      <w:proofErr w:type="spellEnd"/>
+      <w:r>
+        <w:t xml:space="preserve"> </w:t>
+      </w:r>
+      <w:proofErr w:type="spellStart"/>
+      <w:r>
+        <w:t>hai</w:t>
+      </w:r>
+      <w:proofErr w:type="spellEnd"/>
+      <w:r>
+        <w:t>.</w:t>
+      </w:r>
+    </w:p>
+    <w:p>
+      <w:pPr>
+        <w:numPr>
+          <w:ilvl w:val="0"/>
+          <w:numId w:val="13"/>
+        </w:numPr>
+      </w:pPr>
+      <w:r>
+        <w:t xml:space="preserve">Kaise function calls par </w:t>
+      </w:r>
+      <w:proofErr w:type="spellStart"/>
+      <w:r>
+        <w:t>naye</w:t>
+      </w:r>
+      <w:proofErr w:type="spellEnd"/>
+      <w:r>
+        <w:t xml:space="preserve"> Execution Contexts Call Stack </w:t>
+      </w:r>
+      <w:proofErr w:type="spellStart"/>
+      <w:r>
+        <w:t>ke</w:t>
+      </w:r>
+      <w:proofErr w:type="spellEnd"/>
+      <w:r>
+        <w:t xml:space="preserve"> </w:t>
+      </w:r>
+      <w:proofErr w:type="spellStart"/>
+      <w:r>
+        <w:t>upar</w:t>
+      </w:r>
+      <w:proofErr w:type="spellEnd"/>
+      <w:r>
+        <w:t xml:space="preserve"> </w:t>
+      </w:r>
+      <w:proofErr w:type="spellStart"/>
+      <w:r>
+        <w:t>aate</w:t>
+      </w:r>
+      <w:proofErr w:type="spellEnd"/>
+      <w:r>
+        <w:t xml:space="preserve"> hain (Push) aur khatam hone par hat </w:t>
+      </w:r>
+      <w:proofErr w:type="spellStart"/>
+      <w:r>
+        <w:t>jaate</w:t>
+      </w:r>
+      <w:proofErr w:type="spellEnd"/>
+      <w:r>
+        <w:t xml:space="preserve"> hain (Pop).</w:t>
+      </w:r>
+    </w:p>
+    <w:p>
+      <w:r>
+        <w:lastRenderedPageBreak/>
+        <w:drawing>
+          <wp:inline distT="0" distB="0" distL="0" distR="0" wp14:anchorId="685F6622" wp14:editId="671BAD8E">
+            <wp:extent cx="5731510" cy="3344545"/>
+            <wp:effectExtent l="0" t="0" r="2540" b="8255"/>
+            <wp:docPr id="1237119719" name="Picture 1"/>
+            <wp:cNvGraphicFramePr>
+              <a:graphicFrameLocks xmlns:a="http://schemas.openxmlformats.org/drawingml/2006/main" noChangeAspect="1"/>
+            </wp:cNvGraphicFramePr>
+            <a:graphic xmlns:a="http://schemas.openxmlformats.org/drawingml/2006/main">
+              <a:graphicData uri="http://schemas.openxmlformats.org/drawingml/2006/picture">
+                <pic:pic xmlns:pic="http://schemas.openxmlformats.org/drawingml/2006/picture">
+                  <pic:nvPicPr>
+                    <pic:cNvPr id="1237119719" name=""/>
+                    <pic:cNvPicPr/>
+                  </pic:nvPicPr>
+                  <pic:blipFill>
+                    <a:blip r:embed="rId19"/>
+                    <a:stretch>
+                      <a:fillRect/>
+                    </a:stretch>
+                  </pic:blipFill>
+                  <pic:spPr>
+                    <a:xfrm>
+                      <a:off x="0" y="0"/>
+                      <a:ext cx="5731510" cy="3344545"/>
+                    </a:xfrm>
+                    <a:prstGeom prst="rect">
+                      <a:avLst/>
+                    </a:prstGeom>
+                  </pic:spPr>
+                </pic:pic>
+              </a:graphicData>
+            </a:graphic>
+          </wp:inline>
+        </w:drawing>
+      </w:r>
+    </w:p>
+    <w:p>
+      <w:r>
+        <w:drawing>
+          <wp:inline distT="0" distB="0" distL="0" distR="0" wp14:anchorId="4F4852E9" wp14:editId="5DF6A2BB">
+            <wp:extent cx="2933702" cy="1828800"/>
+            <wp:effectExtent l="0" t="0" r="0" b="0"/>
+            <wp:docPr id="198124005" name="Picture 1"/>
+            <wp:cNvGraphicFramePr>
+              <a:graphicFrameLocks xmlns:a="http://schemas.openxmlformats.org/drawingml/2006/main" noChangeAspect="1"/>
+            </wp:cNvGraphicFramePr>
+            <a:graphic xmlns:a="http://schemas.openxmlformats.org/drawingml/2006/main">
+              <a:graphicData uri="http://schemas.openxmlformats.org/drawingml/2006/picture">
+                <pic:pic xmlns:pic="http://schemas.openxmlformats.org/drawingml/2006/picture">
+                  <pic:nvPicPr>
+                    <pic:cNvPr id="198124005" name=""/>
+                    <pic:cNvPicPr/>
+                  </pic:nvPicPr>
+                  <pic:blipFill>
+                    <a:blip r:embed="rId20"/>
+                    <a:stretch>
+                      <a:fillRect/>
+                    </a:stretch>
+                  </pic:blipFill>
+                  <pic:spPr>
+                    <a:xfrm>
+                      <a:off x="0" y="0"/>
+                      <a:ext cx="2982798" cy="1859405"/>
+                    </a:xfrm>
+                    <a:prstGeom prst="rect">
+                      <a:avLst/>
+                    </a:prstGeom>
+                  </pic:spPr>
+                </pic:pic>
+              </a:graphicData>
+            </a:graphic>
+          </wp:inline>
+        </w:drawing>
+      </w:r>
+      <w:r>
+        <w:t xml:space="preserve">  </w:t>
+      </w:r>
+      <w:r>
+        <w:drawing>
+          <wp:inline distT="0" distB="0" distL="0" distR="0" wp14:anchorId="38F398FA" wp14:editId="74CDF3C4">
+            <wp:extent cx="2726019" cy="1861457"/>
+            <wp:effectExtent l="0" t="0" r="0" b="5715"/>
+            <wp:docPr id="1538824199" name="Picture 1"/>
+            <wp:cNvGraphicFramePr>
+              <a:graphicFrameLocks xmlns:a="http://schemas.openxmlformats.org/drawingml/2006/main" noChangeAspect="1"/>
+            </wp:cNvGraphicFramePr>
+            <a:graphic xmlns:a="http://schemas.openxmlformats.org/drawingml/2006/main">
+              <a:graphicData uri="http://schemas.openxmlformats.org/drawingml/2006/picture">
+                <pic:pic xmlns:pic="http://schemas.openxmlformats.org/drawingml/2006/picture">
+                  <pic:nvPicPr>
+                    <pic:cNvPr id="1538824199" name=""/>
+                    <pic:cNvPicPr/>
+                  </pic:nvPicPr>
+                  <pic:blipFill>
+                    <a:blip r:embed="rId21"/>
+                    <a:stretch>
+                      <a:fillRect/>
+                    </a:stretch>
+                  </pic:blipFill>
+                  <pic:spPr>
+                    <a:xfrm>
+                      <a:off x="0" y="0"/>
+                      <a:ext cx="2739294" cy="1870522"/>
+                    </a:xfrm>
+                    <a:prstGeom prst="rect">
+                      <a:avLst/>
+                    </a:prstGeom>
+                  </pic:spPr>
+                </pic:pic>
+              </a:graphicData>
+            </a:graphic>
+          </wp:inline>
+        </w:drawing>
+      </w:r>
+      <w:r>
+        <w:pict w14:anchorId="40B136EB">
+          <v:rect id="_x0000_i1067" style="width:0;height:1.5pt" o:hralign="center" o:hrstd="t" o:hr="t" fillcolor="#a0a0a0" stroked="f"/>
+        </w:pict>
+      </w:r>
+      <w:r>
+        <w:rPr>
+          <w:b/>
+          <w:bCs/>
+        </w:rPr>
+        <w:t>Important Interview Tip:</w:t>
+      </w:r>
+      <w:r>
+        <w:t xml:space="preserve"> Jab koi </w:t>
+      </w:r>
+      <w:proofErr w:type="spellStart"/>
+      <w:r>
+        <w:t>pooche</w:t>
+      </w:r>
+      <w:proofErr w:type="spellEnd"/>
+      <w:r>
+        <w:t xml:space="preserve"> "Hoisting </w:t>
+      </w:r>
+      <w:proofErr w:type="spellStart"/>
+      <w:r>
+        <w:t>kya</w:t>
+      </w:r>
+      <w:proofErr w:type="spellEnd"/>
+      <w:r>
+        <w:t xml:space="preserve"> </w:t>
+      </w:r>
+      <w:proofErr w:type="spellStart"/>
+      <w:r>
+        <w:t>hai</w:t>
+      </w:r>
+      <w:proofErr w:type="spellEnd"/>
+      <w:r>
+        <w:t xml:space="preserve">?", </w:t>
+      </w:r>
+      <w:proofErr w:type="spellStart"/>
+      <w:r>
+        <w:t>toh</w:t>
+      </w:r>
+      <w:proofErr w:type="spellEnd"/>
+      <w:r>
+        <w:t xml:space="preserve"> ye mat </w:t>
+      </w:r>
+      <w:proofErr w:type="spellStart"/>
+      <w:r>
+        <w:t>kehna</w:t>
+      </w:r>
+      <w:proofErr w:type="spellEnd"/>
+      <w:r>
+        <w:t xml:space="preserve"> ki "JS code ko </w:t>
+      </w:r>
+      <w:proofErr w:type="spellStart"/>
+      <w:r>
+        <w:t>upar</w:t>
+      </w:r>
+      <w:proofErr w:type="spellEnd"/>
+      <w:r>
+        <w:t xml:space="preserve"> move </w:t>
+      </w:r>
+      <w:proofErr w:type="spellStart"/>
+      <w:r>
+        <w:t>kar</w:t>
+      </w:r>
+      <w:proofErr w:type="spellEnd"/>
+      <w:r>
+        <w:t xml:space="preserve"> </w:t>
+      </w:r>
+      <w:proofErr w:type="spellStart"/>
+      <w:r>
+        <w:t>deta</w:t>
+      </w:r>
+      <w:proofErr w:type="spellEnd"/>
+      <w:r>
+        <w:t xml:space="preserve"> </w:t>
+      </w:r>
+      <w:proofErr w:type="spellStart"/>
+      <w:r>
+        <w:t>hai</w:t>
+      </w:r>
+      <w:proofErr w:type="spellEnd"/>
+      <w:r>
+        <w:t xml:space="preserve">". Sahi </w:t>
+      </w:r>
+      <w:proofErr w:type="spellStart"/>
+      <w:r>
+        <w:t>jawab</w:t>
+      </w:r>
+      <w:proofErr w:type="spellEnd"/>
+      <w:r>
+        <w:t xml:space="preserve"> ye </w:t>
+      </w:r>
+      <w:proofErr w:type="spellStart"/>
+      <w:r>
+        <w:t>hai</w:t>
+      </w:r>
+      <w:proofErr w:type="spellEnd"/>
+      <w:r>
+        <w:t xml:space="preserve"> ki </w:t>
+      </w:r>
+      <w:r>
+        <w:rPr>
+          <w:b/>
+          <w:bCs/>
+        </w:rPr>
+        <w:t>Memory Creation Phase</w:t>
+      </w:r>
+      <w:r>
+        <w:t xml:space="preserve"> ki </w:t>
+      </w:r>
+      <w:proofErr w:type="spellStart"/>
+      <w:r>
+        <w:t>wajah</w:t>
+      </w:r>
+      <w:proofErr w:type="spellEnd"/>
+      <w:r>
+        <w:t xml:space="preserve"> se variables aur functions ko code execute hone se </w:t>
+      </w:r>
+      <w:proofErr w:type="spellStart"/>
+      <w:r>
+        <w:t>pehle</w:t>
+      </w:r>
+      <w:proofErr w:type="spellEnd"/>
+      <w:r>
+        <w:t xml:space="preserve"> hi memory mil jati </w:t>
+      </w:r>
+      <w:proofErr w:type="spellStart"/>
+      <w:r>
+        <w:t>hai</w:t>
+      </w:r>
+      <w:proofErr w:type="spellEnd"/>
+      <w:r>
+        <w:t xml:space="preserve">, </w:t>
+      </w:r>
+      <w:proofErr w:type="spellStart"/>
+      <w:r>
+        <w:t>isiliye</w:t>
+      </w:r>
+      <w:proofErr w:type="spellEnd"/>
+      <w:r>
+        <w:t xml:space="preserve"> hum </w:t>
+      </w:r>
+      <w:proofErr w:type="spellStart"/>
+      <w:r>
+        <w:t>unhe</w:t>
+      </w:r>
+      <w:proofErr w:type="spellEnd"/>
+      <w:r>
+        <w:t xml:space="preserve"> access </w:t>
+      </w:r>
+      <w:proofErr w:type="spellStart"/>
+      <w:r>
+        <w:t>kar</w:t>
+      </w:r>
+      <w:proofErr w:type="spellEnd"/>
+      <w:r>
+        <w:t xml:space="preserve"> </w:t>
+      </w:r>
+      <w:proofErr w:type="spellStart"/>
+      <w:r>
+        <w:t>paate</w:t>
+      </w:r>
+      <w:proofErr w:type="spellEnd"/>
+      <w:r>
+        <w:t xml:space="preserve"> hain.</w:t>
+      </w:r>
+      <w:r>
+        <w:pict w14:anchorId="09882B7B">
+          <v:rect id="_x0000_i1068" style="width:0;height:1.5pt" o:hralign="center" o:hrstd="t" o:hr="t" fillcolor="#a0a0a0" stroked="f"/>
+        </w:pict>
+      </w:r>
+    </w:p>
+    <w:p>
+      <w:pPr>
+        <w:rPr>
+          <w:b/>
+          <w:bCs/>
+          <w:sz w:val="36"/>
+          <w:szCs w:val="36"/>
+          <w:u w:val="single"/>
+        </w:rPr>
+      </w:pPr>
+      <w:r>
+        <w:rPr>
+          <w:b/>
+          <w:bCs/>
+          <w:sz w:val="36"/>
+          <w:szCs w:val="36"/>
+          <w:u w:val="single"/>
+        </w:rPr>
+        <w:t>JAVASCRIPT EXTRA NOTES (</w:t>
+      </w:r>
+      <w:r>
+        <w:rPr>
+          <w:b/>
+          <w:bCs/>
+          <w:sz w:val="36"/>
+          <w:szCs w:val="36"/>
+          <w:u w:val="single"/>
+        </w:rPr>
+        <w:t>4</w:t>
+      </w:r>
+      <w:r>
+        <w:rPr>
+          <w:b/>
+          <w:bCs/>
+          <w:sz w:val="36"/>
+          <w:szCs w:val="36"/>
+          <w:u w:val="single"/>
+        </w:rPr>
+        <w:t>)</w:t>
+      </w:r>
+    </w:p>
     <w:p/>
     <w:sectPr>
       <w:pgSz w:w="11906" w:h="16838"/>
@@ -4954,6 +7307,602 @@
     </w:lvl>
   </w:abstractNum>
   <w:abstractNum w:abstractNumId="6" w15:restartNumberingAfterBreak="0">
+    <w:nsid w:val="3DF52906"/>
+    <w:multiLevelType w:val="multilevel"/>
+    <w:tmpl w:val="F6DE3A40"/>
+    <w:lvl w:ilvl="0">
+      <w:start w:val="1"/>
+      <w:numFmt w:val="bullet"/>
+      <w:lvlText w:val=""/>
+      <w:lvlJc w:val="left"/>
+      <w:pPr>
+        <w:tabs>
+          <w:tab w:val="num" w:pos="720"/>
+        </w:tabs>
+        <w:ind w:left="720" w:hanging="360"/>
+      </w:pPr>
+      <w:rPr>
+        <w:rFonts w:ascii="Symbol" w:hAnsi="Symbol" w:hint="default"/>
+        <w:sz w:val="20"/>
+      </w:rPr>
+    </w:lvl>
+    <w:lvl w:ilvl="1" w:tentative="1">
+      <w:start w:val="1"/>
+      <w:numFmt w:val="bullet"/>
+      <w:lvlText w:val="o"/>
+      <w:lvlJc w:val="left"/>
+      <w:pPr>
+        <w:tabs>
+          <w:tab w:val="num" w:pos="1440"/>
+        </w:tabs>
+        <w:ind w:left="1440" w:hanging="360"/>
+      </w:pPr>
+      <w:rPr>
+        <w:rFonts w:ascii="Courier New" w:hAnsi="Courier New" w:hint="default"/>
+        <w:sz w:val="20"/>
+      </w:rPr>
+    </w:lvl>
+    <w:lvl w:ilvl="2" w:tentative="1">
+      <w:start w:val="1"/>
+      <w:numFmt w:val="bullet"/>
+      <w:lvlText w:val=""/>
+      <w:lvlJc w:val="left"/>
+      <w:pPr>
+        <w:tabs>
+          <w:tab w:val="num" w:pos="2160"/>
+        </w:tabs>
+        <w:ind w:left="2160" w:hanging="360"/>
+      </w:pPr>
+      <w:rPr>
+        <w:rFonts w:ascii="Wingdings" w:hAnsi="Wingdings" w:hint="default"/>
+        <w:sz w:val="20"/>
+      </w:rPr>
+    </w:lvl>
+    <w:lvl w:ilvl="3" w:tentative="1">
+      <w:start w:val="1"/>
+      <w:numFmt w:val="bullet"/>
+      <w:lvlText w:val=""/>
+      <w:lvlJc w:val="left"/>
+      <w:pPr>
+        <w:tabs>
+          <w:tab w:val="num" w:pos="2880"/>
+        </w:tabs>
+        <w:ind w:left="2880" w:hanging="360"/>
+      </w:pPr>
+      <w:rPr>
+        <w:rFonts w:ascii="Wingdings" w:hAnsi="Wingdings" w:hint="default"/>
+        <w:sz w:val="20"/>
+      </w:rPr>
+    </w:lvl>
+    <w:lvl w:ilvl="4" w:tentative="1">
+      <w:start w:val="1"/>
+      <w:numFmt w:val="bullet"/>
+      <w:lvlText w:val=""/>
+      <w:lvlJc w:val="left"/>
+      <w:pPr>
+        <w:tabs>
+          <w:tab w:val="num" w:pos="3600"/>
+        </w:tabs>
+        <w:ind w:left="3600" w:hanging="360"/>
+      </w:pPr>
+      <w:rPr>
+        <w:rFonts w:ascii="Wingdings" w:hAnsi="Wingdings" w:hint="default"/>
+        <w:sz w:val="20"/>
+      </w:rPr>
+    </w:lvl>
+    <w:lvl w:ilvl="5" w:tentative="1">
+      <w:start w:val="1"/>
+      <w:numFmt w:val="bullet"/>
+      <w:lvlText w:val=""/>
+      <w:lvlJc w:val="left"/>
+      <w:pPr>
+        <w:tabs>
+          <w:tab w:val="num" w:pos="4320"/>
+        </w:tabs>
+        <w:ind w:left="4320" w:hanging="360"/>
+      </w:pPr>
+      <w:rPr>
+        <w:rFonts w:ascii="Wingdings" w:hAnsi="Wingdings" w:hint="default"/>
+        <w:sz w:val="20"/>
+      </w:rPr>
+    </w:lvl>
+    <w:lvl w:ilvl="6" w:tentative="1">
+      <w:start w:val="1"/>
+      <w:numFmt w:val="bullet"/>
+      <w:lvlText w:val=""/>
+      <w:lvlJc w:val="left"/>
+      <w:pPr>
+        <w:tabs>
+          <w:tab w:val="num" w:pos="5040"/>
+        </w:tabs>
+        <w:ind w:left="5040" w:hanging="360"/>
+      </w:pPr>
+      <w:rPr>
+        <w:rFonts w:ascii="Wingdings" w:hAnsi="Wingdings" w:hint="default"/>
+        <w:sz w:val="20"/>
+      </w:rPr>
+    </w:lvl>
+    <w:lvl w:ilvl="7" w:tentative="1">
+      <w:start w:val="1"/>
+      <w:numFmt w:val="bullet"/>
+      <w:lvlText w:val=""/>
+      <w:lvlJc w:val="left"/>
+      <w:pPr>
+        <w:tabs>
+          <w:tab w:val="num" w:pos="5760"/>
+        </w:tabs>
+        <w:ind w:left="5760" w:hanging="360"/>
+      </w:pPr>
+      <w:rPr>
+        <w:rFonts w:ascii="Wingdings" w:hAnsi="Wingdings" w:hint="default"/>
+        <w:sz w:val="20"/>
+      </w:rPr>
+    </w:lvl>
+    <w:lvl w:ilvl="8" w:tentative="1">
+      <w:start w:val="1"/>
+      <w:numFmt w:val="bullet"/>
+      <w:lvlText w:val=""/>
+      <w:lvlJc w:val="left"/>
+      <w:pPr>
+        <w:tabs>
+          <w:tab w:val="num" w:pos="6480"/>
+        </w:tabs>
+        <w:ind w:left="6480" w:hanging="360"/>
+      </w:pPr>
+      <w:rPr>
+        <w:rFonts w:ascii="Wingdings" w:hAnsi="Wingdings" w:hint="default"/>
+        <w:sz w:val="20"/>
+      </w:rPr>
+    </w:lvl>
+  </w:abstractNum>
+  <w:abstractNum w:abstractNumId="7" w15:restartNumberingAfterBreak="0">
+    <w:nsid w:val="434454AD"/>
+    <w:multiLevelType w:val="multilevel"/>
+    <w:tmpl w:val="64EACD92"/>
+    <w:lvl w:ilvl="0">
+      <w:start w:val="1"/>
+      <w:numFmt w:val="bullet"/>
+      <w:lvlText w:val=""/>
+      <w:lvlJc w:val="left"/>
+      <w:pPr>
+        <w:tabs>
+          <w:tab w:val="num" w:pos="720"/>
+        </w:tabs>
+        <w:ind w:left="720" w:hanging="360"/>
+      </w:pPr>
+      <w:rPr>
+        <w:rFonts w:ascii="Symbol" w:hAnsi="Symbol" w:hint="default"/>
+        <w:sz w:val="20"/>
+      </w:rPr>
+    </w:lvl>
+    <w:lvl w:ilvl="1" w:tentative="1">
+      <w:start w:val="1"/>
+      <w:numFmt w:val="bullet"/>
+      <w:lvlText w:val="o"/>
+      <w:lvlJc w:val="left"/>
+      <w:pPr>
+        <w:tabs>
+          <w:tab w:val="num" w:pos="1440"/>
+        </w:tabs>
+        <w:ind w:left="1440" w:hanging="360"/>
+      </w:pPr>
+      <w:rPr>
+        <w:rFonts w:ascii="Courier New" w:hAnsi="Courier New" w:hint="default"/>
+        <w:sz w:val="20"/>
+      </w:rPr>
+    </w:lvl>
+    <w:lvl w:ilvl="2" w:tentative="1">
+      <w:start w:val="1"/>
+      <w:numFmt w:val="bullet"/>
+      <w:lvlText w:val=""/>
+      <w:lvlJc w:val="left"/>
+      <w:pPr>
+        <w:tabs>
+          <w:tab w:val="num" w:pos="2160"/>
+        </w:tabs>
+        <w:ind w:left="2160" w:hanging="360"/>
+      </w:pPr>
+      <w:rPr>
+        <w:rFonts w:ascii="Wingdings" w:hAnsi="Wingdings" w:hint="default"/>
+        <w:sz w:val="20"/>
+      </w:rPr>
+    </w:lvl>
+    <w:lvl w:ilvl="3" w:tentative="1">
+      <w:start w:val="1"/>
+      <w:numFmt w:val="bullet"/>
+      <w:lvlText w:val=""/>
+      <w:lvlJc w:val="left"/>
+      <w:pPr>
+        <w:tabs>
+          <w:tab w:val="num" w:pos="2880"/>
+        </w:tabs>
+        <w:ind w:left="2880" w:hanging="360"/>
+      </w:pPr>
+      <w:rPr>
+        <w:rFonts w:ascii="Wingdings" w:hAnsi="Wingdings" w:hint="default"/>
+        <w:sz w:val="20"/>
+      </w:rPr>
+    </w:lvl>
+    <w:lvl w:ilvl="4" w:tentative="1">
+      <w:start w:val="1"/>
+      <w:numFmt w:val="bullet"/>
+      <w:lvlText w:val=""/>
+      <w:lvlJc w:val="left"/>
+      <w:pPr>
+        <w:tabs>
+          <w:tab w:val="num" w:pos="3600"/>
+        </w:tabs>
+        <w:ind w:left="3600" w:hanging="360"/>
+      </w:pPr>
+      <w:rPr>
+        <w:rFonts w:ascii="Wingdings" w:hAnsi="Wingdings" w:hint="default"/>
+        <w:sz w:val="20"/>
+      </w:rPr>
+    </w:lvl>
+    <w:lvl w:ilvl="5" w:tentative="1">
+      <w:start w:val="1"/>
+      <w:numFmt w:val="bullet"/>
+      <w:lvlText w:val=""/>
+      <w:lvlJc w:val="left"/>
+      <w:pPr>
+        <w:tabs>
+          <w:tab w:val="num" w:pos="4320"/>
+        </w:tabs>
+        <w:ind w:left="4320" w:hanging="360"/>
+      </w:pPr>
+      <w:rPr>
+        <w:rFonts w:ascii="Wingdings" w:hAnsi="Wingdings" w:hint="default"/>
+        <w:sz w:val="20"/>
+      </w:rPr>
+    </w:lvl>
+    <w:lvl w:ilvl="6" w:tentative="1">
+      <w:start w:val="1"/>
+      <w:numFmt w:val="bullet"/>
+      <w:lvlText w:val=""/>
+      <w:lvlJc w:val="left"/>
+      <w:pPr>
+        <w:tabs>
+          <w:tab w:val="num" w:pos="5040"/>
+        </w:tabs>
+        <w:ind w:left="5040" w:hanging="360"/>
+      </w:pPr>
+      <w:rPr>
+        <w:rFonts w:ascii="Wingdings" w:hAnsi="Wingdings" w:hint="default"/>
+        <w:sz w:val="20"/>
+      </w:rPr>
+    </w:lvl>
+    <w:lvl w:ilvl="7" w:tentative="1">
+      <w:start w:val="1"/>
+      <w:numFmt w:val="bullet"/>
+      <w:lvlText w:val=""/>
+      <w:lvlJc w:val="left"/>
+      <w:pPr>
+        <w:tabs>
+          <w:tab w:val="num" w:pos="5760"/>
+        </w:tabs>
+        <w:ind w:left="5760" w:hanging="360"/>
+      </w:pPr>
+      <w:rPr>
+        <w:rFonts w:ascii="Wingdings" w:hAnsi="Wingdings" w:hint="default"/>
+        <w:sz w:val="20"/>
+      </w:rPr>
+    </w:lvl>
+    <w:lvl w:ilvl="8" w:tentative="1">
+      <w:start w:val="1"/>
+      <w:numFmt w:val="bullet"/>
+      <w:lvlText w:val=""/>
+      <w:lvlJc w:val="left"/>
+      <w:pPr>
+        <w:tabs>
+          <w:tab w:val="num" w:pos="6480"/>
+        </w:tabs>
+        <w:ind w:left="6480" w:hanging="360"/>
+      </w:pPr>
+      <w:rPr>
+        <w:rFonts w:ascii="Wingdings" w:hAnsi="Wingdings" w:hint="default"/>
+        <w:sz w:val="20"/>
+      </w:rPr>
+    </w:lvl>
+  </w:abstractNum>
+  <w:abstractNum w:abstractNumId="8" w15:restartNumberingAfterBreak="0">
+    <w:nsid w:val="4C4D63CA"/>
+    <w:multiLevelType w:val="multilevel"/>
+    <w:tmpl w:val="FE5EF920"/>
+    <w:lvl w:ilvl="0">
+      <w:start w:val="1"/>
+      <w:numFmt w:val="bullet"/>
+      <w:lvlText w:val=""/>
+      <w:lvlJc w:val="left"/>
+      <w:pPr>
+        <w:tabs>
+          <w:tab w:val="num" w:pos="720"/>
+        </w:tabs>
+        <w:ind w:left="720" w:hanging="360"/>
+      </w:pPr>
+      <w:rPr>
+        <w:rFonts w:ascii="Symbol" w:hAnsi="Symbol" w:hint="default"/>
+        <w:sz w:val="20"/>
+      </w:rPr>
+    </w:lvl>
+    <w:lvl w:ilvl="1" w:tentative="1">
+      <w:start w:val="1"/>
+      <w:numFmt w:val="bullet"/>
+      <w:lvlText w:val="o"/>
+      <w:lvlJc w:val="left"/>
+      <w:pPr>
+        <w:tabs>
+          <w:tab w:val="num" w:pos="1440"/>
+        </w:tabs>
+        <w:ind w:left="1440" w:hanging="360"/>
+      </w:pPr>
+      <w:rPr>
+        <w:rFonts w:ascii="Courier New" w:hAnsi="Courier New" w:hint="default"/>
+        <w:sz w:val="20"/>
+      </w:rPr>
+    </w:lvl>
+    <w:lvl w:ilvl="2" w:tentative="1">
+      <w:start w:val="1"/>
+      <w:numFmt w:val="bullet"/>
+      <w:lvlText w:val=""/>
+      <w:lvlJc w:val="left"/>
+      <w:pPr>
+        <w:tabs>
+          <w:tab w:val="num" w:pos="2160"/>
+        </w:tabs>
+        <w:ind w:left="2160" w:hanging="360"/>
+      </w:pPr>
+      <w:rPr>
+        <w:rFonts w:ascii="Wingdings" w:hAnsi="Wingdings" w:hint="default"/>
+        <w:sz w:val="20"/>
+      </w:rPr>
+    </w:lvl>
+    <w:lvl w:ilvl="3" w:tentative="1">
+      <w:start w:val="1"/>
+      <w:numFmt w:val="bullet"/>
+      <w:lvlText w:val=""/>
+      <w:lvlJc w:val="left"/>
+      <w:pPr>
+        <w:tabs>
+          <w:tab w:val="num" w:pos="2880"/>
+        </w:tabs>
+        <w:ind w:left="2880" w:hanging="360"/>
+      </w:pPr>
+      <w:rPr>
+        <w:rFonts w:ascii="Wingdings" w:hAnsi="Wingdings" w:hint="default"/>
+        <w:sz w:val="20"/>
+      </w:rPr>
+    </w:lvl>
+    <w:lvl w:ilvl="4" w:tentative="1">
+      <w:start w:val="1"/>
+      <w:numFmt w:val="bullet"/>
+      <w:lvlText w:val=""/>
+      <w:lvlJc w:val="left"/>
+      <w:pPr>
+        <w:tabs>
+          <w:tab w:val="num" w:pos="3600"/>
+        </w:tabs>
+        <w:ind w:left="3600" w:hanging="360"/>
+      </w:pPr>
+      <w:rPr>
+        <w:rFonts w:ascii="Wingdings" w:hAnsi="Wingdings" w:hint="default"/>
+        <w:sz w:val="20"/>
+      </w:rPr>
+    </w:lvl>
+    <w:lvl w:ilvl="5" w:tentative="1">
+      <w:start w:val="1"/>
+      <w:numFmt w:val="bullet"/>
+      <w:lvlText w:val=""/>
+      <w:lvlJc w:val="left"/>
+      <w:pPr>
+        <w:tabs>
+          <w:tab w:val="num" w:pos="4320"/>
+        </w:tabs>
+        <w:ind w:left="4320" w:hanging="360"/>
+      </w:pPr>
+      <w:rPr>
+        <w:rFonts w:ascii="Wingdings" w:hAnsi="Wingdings" w:hint="default"/>
+        <w:sz w:val="20"/>
+      </w:rPr>
+    </w:lvl>
+    <w:lvl w:ilvl="6" w:tentative="1">
+      <w:start w:val="1"/>
+      <w:numFmt w:val="bullet"/>
+      <w:lvlText w:val=""/>
+      <w:lvlJc w:val="left"/>
+      <w:pPr>
+        <w:tabs>
+          <w:tab w:val="num" w:pos="5040"/>
+        </w:tabs>
+        <w:ind w:left="5040" w:hanging="360"/>
+      </w:pPr>
+      <w:rPr>
+        <w:rFonts w:ascii="Wingdings" w:hAnsi="Wingdings" w:hint="default"/>
+        <w:sz w:val="20"/>
+      </w:rPr>
+    </w:lvl>
+    <w:lvl w:ilvl="7" w:tentative="1">
+      <w:start w:val="1"/>
+      <w:numFmt w:val="bullet"/>
+      <w:lvlText w:val=""/>
+      <w:lvlJc w:val="left"/>
+      <w:pPr>
+        <w:tabs>
+          <w:tab w:val="num" w:pos="5760"/>
+        </w:tabs>
+        <w:ind w:left="5760" w:hanging="360"/>
+      </w:pPr>
+      <w:rPr>
+        <w:rFonts w:ascii="Wingdings" w:hAnsi="Wingdings" w:hint="default"/>
+        <w:sz w:val="20"/>
+      </w:rPr>
+    </w:lvl>
+    <w:lvl w:ilvl="8" w:tentative="1">
+      <w:start w:val="1"/>
+      <w:numFmt w:val="bullet"/>
+      <w:lvlText w:val=""/>
+      <w:lvlJc w:val="left"/>
+      <w:pPr>
+        <w:tabs>
+          <w:tab w:val="num" w:pos="6480"/>
+        </w:tabs>
+        <w:ind w:left="6480" w:hanging="360"/>
+      </w:pPr>
+      <w:rPr>
+        <w:rFonts w:ascii="Wingdings" w:hAnsi="Wingdings" w:hint="default"/>
+        <w:sz w:val="20"/>
+      </w:rPr>
+    </w:lvl>
+  </w:abstractNum>
+  <w:abstractNum w:abstractNumId="9" w15:restartNumberingAfterBreak="0">
+    <w:nsid w:val="4DD82048"/>
+    <w:multiLevelType w:val="multilevel"/>
+    <w:tmpl w:val="64463234"/>
+    <w:lvl w:ilvl="0">
+      <w:start w:val="1"/>
+      <w:numFmt w:val="bullet"/>
+      <w:lvlText w:val=""/>
+      <w:lvlJc w:val="left"/>
+      <w:pPr>
+        <w:tabs>
+          <w:tab w:val="num" w:pos="720"/>
+        </w:tabs>
+        <w:ind w:left="720" w:hanging="360"/>
+      </w:pPr>
+      <w:rPr>
+        <w:rFonts w:ascii="Symbol" w:hAnsi="Symbol" w:hint="default"/>
+        <w:sz w:val="20"/>
+      </w:rPr>
+    </w:lvl>
+    <w:lvl w:ilvl="1" w:tentative="1">
+      <w:start w:val="1"/>
+      <w:numFmt w:val="bullet"/>
+      <w:lvlText w:val="o"/>
+      <w:lvlJc w:val="left"/>
+      <w:pPr>
+        <w:tabs>
+          <w:tab w:val="num" w:pos="1440"/>
+        </w:tabs>
+        <w:ind w:left="1440" w:hanging="360"/>
+      </w:pPr>
+      <w:rPr>
+        <w:rFonts w:ascii="Courier New" w:hAnsi="Courier New" w:hint="default"/>
+        <w:sz w:val="20"/>
+      </w:rPr>
+    </w:lvl>
+    <w:lvl w:ilvl="2" w:tentative="1">
+      <w:start w:val="1"/>
+      <w:numFmt w:val="bullet"/>
+      <w:lvlText w:val=""/>
+      <w:lvlJc w:val="left"/>
+      <w:pPr>
+        <w:tabs>
+          <w:tab w:val="num" w:pos="2160"/>
+        </w:tabs>
+        <w:ind w:left="2160" w:hanging="360"/>
+      </w:pPr>
+      <w:rPr>
+        <w:rFonts w:ascii="Wingdings" w:hAnsi="Wingdings" w:hint="default"/>
+        <w:sz w:val="20"/>
+      </w:rPr>
+    </w:lvl>
+    <w:lvl w:ilvl="3" w:tentative="1">
+      <w:start w:val="1"/>
+      <w:numFmt w:val="bullet"/>
+      <w:lvlText w:val=""/>
+      <w:lvlJc w:val="left"/>
+      <w:pPr>
+        <w:tabs>
+          <w:tab w:val="num" w:pos="2880"/>
+        </w:tabs>
+        <w:ind w:left="2880" w:hanging="360"/>
+      </w:pPr>
+      <w:rPr>
+        <w:rFonts w:ascii="Wingdings" w:hAnsi="Wingdings" w:hint="default"/>
+        <w:sz w:val="20"/>
+      </w:rPr>
+    </w:lvl>
+    <w:lvl w:ilvl="4" w:tentative="1">
+      <w:start w:val="1"/>
+      <w:numFmt w:val="bullet"/>
+      <w:lvlText w:val=""/>
+      <w:lvlJc w:val="left"/>
+      <w:pPr>
+        <w:tabs>
+          <w:tab w:val="num" w:pos="3600"/>
+        </w:tabs>
+        <w:ind w:left="3600" w:hanging="360"/>
+      </w:pPr>
+      <w:rPr>
+        <w:rFonts w:ascii="Wingdings" w:hAnsi="Wingdings" w:hint="default"/>
+        <w:sz w:val="20"/>
+      </w:rPr>
+    </w:lvl>
+    <w:lvl w:ilvl="5" w:tentative="1">
+      <w:start w:val="1"/>
+      <w:numFmt w:val="bullet"/>
+      <w:lvlText w:val=""/>
+      <w:lvlJc w:val="left"/>
+      <w:pPr>
+        <w:tabs>
+          <w:tab w:val="num" w:pos="4320"/>
+        </w:tabs>
+        <w:ind w:left="4320" w:hanging="360"/>
+      </w:pPr>
+      <w:rPr>
+        <w:rFonts w:ascii="Wingdings" w:hAnsi="Wingdings" w:hint="default"/>
+        <w:sz w:val="20"/>
+      </w:rPr>
+    </w:lvl>
+    <w:lvl w:ilvl="6" w:tentative="1">
+      <w:start w:val="1"/>
+      <w:numFmt w:val="bullet"/>
+      <w:lvlText w:val=""/>
+      <w:lvlJc w:val="left"/>
+      <w:pPr>
+        <w:tabs>
+          <w:tab w:val="num" w:pos="5040"/>
+        </w:tabs>
+        <w:ind w:left="5040" w:hanging="360"/>
+      </w:pPr>
+      <w:rPr>
+        <w:rFonts w:ascii="Wingdings" w:hAnsi="Wingdings" w:hint="default"/>
+        <w:sz w:val="20"/>
+      </w:rPr>
+    </w:lvl>
+    <w:lvl w:ilvl="7" w:tentative="1">
+      <w:start w:val="1"/>
+      <w:numFmt w:val="bullet"/>
+      <w:lvlText w:val=""/>
+      <w:lvlJc w:val="left"/>
+      <w:pPr>
+        <w:tabs>
+          <w:tab w:val="num" w:pos="5760"/>
+        </w:tabs>
+        <w:ind w:left="5760" w:hanging="360"/>
+      </w:pPr>
+      <w:rPr>
+        <w:rFonts w:ascii="Wingdings" w:hAnsi="Wingdings" w:hint="default"/>
+        <w:sz w:val="20"/>
+      </w:rPr>
+    </w:lvl>
+    <w:lvl w:ilvl="8" w:tentative="1">
+      <w:start w:val="1"/>
+      <w:numFmt w:val="bullet"/>
+      <w:lvlText w:val=""/>
+      <w:lvlJc w:val="left"/>
+      <w:pPr>
+        <w:tabs>
+          <w:tab w:val="num" w:pos="6480"/>
+        </w:tabs>
+        <w:ind w:left="6480" w:hanging="360"/>
+      </w:pPr>
+      <w:rPr>
+        <w:rFonts w:ascii="Wingdings" w:hAnsi="Wingdings" w:hint="default"/>
+        <w:sz w:val="20"/>
+      </w:rPr>
+    </w:lvl>
+  </w:abstractNum>
+  <w:abstractNum w:abstractNumId="10" w15:restartNumberingAfterBreak="0">
     <w:nsid w:val="4FE5476C"/>
     <w:multiLevelType w:val="multilevel"/>
     <w:tmpl w:val="5D82B42E"/>
@@ -5102,7 +8051,156 @@
       </w:rPr>
     </w:lvl>
   </w:abstractNum>
-  <w:abstractNum w:abstractNumId="7" w15:restartNumberingAfterBreak="0">
+  <w:abstractNum w:abstractNumId="11" w15:restartNumberingAfterBreak="0">
+    <w:nsid w:val="55415924"/>
+    <w:multiLevelType w:val="multilevel"/>
+    <w:tmpl w:val="FAFA1692"/>
+    <w:lvl w:ilvl="0">
+      <w:start w:val="1"/>
+      <w:numFmt w:val="bullet"/>
+      <w:lvlText w:val=""/>
+      <w:lvlJc w:val="left"/>
+      <w:pPr>
+        <w:tabs>
+          <w:tab w:val="num" w:pos="720"/>
+        </w:tabs>
+        <w:ind w:left="720" w:hanging="360"/>
+      </w:pPr>
+      <w:rPr>
+        <w:rFonts w:ascii="Symbol" w:hAnsi="Symbol" w:hint="default"/>
+        <w:sz w:val="20"/>
+      </w:rPr>
+    </w:lvl>
+    <w:lvl w:ilvl="1" w:tentative="1">
+      <w:start w:val="1"/>
+      <w:numFmt w:val="bullet"/>
+      <w:lvlText w:val="o"/>
+      <w:lvlJc w:val="left"/>
+      <w:pPr>
+        <w:tabs>
+          <w:tab w:val="num" w:pos="1440"/>
+        </w:tabs>
+        <w:ind w:left="1440" w:hanging="360"/>
+      </w:pPr>
+      <w:rPr>
+        <w:rFonts w:ascii="Courier New" w:hAnsi="Courier New" w:hint="default"/>
+        <w:sz w:val="20"/>
+      </w:rPr>
+    </w:lvl>
+    <w:lvl w:ilvl="2" w:tentative="1">
+      <w:start w:val="1"/>
+      <w:numFmt w:val="bullet"/>
+      <w:lvlText w:val=""/>
+      <w:lvlJc w:val="left"/>
+      <w:pPr>
+        <w:tabs>
+          <w:tab w:val="num" w:pos="2160"/>
+        </w:tabs>
+        <w:ind w:left="2160" w:hanging="360"/>
+      </w:pPr>
+      <w:rPr>
+        <w:rFonts w:ascii="Wingdings" w:hAnsi="Wingdings" w:hint="default"/>
+        <w:sz w:val="20"/>
+      </w:rPr>
+    </w:lvl>
+    <w:lvl w:ilvl="3" w:tentative="1">
+      <w:start w:val="1"/>
+      <w:numFmt w:val="bullet"/>
+      <w:lvlText w:val=""/>
+      <w:lvlJc w:val="left"/>
+      <w:pPr>
+        <w:tabs>
+          <w:tab w:val="num" w:pos="2880"/>
+        </w:tabs>
+        <w:ind w:left="2880" w:hanging="360"/>
+      </w:pPr>
+      <w:rPr>
+        <w:rFonts w:ascii="Wingdings" w:hAnsi="Wingdings" w:hint="default"/>
+        <w:sz w:val="20"/>
+      </w:rPr>
+    </w:lvl>
+    <w:lvl w:ilvl="4" w:tentative="1">
+      <w:start w:val="1"/>
+      <w:numFmt w:val="bullet"/>
+      <w:lvlText w:val=""/>
+      <w:lvlJc w:val="left"/>
+      <w:pPr>
+        <w:tabs>
+          <w:tab w:val="num" w:pos="3600"/>
+        </w:tabs>
+        <w:ind w:left="3600" w:hanging="360"/>
+      </w:pPr>
+      <w:rPr>
+        <w:rFonts w:ascii="Wingdings" w:hAnsi="Wingdings" w:hint="default"/>
+        <w:sz w:val="20"/>
+      </w:rPr>
+    </w:lvl>
+    <w:lvl w:ilvl="5" w:tentative="1">
+      <w:start w:val="1"/>
+      <w:numFmt w:val="bullet"/>
+      <w:lvlText w:val=""/>
+      <w:lvlJc w:val="left"/>
+      <w:pPr>
+        <w:tabs>
+          <w:tab w:val="num" w:pos="4320"/>
+        </w:tabs>
+        <w:ind w:left="4320" w:hanging="360"/>
+      </w:pPr>
+      <w:rPr>
+        <w:rFonts w:ascii="Wingdings" w:hAnsi="Wingdings" w:hint="default"/>
+        <w:sz w:val="20"/>
+      </w:rPr>
+    </w:lvl>
+    <w:lvl w:ilvl="6" w:tentative="1">
+      <w:start w:val="1"/>
+      <w:numFmt w:val="bullet"/>
+      <w:lvlText w:val=""/>
+      <w:lvlJc w:val="left"/>
+      <w:pPr>
+        <w:tabs>
+          <w:tab w:val="num" w:pos="5040"/>
+        </w:tabs>
+        <w:ind w:left="5040" w:hanging="360"/>
+      </w:pPr>
+      <w:rPr>
+        <w:rFonts w:ascii="Wingdings" w:hAnsi="Wingdings" w:hint="default"/>
+        <w:sz w:val="20"/>
+      </w:rPr>
+    </w:lvl>
+    <w:lvl w:ilvl="7" w:tentative="1">
+      <w:start w:val="1"/>
+      <w:numFmt w:val="bullet"/>
+      <w:lvlText w:val=""/>
+      <w:lvlJc w:val="left"/>
+      <w:pPr>
+        <w:tabs>
+          <w:tab w:val="num" w:pos="5760"/>
+        </w:tabs>
+        <w:ind w:left="5760" w:hanging="360"/>
+      </w:pPr>
+      <w:rPr>
+        <w:rFonts w:ascii="Wingdings" w:hAnsi="Wingdings" w:hint="default"/>
+        <w:sz w:val="20"/>
+      </w:rPr>
+    </w:lvl>
+    <w:lvl w:ilvl="8" w:tentative="1">
+      <w:start w:val="1"/>
+      <w:numFmt w:val="bullet"/>
+      <w:lvlText w:val=""/>
+      <w:lvlJc w:val="left"/>
+      <w:pPr>
+        <w:tabs>
+          <w:tab w:val="num" w:pos="6480"/>
+        </w:tabs>
+        <w:ind w:left="6480" w:hanging="360"/>
+      </w:pPr>
+      <w:rPr>
+        <w:rFonts w:ascii="Wingdings" w:hAnsi="Wingdings" w:hint="default"/>
+        <w:sz w:val="20"/>
+      </w:rPr>
+    </w:lvl>
+  </w:abstractNum>
+  <w:abstractNum w:abstractNumId="12" w15:restartNumberingAfterBreak="0">
     <w:nsid w:val="5B5D3DF1"/>
     <w:multiLevelType w:val="multilevel"/>
     <w:tmpl w:val="FD58E324"/>
@@ -5261,19 +8359,34 @@
     <w:abstractNumId w:val="5"/>
   </w:num>
   <w:num w:numId="4" w16cid:durableId="1592734076">
-    <w:abstractNumId w:val="6"/>
+    <w:abstractNumId w:val="10"/>
   </w:num>
   <w:num w:numId="5" w16cid:durableId="1561165587">
     <w:abstractNumId w:val="2"/>
   </w:num>
   <w:num w:numId="6" w16cid:durableId="828057689">
-    <w:abstractNumId w:val="7"/>
+    <w:abstractNumId w:val="12"/>
   </w:num>
   <w:num w:numId="7" w16cid:durableId="2083020913">
     <w:abstractNumId w:val="3"/>
   </w:num>
   <w:num w:numId="8" w16cid:durableId="531922331">
     <w:abstractNumId w:val="4"/>
+  </w:num>
+  <w:num w:numId="9" w16cid:durableId="926839333">
+    <w:abstractNumId w:val="9"/>
+  </w:num>
+  <w:num w:numId="10" w16cid:durableId="221841139">
+    <w:abstractNumId w:val="7"/>
+  </w:num>
+  <w:num w:numId="11" w16cid:durableId="237129588">
+    <w:abstractNumId w:val="11"/>
+  </w:num>
+  <w:num w:numId="12" w16cid:durableId="2006398243">
+    <w:abstractNumId w:val="8"/>
+  </w:num>
+  <w:num w:numId="13" w16cid:durableId="348409216">
+    <w:abstractNumId w:val="6"/>
   </w:num>
 </w:numbering>
 </file>

</xml_diff>